<commit_message>
fixing word save 20%
</commit_message>
<xml_diff>
--- a/tem/template.docx
+++ b/tem/template.docx
@@ -56,115 +56,100 @@
         <w:ind w:left="26"/>
         <w:jc w:val="center"/>
         <w:rPr>
-          <w:b/>
-          <w:bCs/>
+          <w:b w:val="1"/>
+          <w:bCs w:val="1"/>
           <w:sz w:val="20"/>
           <w:szCs w:val="20"/>
           <w:u w:val="single"/>
-          <w:rtl/>
+          <w:rtl w:val="1"/>
           <w:lang w:bidi="ar-JO"/>
         </w:rPr>
       </w:pPr>
       <w:r>
         <w:rPr>
-          <w:b/>
-          <w:bCs/>
+          <w:b w:val="1"/>
+          <w:bCs w:val="1"/>
           <w:sz w:val="28"/>
           <w:szCs w:val="28"/>
           <w:u w:val="single"/>
-          <w:rtl/>
-          <w:lang w:bidi="ar-JO"/>
-        </w:rPr>
-        <w:t>معلومات الحادث :</w:t>
+          <w:rtl w:val="1"/>
+          <w:lang w:bidi="ar-JO"/>
+        </w:rPr>
+        <w:t xml:space="preserve">معلومات </w:t>
       </w:r>
       <w:r>
         <w:rPr>
+          <w:b w:val="1"/>
+          <w:bCs w:val="1"/>
+          <w:sz w:val="28"/>
+          <w:szCs w:val="28"/>
+          <w:u w:val="single"/>
+          <w:rtl w:val="1"/>
+          <w:lang w:bidi="ar-JO"/>
+        </w:rPr>
+        <w:t>الحادث :</w:t>
+      </w:r>
+      <w:r>
+        <w:rPr>
           <w:sz w:val="24"/>
           <w:szCs w:val="24"/>
-          <w:rtl/>
+          <w:rtl w:val="1"/>
           <w:lang w:bidi="ar-JO"/>
         </w:rPr>
         <w:t xml:space="preserve">                                </w:t>
       </w:r>
       <w:r>
         <w:rPr>
-          <w:rtl/>
+          <w:rtl w:val="1"/>
           <w:lang w:bidi="ar-JO"/>
         </w:rPr>
         <w:t xml:space="preserve">               </w:t>
       </w:r>
       <w:r>
         <w:rPr>
-          <w:b/>
-          <w:bCs/>
+          <w:b w:val="1"/>
+          <w:bCs w:val="1"/>
           <w:sz w:val="18"/>
           <w:szCs w:val="18"/>
-          <w:rtl/>
+          <w:rtl w:val="1"/>
           <w:lang w:bidi="ar-JO"/>
         </w:rPr>
         <w:t xml:space="preserve">                                                                    </w:t>
       </w:r>
       <w:r>
         <w:rPr>
-          <w:b/>
-          <w:bCs/>
+          <w:b w:val="1"/>
+          <w:bCs w:val="1"/>
           <w:sz w:val="20"/>
           <w:szCs w:val="20"/>
           <w:u w:val="single"/>
-          <w:rtl/>
+          <w:rtl w:val="1"/>
           <w:lang w:bidi="ar-JO"/>
         </w:rPr>
         <w:t xml:space="preserve">  التاريخ :</w:t>
       </w:r>
       <w:r>
         <w:rPr>
-          <w:rFonts w:hint="cs"/>
-          <w:b/>
-          <w:bCs/>
+          <w:b w:val="1"/>
+          <w:bCs w:val="1"/>
           <w:sz w:val="20"/>
           <w:szCs w:val="20"/>
           <w:u w:val="single"/>
-          <w:rtl/>
-          <w:lang w:bidi="ar-JO"/>
-        </w:rPr>
-        <w:t>27</w:t>
+          <w:rtl w:val="1"/>
+          <w:lang w:bidi="ar-JO"/>
+        </w:rPr>
+        <w:t>{</w:t>
       </w:r>
       <w:r>
         <w:rPr>
-          <w:b/>
-          <w:bCs/>
+          <w:b w:val="1"/>
+          <w:bCs w:val="1"/>
           <w:sz w:val="20"/>
           <w:szCs w:val="20"/>
           <w:u w:val="single"/>
-          <w:rtl/>
-          <w:lang w:bidi="ar-JO"/>
-        </w:rPr>
-        <w:t>/</w:t>
-      </w:r>
-      <w:r>
-        <w:rPr>
-          <w:rFonts w:hint="cs"/>
-          <w:b/>
-          <w:bCs/>
-          <w:sz w:val="20"/>
-          <w:szCs w:val="20"/>
-          <w:u w:val="single"/>
-          <w:rtl/>
-          <w:lang w:bidi="ar-JO"/>
-        </w:rPr>
-        <w:t>4</w:t>
-      </w:r>
-      <w:r>
-        <w:rPr>
-          <w:b/>
-          <w:bCs/>
-          <w:sz w:val="20"/>
-          <w:szCs w:val="20"/>
-          <w:u w:val="single"/>
-          <w:rtl/>
-          <w:lang w:bidi="ar-JO"/>
-        </w:rPr>
-        <w:t>/2026</w:t>
+          <w:lang w:bidi="ar-JO"/>
+        </w:rPr>
+        <w:t>report_date}</w:t>
       </w:r>
     </w:p>
     <w:tbl>
@@ -181,23 +166,23 @@
         <w:gridCol w:w="1531"/>
         <w:gridCol w:w="1531"/>
         <w:gridCol w:w="2867"/>
-        <w:gridCol w:w="1801"/>
-        <w:gridCol w:w="1711"/>
+        <w:gridCol w:w="1725"/>
+        <w:gridCol w:w="1787"/>
       </w:tblGrid>
       <w:tr>
         <w:trPr>
           <w:trHeight w:val="411"/>
-          <w:jc w:val="center"/>
         </w:trPr>
         <w:tc>
           <w:tcPr>
-            <w:tcW w:w="1493" w:type="dxa"/>
+            <w:tcW w:w="1494" w:type="dxa"/>
             <w:tcBorders>
-              <w:top w:val="single" w:sz="4" w:space="0" w:color="auto"/>
-              <w:left w:val="single" w:sz="4" w:space="0" w:color="auto"/>
-              <w:bottom w:val="single" w:sz="4" w:space="0" w:color="auto"/>
-              <w:right w:val="single" w:sz="4" w:space="0" w:color="auto"/>
+              <w:top w:val="single" w:color="auto" w:sz="4" w:space="0"/>
+              <w:left w:val="single" w:color="auto" w:sz="4" w:space="0"/>
+              <w:bottom w:val="single" w:color="auto" w:sz="4" w:space="0"/>
+              <w:right w:val="single" w:color="auto" w:sz="4" w:space="0"/>
             </w:tcBorders>
+            <w:tcMar/>
             <w:hideMark/>
           </w:tcPr>
           <w:p>
@@ -232,13 +217,14 @@
         </w:tc>
         <w:tc>
           <w:tcPr>
-            <w:tcW w:w="1530" w:type="dxa"/>
+            <w:tcW w:w="1531" w:type="dxa"/>
             <w:tcBorders>
-              <w:top w:val="single" w:sz="4" w:space="0" w:color="auto"/>
-              <w:left w:val="single" w:sz="4" w:space="0" w:color="auto"/>
-              <w:bottom w:val="single" w:sz="4" w:space="0" w:color="auto"/>
-              <w:right w:val="single" w:sz="4" w:space="0" w:color="auto"/>
+              <w:top w:val="single" w:color="auto" w:sz="4" w:space="0"/>
+              <w:left w:val="single" w:color="auto" w:sz="4" w:space="0"/>
+              <w:bottom w:val="single" w:color="auto" w:sz="4" w:space="0"/>
+              <w:right w:val="single" w:color="auto" w:sz="4" w:space="0"/>
             </w:tcBorders>
+            <w:tcMar/>
             <w:hideMark/>
           </w:tcPr>
           <w:p>
@@ -272,13 +258,14 @@
         </w:tc>
         <w:tc>
           <w:tcPr>
-            <w:tcW w:w="1530" w:type="dxa"/>
+            <w:tcW w:w="1531" w:type="dxa"/>
             <w:tcBorders>
-              <w:top w:val="single" w:sz="4" w:space="0" w:color="auto"/>
-              <w:left w:val="single" w:sz="4" w:space="0" w:color="auto"/>
-              <w:bottom w:val="single" w:sz="4" w:space="0" w:color="auto"/>
-              <w:right w:val="single" w:sz="4" w:space="0" w:color="auto"/>
+              <w:top w:val="single" w:color="auto" w:sz="4" w:space="0"/>
+              <w:left w:val="single" w:color="auto" w:sz="4" w:space="0"/>
+              <w:bottom w:val="single" w:color="auto" w:sz="4" w:space="0"/>
+              <w:right w:val="single" w:color="auto" w:sz="4" w:space="0"/>
             </w:tcBorders>
+            <w:tcMar/>
             <w:hideMark/>
           </w:tcPr>
           <w:p>
@@ -313,13 +300,14 @@
         </w:tc>
         <w:tc>
           <w:tcPr>
-            <w:tcW w:w="2865" w:type="dxa"/>
+            <w:tcW w:w="2867" w:type="dxa"/>
             <w:tcBorders>
-              <w:top w:val="single" w:sz="4" w:space="0" w:color="auto"/>
-              <w:left w:val="single" w:sz="4" w:space="0" w:color="auto"/>
-              <w:bottom w:val="single" w:sz="4" w:space="0" w:color="auto"/>
-              <w:right w:val="single" w:sz="4" w:space="0" w:color="auto"/>
+              <w:top w:val="single" w:color="auto" w:sz="4" w:space="0"/>
+              <w:left w:val="single" w:color="auto" w:sz="4" w:space="0"/>
+              <w:bottom w:val="single" w:color="auto" w:sz="4" w:space="0"/>
+              <w:right w:val="single" w:color="auto" w:sz="4" w:space="0"/>
             </w:tcBorders>
+            <w:tcMar/>
             <w:hideMark/>
           </w:tcPr>
           <w:p>
@@ -353,13 +341,14 @@
         </w:tc>
         <w:tc>
           <w:tcPr>
-            <w:tcW w:w="1800" w:type="dxa"/>
+            <w:tcW w:w="1725" w:type="dxa"/>
             <w:tcBorders>
-              <w:top w:val="single" w:sz="4" w:space="0" w:color="auto"/>
-              <w:left w:val="single" w:sz="4" w:space="0" w:color="auto"/>
-              <w:bottom w:val="single" w:sz="4" w:space="0" w:color="auto"/>
-              <w:right w:val="single" w:sz="4" w:space="0" w:color="auto"/>
+              <w:top w:val="single" w:color="auto" w:sz="4" w:space="0"/>
+              <w:left w:val="single" w:color="auto" w:sz="4" w:space="0"/>
+              <w:bottom w:val="single" w:color="auto" w:sz="4" w:space="0"/>
+              <w:right w:val="single" w:color="auto" w:sz="4" w:space="0"/>
             </w:tcBorders>
+            <w:tcMar/>
             <w:hideMark/>
           </w:tcPr>
           <w:p>
@@ -392,13 +381,14 @@
         </w:tc>
         <w:tc>
           <w:tcPr>
-            <w:tcW w:w="1710" w:type="dxa"/>
+            <w:tcW w:w="1787" w:type="dxa"/>
             <w:tcBorders>
-              <w:top w:val="single" w:sz="4" w:space="0" w:color="auto"/>
-              <w:left w:val="single" w:sz="4" w:space="0" w:color="auto"/>
-              <w:bottom w:val="single" w:sz="4" w:space="0" w:color="auto"/>
-              <w:right w:val="single" w:sz="4" w:space="0" w:color="auto"/>
+              <w:top w:val="single" w:color="auto" w:sz="4" w:space="0"/>
+              <w:left w:val="single" w:color="auto" w:sz="4" w:space="0"/>
+              <w:bottom w:val="single" w:color="auto" w:sz="4" w:space="0"/>
+              <w:right w:val="single" w:color="auto" w:sz="4" w:space="0"/>
             </w:tcBorders>
+            <w:tcMar/>
             <w:hideMark/>
           </w:tcPr>
           <w:p>
@@ -434,151 +424,256 @@
       <w:tr>
         <w:trPr>
           <w:trHeight w:val="272"/>
-          <w:jc w:val="center"/>
         </w:trPr>
         <w:tc>
           <w:tcPr>
-            <w:tcW w:w="1493" w:type="dxa"/>
+            <w:tcW w:w="1494" w:type="dxa"/>
             <w:tcBorders>
-              <w:top w:val="single" w:sz="4" w:space="0" w:color="auto"/>
-              <w:left w:val="single" w:sz="4" w:space="0" w:color="auto"/>
-              <w:bottom w:val="single" w:sz="4" w:space="0" w:color="auto"/>
-              <w:right w:val="single" w:sz="4" w:space="0" w:color="auto"/>
+              <w:top w:val="single" w:color="auto" w:sz="4" w:space="0"/>
+              <w:left w:val="single" w:color="auto" w:sz="4" w:space="0"/>
+              <w:bottom w:val="single" w:color="auto" w:sz="4" w:space="0"/>
+              <w:right w:val="single" w:color="auto" w:sz="4" w:space="0"/>
             </w:tcBorders>
+            <w:tcMar/>
             <w:hideMark/>
           </w:tcPr>
           <w:p>
             <w:pPr>
-              <w:bidi/>
+              <w:bidi w:val="1"/>
               <w:spacing w:line="360" w:lineRule="auto"/>
               <w:jc w:val="center"/>
               <w:rPr>
-                <w:sz w:val="27"/>
-                <w:szCs w:val="27"/>
+                <w:sz w:val="24"/>
+                <w:szCs w:val="24"/>
                 <w:u w:val="single"/>
                 <w:lang w:bidi="ar-JO"/>
               </w:rPr>
             </w:pPr>
             <w:r>
               <w:rPr>
-                <w:sz w:val="27"/>
-                <w:szCs w:val="27"/>
+                <w:sz w:val="24"/>
+                <w:szCs w:val="24"/>
                 <w:u w:val="single"/>
                 <w:lang w:bidi="ar-JO"/>
               </w:rPr>
-              <w:t>17</w:t>
-            </w:r>
-            <w:bookmarkStart w:id="0" w:name="_GoBack"/>
-            <w:bookmarkEnd w:id="0"/>
-            <w:r>
-              <w:rPr>
-                <w:sz w:val="27"/>
-                <w:szCs w:val="27"/>
+              <w:t>{</w:t>
+            </w:r>
+            <w:r>
+              <w:rPr>
+                <w:sz w:val="24"/>
+                <w:szCs w:val="24"/>
                 <w:u w:val="single"/>
-                <w:rtl/>
-                <w:lang w:bidi="ar-JO"/>
-              </w:rPr>
-              <w:t>/</w:t>
-            </w:r>
-            <w:r>
-              <w:rPr>
-                <w:sz w:val="27"/>
-                <w:szCs w:val="27"/>
+                <w:lang w:bidi="ar-JO"/>
+              </w:rPr>
+              <w:t>incident_date</w:t>
+            </w:r>
+            <w:r>
+              <w:rPr>
+                <w:sz w:val="24"/>
+                <w:szCs w:val="24"/>
                 <w:u w:val="single"/>
                 <w:lang w:bidi="ar-JO"/>
               </w:rPr>
-              <w:t>4</w:t>
-            </w:r>
-            <w:r>
-              <w:rPr>
-                <w:sz w:val="27"/>
-                <w:szCs w:val="27"/>
-                <w:u w:val="single"/>
-                <w:rtl/>
-                <w:lang w:bidi="ar-JO"/>
-              </w:rPr>
-              <w:t>/2026</w:t>
+              <w:t>}</w:t>
             </w:r>
           </w:p>
         </w:tc>
         <w:tc>
           <w:tcPr>
-            <w:tcW w:w="1530" w:type="dxa"/>
+            <w:tcW w:w="1531" w:type="dxa"/>
             <w:tcBorders>
-              <w:top w:val="single" w:sz="4" w:space="0" w:color="auto"/>
-              <w:left w:val="single" w:sz="4" w:space="0" w:color="auto"/>
-              <w:bottom w:val="single" w:sz="4" w:space="0" w:color="auto"/>
-              <w:right w:val="single" w:sz="4" w:space="0" w:color="auto"/>
+              <w:top w:val="single" w:color="auto" w:sz="4" w:space="0"/>
+              <w:left w:val="single" w:color="auto" w:sz="4" w:space="0"/>
+              <w:bottom w:val="single" w:color="auto" w:sz="4" w:space="0"/>
+              <w:right w:val="single" w:color="auto" w:sz="4" w:space="0"/>
             </w:tcBorders>
+            <w:tcMar/>
           </w:tcPr>
           <w:p>
             <w:pPr>
-              <w:bidi/>
+              <w:pStyle w:val="Normal"/>
+              <w:bidi w:val="1"/>
               <w:spacing w:line="360" w:lineRule="auto"/>
               <w:jc w:val="center"/>
               <w:rPr>
-                <w:sz w:val="27"/>
-                <w:szCs w:val="27"/>
+                <w:sz w:val="24"/>
+                <w:szCs w:val="24"/>
                 <w:u w:val="single"/>
                 <w:lang w:bidi="ar-JO"/>
               </w:rPr>
             </w:pPr>
             <w:r>
               <w:rPr>
-                <w:sz w:val="27"/>
-                <w:szCs w:val="27"/>
+                <w:sz w:val="24"/>
+                <w:szCs w:val="24"/>
                 <w:u w:val="single"/>
                 <w:lang w:bidi="ar-JO"/>
               </w:rPr>
-              <w:t>2026</w:t>
+              <w:t>{</w:t>
+            </w:r>
+            <w:r>
+              <w:rPr>
+                <w:sz w:val="24"/>
+                <w:szCs w:val="24"/>
+                <w:u w:val="single"/>
+                <w:lang w:bidi="ar-JO"/>
+              </w:rPr>
+              <w:t>incident_year</w:t>
+            </w:r>
+            <w:r>
+              <w:rPr>
+                <w:sz w:val="24"/>
+                <w:szCs w:val="24"/>
+                <w:u w:val="single"/>
+                <w:rtl w:val="1"/>
+                <w:lang w:bidi="ar-JO"/>
+              </w:rPr>
+              <w:t>}</w:t>
+            </w:r>
+            <w:r>
+              <w:rPr>
+                <w:sz w:val="24"/>
+                <w:szCs w:val="24"/>
+                <w:u w:val="single"/>
+                <w:rtl w:val="1"/>
+                <w:lang w:bidi="ar-JO"/>
+              </w:rPr>
+              <w:t>/</w:t>
+            </w:r>
+            <w:r>
+              <w:rPr>
+                <w:sz w:val="24"/>
+                <w:szCs w:val="24"/>
+                <w:u w:val="single"/>
+                <w:rtl w:val="1"/>
+                <w:lang w:bidi="ar-JO"/>
+              </w:rPr>
+              <w:t xml:space="preserve"> {</w:t>
+            </w:r>
+            <w:r>
+              <w:rPr>
+                <w:sz w:val="24"/>
+                <w:szCs w:val="24"/>
+                <w:u w:val="single"/>
+                <w:lang w:bidi="ar-JO"/>
+              </w:rPr>
+              <w:t>incident_num</w:t>
+            </w:r>
+            <w:r>
+              <w:rPr>
+                <w:sz w:val="24"/>
+                <w:szCs w:val="24"/>
+                <w:u w:val="single"/>
+                <w:lang w:bidi="ar-JO"/>
+              </w:rPr>
+              <w:t>}</w:t>
             </w:r>
           </w:p>
         </w:tc>
         <w:tc>
           <w:tcPr>
-            <w:tcW w:w="1530" w:type="dxa"/>
+            <w:tcW w:w="1531" w:type="dxa"/>
             <w:tcBorders>
-              <w:top w:val="single" w:sz="4" w:space="0" w:color="auto"/>
-              <w:left w:val="single" w:sz="4" w:space="0" w:color="auto"/>
-              <w:bottom w:val="single" w:sz="4" w:space="0" w:color="auto"/>
-              <w:right w:val="single" w:sz="4" w:space="0" w:color="auto"/>
+              <w:top w:val="single" w:color="auto" w:sz="4" w:space="0"/>
+              <w:left w:val="single" w:color="auto" w:sz="4" w:space="0"/>
+              <w:bottom w:val="single" w:color="auto" w:sz="4" w:space="0"/>
+              <w:right w:val="single" w:color="auto" w:sz="4" w:space="0"/>
             </w:tcBorders>
+            <w:tcMar/>
             <w:hideMark/>
           </w:tcPr>
           <w:p>
             <w:pPr>
+              <w:pStyle w:val="Normal"/>
               <w:bidi/>
               <w:spacing w:line="360" w:lineRule="auto"/>
               <w:jc w:val="center"/>
               <w:rPr>
-                <w:sz w:val="27"/>
-                <w:szCs w:val="27"/>
+                <w:sz w:val="24"/>
+                <w:szCs w:val="24"/>
                 <w:u w:val="single"/>
-                <w:rtl/>
+                <w:rtl w:val="1"/>
                 <w:lang w:bidi="ar-JO"/>
               </w:rPr>
             </w:pPr>
             <w:r>
               <w:rPr>
-                <w:sz w:val="27"/>
-                <w:szCs w:val="27"/>
+                <w:sz w:val="24"/>
+                <w:szCs w:val="24"/>
                 <w:u w:val="single"/>
-                <w:rtl/>
-                <w:lang w:bidi="ar-JO"/>
-              </w:rPr>
-              <w:t>/2026</w:t>
+                <w:lang w:bidi="ar-JO"/>
+              </w:rPr>
+              <w:t>{</w:t>
+            </w:r>
+            <w:r>
+              <w:rPr>
+                <w:sz w:val="24"/>
+                <w:szCs w:val="24"/>
+                <w:u w:val="single"/>
+                <w:lang w:bidi="ar-JO"/>
+              </w:rPr>
+              <w:t>claim_year</w:t>
+            </w:r>
+            <w:r>
+              <w:rPr>
+                <w:sz w:val="24"/>
+                <w:szCs w:val="24"/>
+                <w:u w:val="single"/>
+                <w:rtl w:val="1"/>
+                <w:lang w:bidi="ar-JO"/>
+              </w:rPr>
+              <w:t>}</w:t>
+            </w:r>
+            <w:r>
+              <w:rPr>
+                <w:sz w:val="24"/>
+                <w:szCs w:val="24"/>
+                <w:u w:val="single"/>
+                <w:rtl w:val="1"/>
+                <w:lang w:bidi="ar-JO"/>
+              </w:rPr>
+              <w:t>/</w:t>
+            </w:r>
+            <w:r>
+              <w:rPr>
+                <w:sz w:val="24"/>
+                <w:szCs w:val="24"/>
+                <w:u w:val="single"/>
+                <w:rtl w:val="1"/>
+                <w:lang w:bidi="ar-JO"/>
+              </w:rPr>
+              <w:t>{</w:t>
+            </w:r>
+            <w:r>
+              <w:rPr>
+                <w:sz w:val="24"/>
+                <w:szCs w:val="24"/>
+                <w:u w:val="single"/>
+                <w:lang w:bidi="ar-JO"/>
+              </w:rPr>
+              <w:t>claim_num</w:t>
+            </w:r>
+            <w:r>
+              <w:rPr>
+                <w:sz w:val="24"/>
+                <w:szCs w:val="24"/>
+                <w:u w:val="single"/>
+                <w:lang w:bidi="ar-JO"/>
+              </w:rPr>
+              <w:t>}</w:t>
             </w:r>
           </w:p>
         </w:tc>
         <w:tc>
           <w:tcPr>
-            <w:tcW w:w="2865" w:type="dxa"/>
+            <w:tcW w:w="2867" w:type="dxa"/>
             <w:tcBorders>
-              <w:top w:val="single" w:sz="4" w:space="0" w:color="auto"/>
-              <w:left w:val="single" w:sz="4" w:space="0" w:color="auto"/>
-              <w:bottom w:val="single" w:sz="4" w:space="0" w:color="auto"/>
-              <w:right w:val="single" w:sz="4" w:space="0" w:color="auto"/>
+              <w:top w:val="single" w:color="auto" w:sz="4" w:space="0"/>
+              <w:left w:val="single" w:color="auto" w:sz="4" w:space="0"/>
+              <w:bottom w:val="single" w:color="auto" w:sz="4" w:space="0"/>
+              <w:right w:val="single" w:color="auto" w:sz="4" w:space="0"/>
             </w:tcBorders>
+            <w:tcMar/>
           </w:tcPr>
           <w:p>
             <w:pPr>
@@ -589,23 +684,51 @@
               <w:spacing w:line="360" w:lineRule="auto"/>
               <w:jc w:val="center"/>
               <w:rPr>
-                <w:sz w:val="28"/>
-                <w:szCs w:val="28"/>
+                <w:sz w:val="24"/>
+                <w:szCs w:val="24"/>
                 <w:u w:val="single"/>
                 <w:lang w:bidi="ar-JO"/>
               </w:rPr>
             </w:pPr>
+            <w:r>
+              <w:rPr>
+                <w:sz w:val="24"/>
+                <w:szCs w:val="24"/>
+                <w:u w:val="single"/>
+                <w:lang w:bidi="ar-JO"/>
+              </w:rPr>
+              <w:t>{</w:t>
+            </w:r>
+            <w:r>
+              <w:rPr>
+                <w:sz w:val="24"/>
+                <w:szCs w:val="24"/>
+                <w:u w:val="single"/>
+                <w:lang w:bidi="ar-JO"/>
+              </w:rPr>
+              <w:t>claim_name</w:t>
+            </w:r>
+            <w:r>
+              <w:rPr>
+                <w:sz w:val="24"/>
+                <w:szCs w:val="24"/>
+                <w:u w:val="single"/>
+                <w:lang w:bidi="ar-JO"/>
+              </w:rPr>
+              <w:t>}</w:t>
+            </w:r>
           </w:p>
         </w:tc>
         <w:tc>
           <w:tcPr>
-            <w:tcW w:w="1800" w:type="dxa"/>
+            <w:tcW w:w="1725" w:type="dxa"/>
             <w:tcBorders>
-              <w:top w:val="single" w:sz="4" w:space="0" w:color="auto"/>
-              <w:left w:val="single" w:sz="4" w:space="0" w:color="auto"/>
-              <w:bottom w:val="single" w:sz="4" w:space="0" w:color="auto"/>
-              <w:right w:val="single" w:sz="4" w:space="0" w:color="auto"/>
+              <w:top w:val="single" w:color="auto" w:sz="4" w:space="0"/>
+              <w:left w:val="single" w:color="auto" w:sz="4" w:space="0"/>
+              <w:bottom w:val="single" w:color="auto" w:sz="4" w:space="0"/>
+              <w:right w:val="single" w:color="auto" w:sz="4" w:space="0"/>
             </w:tcBorders>
+            <w:tcMar/>
           </w:tcPr>
           <w:p>
             <w:pPr>
@@ -613,24 +736,34 @@
               <w:spacing w:line="360" w:lineRule="auto"/>
               <w:jc w:val="center"/>
               <w:rPr>
-                <w:sz w:val="28"/>
-                <w:szCs w:val="28"/>
+                <w:sz w:val="24"/>
+                <w:szCs w:val="24"/>
                 <w:u w:val="single"/>
-                <w:rtl/>
+                <w:rtl w:val="1"/>
                 <w:lang w:bidi="ar-JO"/>
               </w:rPr>
             </w:pPr>
+            <w:r>
+              <w:rPr>
+                <w:sz w:val="24"/>
+                <w:szCs w:val="24"/>
+                <w:u w:val="single"/>
+                <w:lang w:bidi="ar-JO"/>
+              </w:rPr>
+              <w:t>{causing_vehicle_num}</w:t>
+            </w:r>
           </w:p>
         </w:tc>
         <w:tc>
           <w:tcPr>
-            <w:tcW w:w="1710" w:type="dxa"/>
+            <w:tcW w:w="1787" w:type="dxa"/>
             <w:tcBorders>
-              <w:top w:val="single" w:sz="4" w:space="0" w:color="auto"/>
-              <w:left w:val="single" w:sz="4" w:space="0" w:color="auto"/>
-              <w:bottom w:val="single" w:sz="4" w:space="0" w:color="auto"/>
-              <w:right w:val="single" w:sz="4" w:space="0" w:color="auto"/>
+              <w:top w:val="single" w:color="auto" w:sz="4" w:space="0"/>
+              <w:left w:val="single" w:color="auto" w:sz="4" w:space="0"/>
+              <w:bottom w:val="single" w:color="auto" w:sz="4" w:space="0"/>
+              <w:right w:val="single" w:color="auto" w:sz="4" w:space="0"/>
             </w:tcBorders>
+            <w:tcMar/>
           </w:tcPr>
           <w:p>
             <w:pPr>
@@ -638,17 +771,50 @@
               <w:spacing w:line="360" w:lineRule="auto"/>
               <w:jc w:val="center"/>
               <w:rPr>
-                <w:sz w:val="28"/>
-                <w:szCs w:val="28"/>
+                <w:sz w:val="24"/>
+                <w:szCs w:val="24"/>
                 <w:u w:val="single"/>
-                <w:rtl/>
+                <w:rtl w:val="1"/>
                 <w:lang w:bidi="ar-JO"/>
               </w:rPr>
             </w:pPr>
+            <w:r>
+              <w:rPr>
+                <w:sz w:val="24"/>
+                <w:szCs w:val="24"/>
+                <w:u w:val="single"/>
+                <w:lang w:bidi="ar-JO"/>
+              </w:rPr>
+              <w:t>{</w:t>
+            </w:r>
+            <w:r>
+              <w:rPr>
+                <w:sz w:val="24"/>
+                <w:szCs w:val="24"/>
+                <w:u w:val="single"/>
+                <w:lang w:bidi="ar-JO"/>
+              </w:rPr>
+              <w:t>policy_num</w:t>
+            </w:r>
+            <w:r>
+              <w:rPr>
+                <w:sz w:val="24"/>
+                <w:szCs w:val="24"/>
+                <w:u w:val="single"/>
+                <w:lang w:bidi="ar-JO"/>
+              </w:rPr>
+              <w:t>}</w:t>
+            </w:r>
           </w:p>
         </w:tc>
       </w:tr>
     </w:tbl>
+    <w:p>
+      <w:pPr>
+        <w:pStyle w:val="Normal"/>
+        <w:bidi w:val="1"/>
+      </w:pPr>
+    </w:p>
     <w:tbl>
       <w:tblPr>
         <w:tblStyle w:val="TableGrid"/>
@@ -656,12 +822,12 @@
         <w:bidiVisual/>
         <w:tblW w:w="10170" w:type="dxa"/>
         <w:tblBorders>
-          <w:top w:val="none" w:sz="0" w:space="0" w:color="auto"/>
-          <w:left w:val="none" w:sz="0" w:space="0" w:color="auto"/>
-          <w:bottom w:val="none" w:sz="0" w:space="0" w:color="auto"/>
-          <w:right w:val="none" w:sz="0" w:space="0" w:color="auto"/>
-          <w:insideH w:val="none" w:sz="0" w:space="0" w:color="auto"/>
-          <w:insideV w:val="none" w:sz="0" w:space="0" w:color="auto"/>
+          <w:top w:val="single" w:color="000000" w:themeColor="text1" w:sz="4" w:space="0"/>
+          <w:left w:val="single" w:color="000000" w:themeColor="text1" w:sz="4" w:space="0"/>
+          <w:bottom w:val="single" w:color="000000" w:themeColor="text1" w:sz="4" w:space="0"/>
+          <w:right w:val="single" w:color="000000" w:themeColor="text1" w:sz="4" w:space="0"/>
+          <w:insideH w:val="single" w:color="000000" w:themeColor="text1" w:sz="4" w:space="0"/>
+          <w:insideV w:val="single" w:color="000000" w:themeColor="text1" w:sz="4" w:space="0"/>
         </w:tblBorders>
         <w:tblLook w:val="04A0" w:firstRow="1" w:lastRow="0" w:firstColumn="1" w:lastColumn="0" w:noHBand="0" w:noVBand="1"/>
       </w:tblPr>
@@ -680,6 +846,7 @@
         <w:tc>
           <w:tcPr>
             <w:tcW w:w="2340" w:type="dxa"/>
+            <w:tcMar/>
             <w:hideMark/>
           </w:tcPr>
           <w:p>
@@ -714,6 +881,7 @@
         <w:tc>
           <w:tcPr>
             <w:tcW w:w="1667" w:type="dxa"/>
+            <w:tcMar/>
           </w:tcPr>
           <w:p>
             <w:pPr>
@@ -725,14 +893,25 @@
                 <w:szCs w:val="28"/>
                 <w:u w:val="single"/>
                 <w:shd w:val="clear" w:color="auto" w:fill="FFFFFF"/>
-                <w:rtl/>
+                <w:rtl w:val="1"/>
               </w:rPr>
             </w:pPr>
+            <w:r>
+              <w:rPr>
+                <w:rFonts w:ascii="Tajawal" w:hAnsi="Tajawal"/>
+                <w:color w:val="212529"/>
+                <w:sz w:val="28"/>
+                <w:szCs w:val="28"/>
+                <w:u w:val="single"/>
+              </w:rPr>
+              <w:t>{vehicle_num}</w:t>
+            </w:r>
           </w:p>
         </w:tc>
         <w:tc>
           <w:tcPr>
             <w:tcW w:w="1651" w:type="dxa"/>
+            <w:tcMar/>
             <w:hideMark/>
           </w:tcPr>
           <w:p>
@@ -766,6 +945,7 @@
         <w:tc>
           <w:tcPr>
             <w:tcW w:w="1452" w:type="dxa"/>
+            <w:tcMar/>
           </w:tcPr>
           <w:p>
             <w:pPr>
@@ -774,15 +954,25 @@
                 <w:sz w:val="28"/>
                 <w:szCs w:val="28"/>
                 <w:u w:val="single"/>
-                <w:rtl/>
+                <w:rtl w:val="1"/>
                 <w:lang w:bidi="ar-JO"/>
               </w:rPr>
             </w:pPr>
+            <w:r>
+              <w:rPr>
+                <w:sz w:val="28"/>
+                <w:szCs w:val="28"/>
+                <w:u w:val="single"/>
+                <w:lang w:bidi="ar-JO"/>
+              </w:rPr>
+              <w:t>{vehicle_make}</w:t>
+            </w:r>
           </w:p>
         </w:tc>
         <w:tc>
           <w:tcPr>
             <w:tcW w:w="1710" w:type="dxa"/>
+            <w:tcMar/>
             <w:hideMark/>
           </w:tcPr>
           <w:p>
@@ -816,6 +1006,7 @@
         <w:tc>
           <w:tcPr>
             <w:tcW w:w="1350" w:type="dxa"/>
+            <w:tcMar/>
           </w:tcPr>
           <w:p>
             <w:pPr>
@@ -824,10 +1015,19 @@
                 <w:sz w:val="28"/>
                 <w:szCs w:val="28"/>
                 <w:u w:val="single"/>
-                <w:rtl/>
+                <w:rtl w:val="1"/>
                 <w:lang w:bidi="ar-JO"/>
               </w:rPr>
             </w:pPr>
+            <w:r>
+              <w:rPr>
+                <w:sz w:val="28"/>
+                <w:szCs w:val="28"/>
+                <w:u w:val="single"/>
+                <w:lang w:bidi="ar-JO"/>
+              </w:rPr>
+              <w:t>{vehicle_class}</w:t>
+            </w:r>
           </w:p>
         </w:tc>
       </w:tr>
@@ -838,6 +1038,7 @@
         <w:tc>
           <w:tcPr>
             <w:tcW w:w="2340" w:type="dxa"/>
+            <w:tcMar/>
             <w:hideMark/>
           </w:tcPr>
           <w:p>
@@ -871,23 +1072,52 @@
         <w:tc>
           <w:tcPr>
             <w:tcW w:w="1667" w:type="dxa"/>
+            <w:tcMar/>
           </w:tcPr>
           <w:p>
             <w:pPr>
-              <w:bidi/>
+              <w:bidi w:val="1"/>
               <w:rPr>
                 <w:sz w:val="28"/>
                 <w:szCs w:val="28"/>
                 <w:u w:val="single"/>
-                <w:rtl/>
+                <w:rtl w:val="1"/>
                 <w:lang w:bidi="ar-JO"/>
               </w:rPr>
             </w:pPr>
+            <w:r>
+              <w:rPr>
+                <w:sz w:val="28"/>
+                <w:szCs w:val="28"/>
+                <w:u w:val="single"/>
+                <w:lang w:bidi="ar-JO"/>
+              </w:rPr>
+              <w:t>{</w:t>
+            </w:r>
+            <w:r>
+              <w:rPr>
+                <w:sz w:val="28"/>
+                <w:szCs w:val="28"/>
+                <w:u w:val="single"/>
+                <w:lang w:bidi="ar-JO"/>
+              </w:rPr>
+              <w:t>vehicle_year</w:t>
+            </w:r>
+            <w:r>
+              <w:rPr>
+                <w:sz w:val="28"/>
+                <w:szCs w:val="28"/>
+                <w:u w:val="single"/>
+                <w:lang w:bidi="ar-JO"/>
+              </w:rPr>
+              <w:t>}</w:t>
+            </w:r>
           </w:p>
         </w:tc>
         <w:tc>
           <w:tcPr>
             <w:tcW w:w="1651" w:type="dxa"/>
+            <w:tcMar/>
             <w:hideMark/>
           </w:tcPr>
           <w:p>
@@ -922,40 +1152,41 @@
         <w:tc>
           <w:tcPr>
             <w:tcW w:w="1452" w:type="dxa"/>
+            <w:tcMar/>
+            <w:hideMark/>
+          </w:tcPr>
+          <w:p>
+            <w:pPr>
+              <w:bidi w:val="1"/>
+              <w:rPr>
+                <w:sz w:val="28"/>
+                <w:szCs w:val="28"/>
+                <w:u w:val="single"/>
+                <w:rtl w:val="1"/>
+                <w:lang w:bidi="ar-JO"/>
+              </w:rPr>
+            </w:pPr>
+            <w:r>
+              <w:rPr>
+                <w:sz w:val="28"/>
+                <w:szCs w:val="28"/>
+                <w:u w:val="single"/>
+                <w:lang w:bidi="ar-JO"/>
+              </w:rPr>
+              <w:t>{vehicle_reg}</w:t>
+            </w:r>
+          </w:p>
+        </w:tc>
+        <w:tc>
+          <w:tcPr>
+            <w:tcW w:w="1710" w:type="dxa"/>
+            <w:tcMar/>
             <w:hideMark/>
           </w:tcPr>
           <w:p>
             <w:pPr>
               <w:bidi/>
               <w:rPr>
-                <w:sz w:val="28"/>
-                <w:szCs w:val="28"/>
-                <w:u w:val="single"/>
-                <w:rtl/>
-                <w:lang w:bidi="ar-JO"/>
-              </w:rPr>
-            </w:pPr>
-            <w:r>
-              <w:rPr>
-                <w:sz w:val="28"/>
-                <w:szCs w:val="28"/>
-                <w:u w:val="single"/>
-                <w:rtl/>
-                <w:lang w:bidi="ar-JO"/>
-              </w:rPr>
-              <w:t xml:space="preserve">خصوصي </w:t>
-            </w:r>
-          </w:p>
-        </w:tc>
-        <w:tc>
-          <w:tcPr>
-            <w:tcW w:w="1710" w:type="dxa"/>
-            <w:hideMark/>
-          </w:tcPr>
-          <w:p>
-            <w:pPr>
-              <w:bidi/>
-              <w:rPr>
                 <w:b/>
                 <w:bCs/>
                 <w:color w:val="FF0000"/>
@@ -984,16 +1215,17 @@
         <w:tc>
           <w:tcPr>
             <w:tcW w:w="1350" w:type="dxa"/>
+            <w:tcMar/>
             <w:hideMark/>
           </w:tcPr>
           <w:p>
             <w:pPr>
-              <w:bidi/>
+              <w:bidi w:val="1"/>
               <w:rPr>
                 <w:sz w:val="28"/>
                 <w:szCs w:val="28"/>
                 <w:u w:val="single"/>
-                <w:rtl/>
+                <w:rtl w:val="1"/>
                 <w:lang w:bidi="ar-JO"/>
               </w:rPr>
             </w:pPr>
@@ -1002,15 +1234,28 @@
                 <w:sz w:val="28"/>
                 <w:szCs w:val="28"/>
                 <w:u w:val="single"/>
-                <w:rtl/>
-                <w:lang w:bidi="ar-JO"/>
-              </w:rPr>
-              <w:t>____</w:t>
+                <w:lang w:bidi="ar-JO"/>
+              </w:rPr>
+              <w:t>{vehicle_color}</w:t>
             </w:r>
           </w:p>
         </w:tc>
       </w:tr>
     </w:tbl>
+    <w:p>
+      <w:pPr>
+        <w:pStyle w:val="ListParagraph"/>
+        <w:bidi w:val="1"/>
+        <w:spacing w:after="0" w:line="240" w:lineRule="auto"/>
+        <w:ind w:left="566"/>
+        <w:rPr>
+          <w:sz w:val="28"/>
+          <w:szCs w:val="28"/>
+          <w:rtl w:val="1"/>
+          <w:lang w:bidi="ar-JO"/>
+        </w:rPr>
+      </w:pPr>
+    </w:p>
     <w:p>
       <w:pPr>
         <w:pStyle w:val="ListParagraph"/>
@@ -1062,12 +1307,12 @@
         <w:tblW w:w="10343" w:type="dxa"/>
         <w:jc w:val="center"/>
         <w:tblBorders>
-          <w:top w:val="none" w:sz="0" w:space="0" w:color="auto"/>
-          <w:left w:val="none" w:sz="0" w:space="0" w:color="auto"/>
-          <w:bottom w:val="none" w:sz="0" w:space="0" w:color="auto"/>
-          <w:right w:val="none" w:sz="0" w:space="0" w:color="auto"/>
-          <w:insideH w:val="none" w:sz="0" w:space="0" w:color="auto"/>
-          <w:insideV w:val="none" w:sz="0" w:space="0" w:color="auto"/>
+          <w:top w:val="none" w:color="auto" w:sz="0" w:space="0"/>
+          <w:left w:val="none" w:color="auto" w:sz="0" w:space="0"/>
+          <w:bottom w:val="none" w:color="auto" w:sz="0" w:space="0"/>
+          <w:right w:val="none" w:color="auto" w:sz="0" w:space="0"/>
+          <w:insideH w:val="none" w:color="auto" w:sz="0" w:space="0"/>
+          <w:insideV w:val="none" w:color="auto" w:sz="0" w:space="0"/>
         </w:tblBorders>
         <w:tblLook w:val="04A0" w:firstRow="1" w:lastRow="0" w:firstColumn="1" w:lastColumn="0" w:noHBand="0" w:noVBand="1"/>
       </w:tblPr>
@@ -1085,11 +1330,12 @@
           <w:tcPr>
             <w:tcW w:w="9908" w:type="dxa"/>
             <w:tcBorders>
-              <w:top w:val="double" w:sz="12" w:space="0" w:color="964B00"/>
-              <w:left w:val="double" w:sz="12" w:space="0" w:color="964B00"/>
-              <w:bottom w:val="double" w:sz="12" w:space="0" w:color="964B00"/>
-              <w:right w:val="double" w:sz="12" w:space="0" w:color="964B00"/>
+              <w:top w:val="double" w:color="964B00" w:sz="12" w:space="0"/>
+              <w:left w:val="double" w:color="964B00" w:sz="12" w:space="0"/>
+              <w:bottom w:val="double" w:color="964B00" w:sz="12" w:space="0"/>
+              <w:right w:val="double" w:color="964B00" w:sz="12" w:space="0"/>
             </w:tcBorders>
+            <w:tcMar/>
           </w:tcPr>
           <w:p>
             <w:pPr>
@@ -1100,61 +1346,77 @@
               </w:numPr>
               <w:bidi/>
               <w:rPr>
-                <w:b/>
-                <w:bCs/>
-                <w:vanish/>
-                <w:sz w:val="28"/>
-                <w:szCs w:val="28"/>
+                <w:b w:val="1"/>
+                <w:bCs w:val="1"/>
+                <w:sz w:val="28"/>
+                <w:szCs w:val="28"/>
+                <w:rtl w:val="1"/>
                 <w:lang w:bidi="ar-JO"/>
               </w:rPr>
             </w:pPr>
-          </w:p>
-          <w:p>
-            <w:pPr>
-              <w:pStyle w:val="ListParagraph"/>
-              <w:numPr>
-                <w:ilvl w:val="0"/>
-                <w:numId w:val="10"/>
-              </w:numPr>
-              <w:bidi/>
-              <w:rPr>
-                <w:b/>
-                <w:bCs/>
-                <w:vanish/>
-                <w:sz w:val="28"/>
-                <w:szCs w:val="28"/>
-                <w:rtl/>
-                <w:lang w:bidi="ar-JO"/>
-              </w:rPr>
-            </w:pPr>
-          </w:p>
-          <w:p>
-            <w:pPr>
-              <w:pStyle w:val="ListParagraph"/>
-              <w:numPr>
-                <w:ilvl w:val="0"/>
-                <w:numId w:val="10"/>
-              </w:numPr>
-              <w:bidi/>
-              <w:rPr>
-                <w:b/>
-                <w:bCs/>
-                <w:sz w:val="28"/>
-                <w:szCs w:val="28"/>
-                <w:rtl/>
-                <w:lang w:bidi="ar-JO"/>
-              </w:rPr>
-            </w:pPr>
-            <w:r>
-              <w:rPr>
-                <w:b/>
-                <w:bCs/>
-                <w:sz w:val="28"/>
-                <w:szCs w:val="28"/>
-                <w:rtl/>
-                <w:lang w:bidi="ar-JO"/>
-              </w:rPr>
-              <w:t xml:space="preserve">مناطق الضرر :   </w:t>
+            <w:r>
+              <w:rPr>
+                <w:b w:val="1"/>
+                <w:bCs w:val="1"/>
+                <w:sz w:val="28"/>
+                <w:szCs w:val="28"/>
+                <w:rtl w:val="1"/>
+                <w:lang w:bidi="ar-JO"/>
+              </w:rPr>
+              <w:t xml:space="preserve">مناطق </w:t>
+            </w:r>
+            <w:r>
+              <w:rPr>
+                <w:b w:val="1"/>
+                <w:bCs w:val="1"/>
+                <w:sz w:val="28"/>
+                <w:szCs w:val="28"/>
+                <w:rtl w:val="1"/>
+                <w:lang w:bidi="ar-JO"/>
+              </w:rPr>
+              <w:t>الضرر :</w:t>
+            </w:r>
+            <w:r>
+              <w:rPr>
+                <w:b w:val="1"/>
+                <w:bCs w:val="1"/>
+                <w:sz w:val="28"/>
+                <w:szCs w:val="28"/>
+                <w:rtl w:val="1"/>
+                <w:lang w:bidi="ar-JO"/>
+              </w:rPr>
+              <w:t xml:space="preserve">   </w:t>
+            </w:r>
+            <w:r>
+              <w:rPr>
+                <w:b w:val="1"/>
+                <w:bCs w:val="1"/>
+                <w:sz w:val="28"/>
+                <w:szCs w:val="28"/>
+                <w:rtl w:val="1"/>
+                <w:lang w:bidi="ar-JO"/>
+              </w:rPr>
+              <w:t>{</w:t>
+            </w:r>
+            <w:r>
+              <w:rPr>
+                <w:b w:val="1"/>
+                <w:bCs w:val="1"/>
+                <w:sz w:val="28"/>
+                <w:szCs w:val="28"/>
+                <w:lang w:bidi="ar-JO"/>
+              </w:rPr>
+              <w:t>damage_areas</w:t>
+            </w:r>
+            <w:r>
+              <w:rPr>
+                <w:b w:val="1"/>
+                <w:bCs w:val="1"/>
+                <w:sz w:val="28"/>
+                <w:szCs w:val="28"/>
+                <w:lang w:bidi="ar-JO"/>
+              </w:rPr>
+              <w:t>}</w:t>
             </w:r>
           </w:p>
           <w:p>
@@ -1162,8 +1424,8 @@
               <w:bidi/>
               <w:ind w:left="61"/>
               <w:rPr>
-                <w:b/>
-                <w:bCs/>
+                <w:b w:val="1"/>
+                <w:bCs w:val="1"/>
                 <w:sz w:val="28"/>
                 <w:szCs w:val="28"/>
                 <w:lang w:bidi="ar-JO"/>
@@ -1171,23 +1433,81 @@
             </w:pPr>
             <w:r>
               <w:rPr>
-                <w:b/>
-                <w:bCs/>
-                <w:color w:val="FF0000"/>
-                <w:sz w:val="28"/>
-                <w:szCs w:val="28"/>
-                <w:rtl/>
-                <w:lang w:bidi="ar-JO"/>
-              </w:rPr>
-              <w:t xml:space="preserve">الوصف الكتابي : </w:t>
+                <w:b w:val="1"/>
+                <w:bCs w:val="1"/>
+                <w:color w:val="FF0000"/>
+                <w:sz w:val="28"/>
+                <w:szCs w:val="28"/>
+                <w:rtl w:val="1"/>
+                <w:lang w:bidi="ar-JO"/>
+              </w:rPr>
+              <w:t xml:space="preserve">الوصف </w:t>
+            </w:r>
+            <w:r>
+              <w:rPr>
+                <w:b w:val="1"/>
+                <w:bCs w:val="1"/>
+                <w:color w:val="FF0000"/>
+                <w:sz w:val="28"/>
+                <w:szCs w:val="28"/>
+                <w:rtl w:val="1"/>
+                <w:lang w:bidi="ar-JO"/>
+              </w:rPr>
+              <w:t>الكتابي :</w:t>
+            </w:r>
+            <w:r>
+              <w:rPr>
+                <w:b w:val="1"/>
+                <w:bCs w:val="1"/>
+                <w:color w:val="FF0000"/>
+                <w:sz w:val="28"/>
+                <w:szCs w:val="28"/>
+                <w:rtl w:val="1"/>
+                <w:lang w:bidi="ar-JO"/>
+              </w:rPr>
+              <w:t xml:space="preserve"> </w:t>
+            </w:r>
+            <w:r>
+              <w:rPr>
+                <w:b w:val="1"/>
+                <w:bCs w:val="1"/>
+                <w:color w:val="FF0000"/>
+                <w:sz w:val="28"/>
+                <w:szCs w:val="28"/>
+                <w:rtl w:val="1"/>
+                <w:lang w:bidi="ar-JO"/>
+              </w:rPr>
+              <w:t>{</w:t>
+            </w:r>
+            <w:r>
+              <w:rPr>
+                <w:b w:val="1"/>
+                <w:bCs w:val="1"/>
+                <w:color w:val="FF0000"/>
+                <w:sz w:val="28"/>
+                <w:szCs w:val="28"/>
+                <w:lang w:bidi="ar-JO"/>
+              </w:rPr>
+              <w:t>description</w:t>
+            </w:r>
+            <w:r>
+              <w:rPr>
+                <w:b w:val="1"/>
+                <w:bCs w:val="1"/>
+                <w:color w:val="FF0000"/>
+                <w:sz w:val="28"/>
+                <w:szCs w:val="28"/>
+                <w:lang w:bidi="ar-JO"/>
+              </w:rPr>
+              <w:t>}</w:t>
             </w:r>
           </w:p>
           <w:p>
             <w:pPr>
               <w:bidi/>
               <w:rPr>
-                <w:b/>
-                <w:bCs/>
+                <w:b w:val="1"/>
+                <w:bCs w:val="1"/>
                 <w:color w:val="FF0000"/>
                 <w:sz w:val="30"/>
                 <w:szCs w:val="30"/>
@@ -1196,12 +1516,12 @@
             </w:pPr>
             <w:r>
               <w:rPr>
-                <w:b/>
-                <w:bCs/>
+                <w:b w:val="1"/>
+                <w:bCs w:val="1"/>
                 <w:color w:val="FFFF00"/>
                 <w:sz w:val="30"/>
                 <w:szCs w:val="30"/>
-                <w:rtl/>
+                <w:rtl w:val="1"/>
                 <w:lang w:bidi="ar-JO"/>
                 <w14:glow w14:rad="101600">
                   <w14:schemeClr w14:val="tx1">
@@ -1218,12 +1538,12 @@
             </w:r>
             <w:r>
               <w:rPr>
-                <w:b/>
-                <w:bCs/>
+                <w:b w:val="1"/>
+                <w:bCs w:val="1"/>
                 <w:color w:val="FFFF00"/>
                 <w:sz w:val="30"/>
                 <w:szCs w:val="30"/>
-                <w:rtl/>
+                <w:rtl w:val="1"/>
                 <w:lang w:bidi="ar-JO"/>
                 <w14:glow w14:rad="101600">
                   <w14:schemeClr w14:val="tx1">
@@ -1240,12 +1560,12 @@
             </w:r>
             <w:r>
               <w:rPr>
-                <w:b/>
-                <w:bCs/>
+                <w:b w:val="1"/>
+                <w:bCs w:val="1"/>
                 <w:color w:val="FF0000"/>
                 <w:sz w:val="30"/>
                 <w:szCs w:val="30"/>
-                <w:rtl/>
+                <w:rtl w:val="1"/>
                 <w:lang w:bidi="ar-JO"/>
                 <w14:glow w14:rad="101600">
                   <w14:srgbClr w14:val="FFCC00"/>
@@ -1256,33 +1576,53 @@
                   </w14:srgbClr>
                 </w14:shadow>
               </w:rPr>
-              <w:t xml:space="preserve">حدود المسؤولية </w:t>
-            </w:r>
-            <w:r>
-              <w:rPr>
-                <w:b/>
-                <w:bCs/>
+              <w:t xml:space="preserve">حدود </w:t>
+            </w:r>
+            <w:r>
+              <w:rPr>
+                <w:b w:val="1"/>
+                <w:bCs w:val="1"/>
                 <w:color w:val="FF0000"/>
                 <w:sz w:val="30"/>
                 <w:szCs w:val="30"/>
-                <w:rtl/>
-                <w:lang w:bidi="ar-JO"/>
+                <w:rtl w:val="1"/>
+                <w:lang w:bidi="ar-JO"/>
+                <w14:glow w14:rad="101600">
+                  <w14:srgbClr w14:val="FFCC00"/>
+                </w14:glow>
                 <w14:shadow w14:blurRad="50800" w14:dist="38100" w14:dir="13500000" w14:sx="100000" w14:sy="100000" w14:kx="0" w14:ky="0" w14:algn="br">
                   <w14:srgbClr w14:val="000000">
                     <w14:alpha w14:val="60000"/>
                   </w14:srgbClr>
                 </w14:shadow>
               </w:rPr>
-              <w:t>:</w:t>
-            </w:r>
-            <w:r>
-              <w:rPr>
-                <w:b/>
-                <w:bCs/>
+              <w:t xml:space="preserve">المسؤولية </w:t>
+            </w:r>
+            <w:r>
+              <w:rPr>
+                <w:b w:val="1"/>
+                <w:bCs w:val="1"/>
                 <w:color w:val="FF0000"/>
                 <w:sz w:val="30"/>
                 <w:szCs w:val="30"/>
-                <w:rtl/>
+                <w:rtl w:val="1"/>
+                <w:lang w:bidi="ar-JO"/>
+                <w14:shadow w14:blurRad="50800" w14:dist="38100" w14:dir="13500000" w14:sx="100000" w14:sy="100000" w14:kx="0" w14:ky="0" w14:algn="br">
+                  <w14:srgbClr w14:val="000000">
+                    <w14:alpha w14:val="60000"/>
+                  </w14:srgbClr>
+                </w14:shadow>
+              </w:rPr>
+              <w:t>:</w:t>
+            </w:r>
+            <w:r>
+              <w:rPr>
+                <w:b w:val="1"/>
+                <w:bCs w:val="1"/>
+                <w:color w:val="FF0000"/>
+                <w:sz w:val="30"/>
+                <w:szCs w:val="30"/>
+                <w:rtl w:val="1"/>
                 <w:lang w:bidi="ar-JO"/>
                 <w14:glow w14:rad="101600">
                   <w14:srgbClr w14:val="0070C0">
@@ -1299,15 +1639,302 @@
             </w:r>
             <w:r>
               <w:rPr>
-                <w:b/>
-                <w:bCs/>
+                <w:b w:val="1"/>
+                <w:bCs w:val="1"/>
                 <w:color w:val="FF0000"/>
                 <w:sz w:val="30"/>
                 <w:szCs w:val="30"/>
-                <w:rtl/>
-                <w:lang w:bidi="ar-JO"/>
-              </w:rPr>
-              <w:t>100% من مسؤولية على المركبة المؤمنة لدينا .</w:t>
+                <w:rtl w:val="1"/>
+                <w:lang w:bidi="ar-JO"/>
+              </w:rPr>
+              <w:t>{</w:t>
+            </w:r>
+            <w:r>
+              <w:rPr>
+                <w:b w:val="1"/>
+                <w:bCs w:val="1"/>
+                <w:color w:val="FF0000"/>
+                <w:sz w:val="30"/>
+                <w:szCs w:val="30"/>
+                <w:lang w:bidi="ar-JO"/>
+              </w:rPr>
+              <w:t>liability_text</w:t>
+            </w:r>
+            <w:r>
+              <w:rPr>
+                <w:b w:val="1"/>
+                <w:bCs w:val="1"/>
+                <w:color w:val="FF0000"/>
+                <w:sz w:val="30"/>
+                <w:szCs w:val="30"/>
+                <w:rtl w:val="1"/>
+                <w:lang w:bidi="ar-JO"/>
+              </w:rPr>
+              <w:t>}</w:t>
+            </w:r>
+            <w:r>
+              <w:rPr>
+                <w:b w:val="1"/>
+                <w:bCs w:val="1"/>
+                <w:color w:val="FF0000"/>
+                <w:sz w:val="30"/>
+                <w:szCs w:val="30"/>
+                <w:rtl w:val="1"/>
+                <w:lang w:bidi="ar-JO"/>
+              </w:rPr>
+              <w:t xml:space="preserve"> </w:t>
+            </w:r>
+            <w:r>
+              <w:rPr>
+                <w:b w:val="1"/>
+                <w:bCs w:val="1"/>
+                <w:color w:val="FF0000"/>
+                <w:sz w:val="30"/>
+                <w:szCs w:val="30"/>
+                <w:rtl w:val="1"/>
+                <w:lang w:bidi="ar-JO"/>
+              </w:rPr>
+              <w:t>من</w:t>
+            </w:r>
+            <w:r>
+              <w:rPr>
+                <w:b w:val="1"/>
+                <w:bCs w:val="1"/>
+                <w:color w:val="FF0000"/>
+                <w:sz w:val="30"/>
+                <w:szCs w:val="30"/>
+                <w:rtl w:val="1"/>
+                <w:lang w:bidi="ar-JO"/>
+              </w:rPr>
+              <w:t xml:space="preserve"> </w:t>
+            </w:r>
+            <w:r>
+              <w:rPr>
+                <w:b w:val="1"/>
+                <w:bCs w:val="1"/>
+                <w:color w:val="FF0000"/>
+                <w:sz w:val="30"/>
+                <w:szCs w:val="30"/>
+                <w:rtl w:val="1"/>
+                <w:lang w:bidi="ar-JO"/>
+              </w:rPr>
+              <w:t>مس</w:t>
+            </w:r>
+            <w:r>
+              <w:rPr>
+                <w:b w:val="1"/>
+                <w:bCs w:val="1"/>
+                <w:color w:val="FF0000"/>
+                <w:sz w:val="30"/>
+                <w:szCs w:val="30"/>
+                <w:rtl w:val="1"/>
+                <w:lang w:bidi="ar-JO"/>
+              </w:rPr>
+              <w:t>ؤو</w:t>
+            </w:r>
+            <w:r>
+              <w:rPr>
+                <w:b w:val="1"/>
+                <w:bCs w:val="1"/>
+                <w:color w:val="FF0000"/>
+                <w:sz w:val="30"/>
+                <w:szCs w:val="30"/>
+                <w:rtl w:val="1"/>
+                <w:lang w:bidi="ar-JO"/>
+              </w:rPr>
+              <w:t>ل</w:t>
+            </w:r>
+            <w:r>
+              <w:rPr>
+                <w:b w:val="1"/>
+                <w:bCs w:val="1"/>
+                <w:color w:val="FF0000"/>
+                <w:sz w:val="30"/>
+                <w:szCs w:val="30"/>
+                <w:rtl w:val="1"/>
+                <w:lang w:bidi="ar-JO"/>
+              </w:rPr>
+              <w:t>ية</w:t>
+            </w:r>
+            <w:r>
+              <w:rPr>
+                <w:b w:val="1"/>
+                <w:bCs w:val="1"/>
+                <w:color w:val="FF0000"/>
+                <w:sz w:val="30"/>
+                <w:szCs w:val="30"/>
+                <w:rtl w:val="1"/>
+                <w:lang w:bidi="ar-JO"/>
+              </w:rPr>
+              <w:t xml:space="preserve"> </w:t>
+            </w:r>
+            <w:r>
+              <w:rPr>
+                <w:b w:val="1"/>
+                <w:bCs w:val="1"/>
+                <w:color w:val="FF0000"/>
+                <w:sz w:val="30"/>
+                <w:szCs w:val="30"/>
+                <w:rtl w:val="1"/>
+                <w:lang w:bidi="ar-JO"/>
+              </w:rPr>
+              <w:t>على</w:t>
+            </w:r>
+            <w:r>
+              <w:rPr>
+                <w:b w:val="1"/>
+                <w:bCs w:val="1"/>
+                <w:color w:val="FF0000"/>
+                <w:sz w:val="30"/>
+                <w:szCs w:val="30"/>
+                <w:rtl w:val="1"/>
+                <w:lang w:bidi="ar-JO"/>
+              </w:rPr>
+              <w:t xml:space="preserve"> </w:t>
+            </w:r>
+            <w:r>
+              <w:rPr>
+                <w:b w:val="1"/>
+                <w:bCs w:val="1"/>
+                <w:color w:val="FF0000"/>
+                <w:sz w:val="30"/>
+                <w:szCs w:val="30"/>
+                <w:rtl w:val="1"/>
+                <w:lang w:bidi="ar-JO"/>
+              </w:rPr>
+              <w:t>ا</w:t>
+            </w:r>
+            <w:r>
+              <w:rPr>
+                <w:b w:val="1"/>
+                <w:bCs w:val="1"/>
+                <w:color w:val="FF0000"/>
+                <w:sz w:val="30"/>
+                <w:szCs w:val="30"/>
+                <w:rtl w:val="1"/>
+                <w:lang w:bidi="ar-JO"/>
+              </w:rPr>
+              <w:t>لمر</w:t>
+            </w:r>
+            <w:r>
+              <w:rPr>
+                <w:b w:val="1"/>
+                <w:bCs w:val="1"/>
+                <w:color w:val="FF0000"/>
+                <w:sz w:val="30"/>
+                <w:szCs w:val="30"/>
+                <w:rtl w:val="1"/>
+                <w:lang w:bidi="ar-JO"/>
+              </w:rPr>
+              <w:t>ك</w:t>
+            </w:r>
+            <w:r>
+              <w:rPr>
+                <w:b w:val="1"/>
+                <w:bCs w:val="1"/>
+                <w:color w:val="FF0000"/>
+                <w:sz w:val="30"/>
+                <w:szCs w:val="30"/>
+                <w:rtl w:val="1"/>
+                <w:lang w:bidi="ar-JO"/>
+              </w:rPr>
+              <w:t>بة</w:t>
+            </w:r>
+            <w:r>
+              <w:rPr>
+                <w:b w:val="1"/>
+                <w:bCs w:val="1"/>
+                <w:color w:val="FF0000"/>
+                <w:sz w:val="30"/>
+                <w:szCs w:val="30"/>
+                <w:rtl w:val="1"/>
+                <w:lang w:bidi="ar-JO"/>
+              </w:rPr>
+              <w:t xml:space="preserve"> </w:t>
+            </w:r>
+            <w:r>
+              <w:rPr>
+                <w:b w:val="1"/>
+                <w:bCs w:val="1"/>
+                <w:color w:val="FF0000"/>
+                <w:sz w:val="30"/>
+                <w:szCs w:val="30"/>
+                <w:rtl w:val="1"/>
+                <w:lang w:bidi="ar-JO"/>
+              </w:rPr>
+              <w:t>المؤ</w:t>
+            </w:r>
+            <w:r>
+              <w:rPr>
+                <w:b w:val="1"/>
+                <w:bCs w:val="1"/>
+                <w:color w:val="FF0000"/>
+                <w:sz w:val="30"/>
+                <w:szCs w:val="30"/>
+                <w:rtl w:val="1"/>
+                <w:lang w:bidi="ar-JO"/>
+              </w:rPr>
+              <w:t>م</w:t>
+            </w:r>
+            <w:r>
+              <w:rPr>
+                <w:b w:val="1"/>
+                <w:bCs w:val="1"/>
+                <w:color w:val="FF0000"/>
+                <w:sz w:val="30"/>
+                <w:szCs w:val="30"/>
+                <w:rtl w:val="1"/>
+                <w:lang w:bidi="ar-JO"/>
+              </w:rPr>
+              <w:t>نة</w:t>
+            </w:r>
+            <w:r>
+              <w:rPr>
+                <w:b w:val="1"/>
+                <w:bCs w:val="1"/>
+                <w:color w:val="FF0000"/>
+                <w:sz w:val="30"/>
+                <w:szCs w:val="30"/>
+                <w:rtl w:val="1"/>
+                <w:lang w:bidi="ar-JO"/>
+              </w:rPr>
+              <w:t xml:space="preserve"> </w:t>
+            </w:r>
+            <w:r>
+              <w:rPr>
+                <w:b w:val="1"/>
+                <w:bCs w:val="1"/>
+                <w:color w:val="FF0000"/>
+                <w:sz w:val="30"/>
+                <w:szCs w:val="30"/>
+                <w:rtl w:val="1"/>
+                <w:lang w:bidi="ar-JO"/>
+              </w:rPr>
+              <w:t>لدين</w:t>
+            </w:r>
+            <w:r>
+              <w:rPr>
+                <w:b w:val="1"/>
+                <w:bCs w:val="1"/>
+                <w:color w:val="FF0000"/>
+                <w:sz w:val="30"/>
+                <w:szCs w:val="30"/>
+                <w:rtl w:val="1"/>
+                <w:lang w:bidi="ar-JO"/>
+              </w:rPr>
+              <w:t>ا</w:t>
+            </w:r>
+            <w:r>
+              <w:rPr>
+                <w:b w:val="1"/>
+                <w:bCs w:val="1"/>
+                <w:color w:val="FF0000"/>
+                <w:sz w:val="30"/>
+                <w:szCs w:val="30"/>
+                <w:rtl w:val="1"/>
+                <w:lang w:bidi="ar-JO"/>
+              </w:rPr>
+              <w:t xml:space="preserve"> .</w:t>
             </w:r>
           </w:p>
         </w:tc>
@@ -1316,11 +1943,12 @@
             <w:tcW w:w="435" w:type="dxa"/>
             <w:tcBorders>
               <w:top w:val="nil"/>
-              <w:left w:val="double" w:sz="12" w:space="0" w:color="964B00"/>
+              <w:left w:val="double" w:color="964B00" w:sz="12" w:space="0"/>
               <w:bottom w:val="nil"/>
               <w:right w:val="nil"/>
             </w:tcBorders>
             <w:shd w:val="clear" w:color="auto" w:fill="FFFFFF" w:themeFill="background1"/>
+            <w:tcMar/>
           </w:tcPr>
           <w:p>
             <w:pPr>
@@ -1570,10 +2198,10 @@
           <w:tcPr>
             <w:tcW w:w="4073" w:type="dxa"/>
             <w:tcBorders>
-              <w:top w:val="single" w:sz="4" w:space="0" w:color="auto"/>
-              <w:left w:val="single" w:sz="4" w:space="0" w:color="auto"/>
-              <w:bottom w:val="single" w:sz="4" w:space="0" w:color="auto"/>
-              <w:right w:val="single" w:sz="4" w:space="0" w:color="auto"/>
+              <w:top w:val="single" w:color="auto" w:sz="4" w:space="0"/>
+              <w:left w:val="single" w:color="auto" w:sz="4" w:space="0"/>
+              <w:bottom w:val="single" w:color="auto" w:sz="4" w:space="0"/>
+              <w:right w:val="single" w:color="auto" w:sz="4" w:space="0"/>
             </w:tcBorders>
             <w:hideMark/>
           </w:tcPr>
@@ -1608,10 +2236,10 @@
           <w:tcPr>
             <w:tcW w:w="1695" w:type="dxa"/>
             <w:tcBorders>
-              <w:top w:val="single" w:sz="4" w:space="0" w:color="auto"/>
-              <w:left w:val="single" w:sz="4" w:space="0" w:color="auto"/>
-              <w:bottom w:val="single" w:sz="4" w:space="0" w:color="auto"/>
-              <w:right w:val="single" w:sz="4" w:space="0" w:color="auto"/>
+              <w:top w:val="single" w:color="auto" w:sz="4" w:space="0"/>
+              <w:left w:val="single" w:color="auto" w:sz="4" w:space="0"/>
+              <w:bottom w:val="single" w:color="auto" w:sz="4" w:space="0"/>
+              <w:right w:val="single" w:color="auto" w:sz="4" w:space="0"/>
             </w:tcBorders>
             <w:hideMark/>
           </w:tcPr>
@@ -1652,10 +2280,10 @@
           <w:tcPr>
             <w:tcW w:w="4073" w:type="dxa"/>
             <w:tcBorders>
-              <w:top w:val="single" w:sz="4" w:space="0" w:color="auto"/>
-              <w:left w:val="single" w:sz="4" w:space="0" w:color="auto"/>
-              <w:bottom w:val="single" w:sz="4" w:space="0" w:color="auto"/>
-              <w:right w:val="single" w:sz="4" w:space="0" w:color="auto"/>
+              <w:top w:val="single" w:color="auto" w:sz="4" w:space="0"/>
+              <w:left w:val="single" w:color="auto" w:sz="4" w:space="0"/>
+              <w:bottom w:val="single" w:color="auto" w:sz="4" w:space="0"/>
+              <w:right w:val="single" w:color="auto" w:sz="4" w:space="0"/>
             </w:tcBorders>
           </w:tcPr>
           <w:p>
@@ -1676,10 +2304,10 @@
           <w:tcPr>
             <w:tcW w:w="1695" w:type="dxa"/>
             <w:tcBorders>
-              <w:top w:val="single" w:sz="4" w:space="0" w:color="auto"/>
-              <w:left w:val="single" w:sz="4" w:space="0" w:color="auto"/>
-              <w:bottom w:val="single" w:sz="4" w:space="0" w:color="auto"/>
-              <w:right w:val="single" w:sz="4" w:space="0" w:color="auto"/>
+              <w:top w:val="single" w:color="auto" w:sz="4" w:space="0"/>
+              <w:left w:val="single" w:color="auto" w:sz="4" w:space="0"/>
+              <w:bottom w:val="single" w:color="auto" w:sz="4" w:space="0"/>
+              <w:right w:val="single" w:color="auto" w:sz="4" w:space="0"/>
             </w:tcBorders>
           </w:tcPr>
           <w:p>
@@ -1704,10 +2332,10 @@
           <w:tcPr>
             <w:tcW w:w="4073" w:type="dxa"/>
             <w:tcBorders>
-              <w:top w:val="single" w:sz="4" w:space="0" w:color="auto"/>
-              <w:left w:val="single" w:sz="4" w:space="0" w:color="auto"/>
-              <w:bottom w:val="single" w:sz="4" w:space="0" w:color="auto"/>
-              <w:right w:val="single" w:sz="4" w:space="0" w:color="auto"/>
+              <w:top w:val="single" w:color="auto" w:sz="4" w:space="0"/>
+              <w:left w:val="single" w:color="auto" w:sz="4" w:space="0"/>
+              <w:bottom w:val="single" w:color="auto" w:sz="4" w:space="0"/>
+              <w:right w:val="single" w:color="auto" w:sz="4" w:space="0"/>
             </w:tcBorders>
           </w:tcPr>
           <w:p>
@@ -1729,10 +2357,10 @@
           <w:tcPr>
             <w:tcW w:w="1695" w:type="dxa"/>
             <w:tcBorders>
-              <w:top w:val="single" w:sz="4" w:space="0" w:color="auto"/>
-              <w:left w:val="single" w:sz="4" w:space="0" w:color="auto"/>
-              <w:bottom w:val="single" w:sz="4" w:space="0" w:color="auto"/>
-              <w:right w:val="single" w:sz="4" w:space="0" w:color="auto"/>
+              <w:top w:val="single" w:color="auto" w:sz="4" w:space="0"/>
+              <w:left w:val="single" w:color="auto" w:sz="4" w:space="0"/>
+              <w:bottom w:val="single" w:color="auto" w:sz="4" w:space="0"/>
+              <w:right w:val="single" w:color="auto" w:sz="4" w:space="0"/>
             </w:tcBorders>
           </w:tcPr>
           <w:p>
@@ -1758,10 +2386,10 @@
           <w:tcPr>
             <w:tcW w:w="4073" w:type="dxa"/>
             <w:tcBorders>
-              <w:top w:val="single" w:sz="4" w:space="0" w:color="auto"/>
-              <w:left w:val="single" w:sz="4" w:space="0" w:color="auto"/>
-              <w:bottom w:val="single" w:sz="4" w:space="0" w:color="auto"/>
-              <w:right w:val="single" w:sz="4" w:space="0" w:color="auto"/>
+              <w:top w:val="single" w:color="auto" w:sz="4" w:space="0"/>
+              <w:left w:val="single" w:color="auto" w:sz="4" w:space="0"/>
+              <w:bottom w:val="single" w:color="auto" w:sz="4" w:space="0"/>
+              <w:right w:val="single" w:color="auto" w:sz="4" w:space="0"/>
             </w:tcBorders>
           </w:tcPr>
           <w:p>
@@ -1783,10 +2411,10 @@
           <w:tcPr>
             <w:tcW w:w="1695" w:type="dxa"/>
             <w:tcBorders>
-              <w:top w:val="single" w:sz="4" w:space="0" w:color="auto"/>
-              <w:left w:val="single" w:sz="4" w:space="0" w:color="auto"/>
-              <w:bottom w:val="single" w:sz="4" w:space="0" w:color="auto"/>
-              <w:right w:val="single" w:sz="4" w:space="0" w:color="auto"/>
+              <w:top w:val="single" w:color="auto" w:sz="4" w:space="0"/>
+              <w:left w:val="single" w:color="auto" w:sz="4" w:space="0"/>
+              <w:bottom w:val="single" w:color="auto" w:sz="4" w:space="0"/>
+              <w:right w:val="single" w:color="auto" w:sz="4" w:space="0"/>
             </w:tcBorders>
           </w:tcPr>
           <w:p>
@@ -1812,10 +2440,10 @@
           <w:tcPr>
             <w:tcW w:w="4073" w:type="dxa"/>
             <w:tcBorders>
-              <w:top w:val="single" w:sz="4" w:space="0" w:color="auto"/>
-              <w:left w:val="single" w:sz="4" w:space="0" w:color="auto"/>
-              <w:bottom w:val="single" w:sz="4" w:space="0" w:color="auto"/>
-              <w:right w:val="single" w:sz="4" w:space="0" w:color="auto"/>
+              <w:top w:val="single" w:color="auto" w:sz="4" w:space="0"/>
+              <w:left w:val="single" w:color="auto" w:sz="4" w:space="0"/>
+              <w:bottom w:val="single" w:color="auto" w:sz="4" w:space="0"/>
+              <w:right w:val="single" w:color="auto" w:sz="4" w:space="0"/>
             </w:tcBorders>
           </w:tcPr>
           <w:p>
@@ -1837,10 +2465,10 @@
           <w:tcPr>
             <w:tcW w:w="1695" w:type="dxa"/>
             <w:tcBorders>
-              <w:top w:val="single" w:sz="4" w:space="0" w:color="auto"/>
-              <w:left w:val="single" w:sz="4" w:space="0" w:color="auto"/>
-              <w:bottom w:val="single" w:sz="4" w:space="0" w:color="auto"/>
-              <w:right w:val="single" w:sz="4" w:space="0" w:color="auto"/>
+              <w:top w:val="single" w:color="auto" w:sz="4" w:space="0"/>
+              <w:left w:val="single" w:color="auto" w:sz="4" w:space="0"/>
+              <w:bottom w:val="single" w:color="auto" w:sz="4" w:space="0"/>
+              <w:right w:val="single" w:color="auto" w:sz="4" w:space="0"/>
             </w:tcBorders>
           </w:tcPr>
           <w:p>
@@ -1866,10 +2494,10 @@
           <w:tcPr>
             <w:tcW w:w="4073" w:type="dxa"/>
             <w:tcBorders>
-              <w:top w:val="single" w:sz="4" w:space="0" w:color="auto"/>
-              <w:left w:val="single" w:sz="4" w:space="0" w:color="auto"/>
-              <w:bottom w:val="single" w:sz="4" w:space="0" w:color="auto"/>
-              <w:right w:val="single" w:sz="4" w:space="0" w:color="auto"/>
+              <w:top w:val="single" w:color="auto" w:sz="4" w:space="0"/>
+              <w:left w:val="single" w:color="auto" w:sz="4" w:space="0"/>
+              <w:bottom w:val="single" w:color="auto" w:sz="4" w:space="0"/>
+              <w:right w:val="single" w:color="auto" w:sz="4" w:space="0"/>
             </w:tcBorders>
           </w:tcPr>
           <w:p>
@@ -1891,10 +2519,10 @@
           <w:tcPr>
             <w:tcW w:w="1695" w:type="dxa"/>
             <w:tcBorders>
-              <w:top w:val="single" w:sz="4" w:space="0" w:color="auto"/>
-              <w:left w:val="single" w:sz="4" w:space="0" w:color="auto"/>
-              <w:bottom w:val="single" w:sz="4" w:space="0" w:color="auto"/>
-              <w:right w:val="single" w:sz="4" w:space="0" w:color="auto"/>
+              <w:top w:val="single" w:color="auto" w:sz="4" w:space="0"/>
+              <w:left w:val="single" w:color="auto" w:sz="4" w:space="0"/>
+              <w:bottom w:val="single" w:color="auto" w:sz="4" w:space="0"/>
+              <w:right w:val="single" w:color="auto" w:sz="4" w:space="0"/>
             </w:tcBorders>
           </w:tcPr>
           <w:p>
@@ -1920,10 +2548,10 @@
           <w:tcPr>
             <w:tcW w:w="4073" w:type="dxa"/>
             <w:tcBorders>
-              <w:top w:val="single" w:sz="4" w:space="0" w:color="auto"/>
-              <w:left w:val="single" w:sz="4" w:space="0" w:color="auto"/>
-              <w:bottom w:val="single" w:sz="4" w:space="0" w:color="auto"/>
-              <w:right w:val="single" w:sz="4" w:space="0" w:color="auto"/>
+              <w:top w:val="single" w:color="auto" w:sz="4" w:space="0"/>
+              <w:left w:val="single" w:color="auto" w:sz="4" w:space="0"/>
+              <w:bottom w:val="single" w:color="auto" w:sz="4" w:space="0"/>
+              <w:right w:val="single" w:color="auto" w:sz="4" w:space="0"/>
             </w:tcBorders>
           </w:tcPr>
           <w:p>
@@ -1945,10 +2573,10 @@
           <w:tcPr>
             <w:tcW w:w="1695" w:type="dxa"/>
             <w:tcBorders>
-              <w:top w:val="single" w:sz="4" w:space="0" w:color="auto"/>
-              <w:left w:val="single" w:sz="4" w:space="0" w:color="auto"/>
-              <w:bottom w:val="single" w:sz="4" w:space="0" w:color="auto"/>
-              <w:right w:val="single" w:sz="4" w:space="0" w:color="auto"/>
+              <w:top w:val="single" w:color="auto" w:sz="4" w:space="0"/>
+              <w:left w:val="single" w:color="auto" w:sz="4" w:space="0"/>
+              <w:bottom w:val="single" w:color="auto" w:sz="4" w:space="0"/>
+              <w:right w:val="single" w:color="auto" w:sz="4" w:space="0"/>
             </w:tcBorders>
           </w:tcPr>
           <w:p>
@@ -1974,10 +2602,10 @@
           <w:tcPr>
             <w:tcW w:w="4073" w:type="dxa"/>
             <w:tcBorders>
-              <w:top w:val="single" w:sz="4" w:space="0" w:color="auto"/>
-              <w:left w:val="single" w:sz="4" w:space="0" w:color="auto"/>
-              <w:bottom w:val="single" w:sz="4" w:space="0" w:color="auto"/>
-              <w:right w:val="single" w:sz="4" w:space="0" w:color="auto"/>
+              <w:top w:val="single" w:color="auto" w:sz="4" w:space="0"/>
+              <w:left w:val="single" w:color="auto" w:sz="4" w:space="0"/>
+              <w:bottom w:val="single" w:color="auto" w:sz="4" w:space="0"/>
+              <w:right w:val="single" w:color="auto" w:sz="4" w:space="0"/>
             </w:tcBorders>
             <w:hideMark/>
           </w:tcPr>
@@ -2013,10 +2641,10 @@
           <w:tcPr>
             <w:tcW w:w="1695" w:type="dxa"/>
             <w:tcBorders>
-              <w:top w:val="single" w:sz="4" w:space="0" w:color="auto"/>
-              <w:left w:val="single" w:sz="4" w:space="0" w:color="auto"/>
-              <w:bottom w:val="single" w:sz="4" w:space="0" w:color="auto"/>
-              <w:right w:val="single" w:sz="4" w:space="0" w:color="auto"/>
+              <w:top w:val="single" w:color="auto" w:sz="4" w:space="0"/>
+              <w:left w:val="single" w:color="auto" w:sz="4" w:space="0"/>
+              <w:bottom w:val="single" w:color="auto" w:sz="4" w:space="0"/>
+              <w:right w:val="single" w:color="auto" w:sz="4" w:space="0"/>
             </w:tcBorders>
             <w:hideMark/>
           </w:tcPr>
@@ -2082,10 +2710,10 @@
           <w:tcPr>
             <w:tcW w:w="3638" w:type="dxa"/>
             <w:tcBorders>
-              <w:top w:val="single" w:sz="4" w:space="0" w:color="auto"/>
-              <w:left w:val="single" w:sz="4" w:space="0" w:color="auto"/>
-              <w:bottom w:val="single" w:sz="4" w:space="0" w:color="auto"/>
-              <w:right w:val="single" w:sz="4" w:space="0" w:color="auto"/>
+              <w:top w:val="single" w:color="auto" w:sz="4" w:space="0"/>
+              <w:left w:val="single" w:color="auto" w:sz="4" w:space="0"/>
+              <w:bottom w:val="single" w:color="auto" w:sz="4" w:space="0"/>
+              <w:right w:val="single" w:color="auto" w:sz="4" w:space="0"/>
             </w:tcBorders>
           </w:tcPr>
           <w:p>
@@ -2108,10 +2736,10 @@
           <w:tcPr>
             <w:tcW w:w="3638" w:type="dxa"/>
             <w:tcBorders>
-              <w:top w:val="single" w:sz="4" w:space="0" w:color="auto"/>
-              <w:left w:val="single" w:sz="4" w:space="0" w:color="auto"/>
-              <w:bottom w:val="single" w:sz="4" w:space="0" w:color="auto"/>
-              <w:right w:val="single" w:sz="4" w:space="0" w:color="auto"/>
+              <w:top w:val="single" w:color="auto" w:sz="4" w:space="0"/>
+              <w:left w:val="single" w:color="auto" w:sz="4" w:space="0"/>
+              <w:bottom w:val="single" w:color="auto" w:sz="4" w:space="0"/>
+              <w:right w:val="single" w:color="auto" w:sz="4" w:space="0"/>
             </w:tcBorders>
           </w:tcPr>
           <w:p>
@@ -2135,10 +2763,10 @@
           <w:tcPr>
             <w:tcW w:w="3638" w:type="dxa"/>
             <w:tcBorders>
-              <w:top w:val="single" w:sz="4" w:space="0" w:color="auto"/>
-              <w:left w:val="single" w:sz="4" w:space="0" w:color="auto"/>
-              <w:bottom w:val="single" w:sz="4" w:space="0" w:color="auto"/>
-              <w:right w:val="single" w:sz="4" w:space="0" w:color="auto"/>
+              <w:top w:val="single" w:color="auto" w:sz="4" w:space="0"/>
+              <w:left w:val="single" w:color="auto" w:sz="4" w:space="0"/>
+              <w:bottom w:val="single" w:color="auto" w:sz="4" w:space="0"/>
+              <w:right w:val="single" w:color="auto" w:sz="4" w:space="0"/>
             </w:tcBorders>
           </w:tcPr>
           <w:p>
@@ -2162,10 +2790,10 @@
           <w:tcPr>
             <w:tcW w:w="3638" w:type="dxa"/>
             <w:tcBorders>
-              <w:top w:val="single" w:sz="4" w:space="0" w:color="auto"/>
-              <w:left w:val="single" w:sz="4" w:space="0" w:color="auto"/>
-              <w:bottom w:val="single" w:sz="4" w:space="0" w:color="auto"/>
-              <w:right w:val="single" w:sz="4" w:space="0" w:color="auto"/>
+              <w:top w:val="single" w:color="auto" w:sz="4" w:space="0"/>
+              <w:left w:val="single" w:color="auto" w:sz="4" w:space="0"/>
+              <w:bottom w:val="single" w:color="auto" w:sz="4" w:space="0"/>
+              <w:right w:val="single" w:color="auto" w:sz="4" w:space="0"/>
             </w:tcBorders>
           </w:tcPr>
           <w:p>
@@ -2189,10 +2817,10 @@
           <w:tcPr>
             <w:tcW w:w="3638" w:type="dxa"/>
             <w:tcBorders>
-              <w:top w:val="single" w:sz="4" w:space="0" w:color="auto"/>
-              <w:left w:val="single" w:sz="4" w:space="0" w:color="auto"/>
-              <w:bottom w:val="single" w:sz="4" w:space="0" w:color="auto"/>
-              <w:right w:val="single" w:sz="4" w:space="0" w:color="auto"/>
+              <w:top w:val="single" w:color="auto" w:sz="4" w:space="0"/>
+              <w:left w:val="single" w:color="auto" w:sz="4" w:space="0"/>
+              <w:bottom w:val="single" w:color="auto" w:sz="4" w:space="0"/>
+              <w:right w:val="single" w:color="auto" w:sz="4" w:space="0"/>
             </w:tcBorders>
           </w:tcPr>
           <w:p>
@@ -2216,10 +2844,10 @@
           <w:tcPr>
             <w:tcW w:w="3638" w:type="dxa"/>
             <w:tcBorders>
-              <w:top w:val="single" w:sz="4" w:space="0" w:color="auto"/>
-              <w:left w:val="single" w:sz="4" w:space="0" w:color="auto"/>
-              <w:bottom w:val="single" w:sz="4" w:space="0" w:color="auto"/>
-              <w:right w:val="single" w:sz="4" w:space="0" w:color="auto"/>
+              <w:top w:val="single" w:color="auto" w:sz="4" w:space="0"/>
+              <w:left w:val="single" w:color="auto" w:sz="4" w:space="0"/>
+              <w:bottom w:val="single" w:color="auto" w:sz="4" w:space="0"/>
+              <w:right w:val="single" w:color="auto" w:sz="4" w:space="0"/>
             </w:tcBorders>
             <w:hideMark/>
           </w:tcPr>
@@ -2253,10 +2881,10 @@
           <w:tcPr>
             <w:tcW w:w="3638" w:type="dxa"/>
             <w:tcBorders>
-              <w:top w:val="single" w:sz="4" w:space="0" w:color="auto"/>
-              <w:left w:val="single" w:sz="4" w:space="0" w:color="auto"/>
-              <w:bottom w:val="single" w:sz="4" w:space="0" w:color="auto"/>
-              <w:right w:val="single" w:sz="4" w:space="0" w:color="auto"/>
+              <w:top w:val="single" w:color="auto" w:sz="4" w:space="0"/>
+              <w:left w:val="single" w:color="auto" w:sz="4" w:space="0"/>
+              <w:bottom w:val="single" w:color="auto" w:sz="4" w:space="0"/>
+              <w:right w:val="single" w:color="auto" w:sz="4" w:space="0"/>
             </w:tcBorders>
             <w:hideMark/>
           </w:tcPr>
@@ -2290,10 +2918,10 @@
           <w:tcPr>
             <w:tcW w:w="3638" w:type="dxa"/>
             <w:tcBorders>
-              <w:top w:val="single" w:sz="4" w:space="0" w:color="auto"/>
-              <w:left w:val="single" w:sz="4" w:space="0" w:color="auto"/>
-              <w:bottom w:val="single" w:sz="4" w:space="0" w:color="auto"/>
-              <w:right w:val="single" w:sz="4" w:space="0" w:color="auto"/>
+              <w:top w:val="single" w:color="auto" w:sz="4" w:space="0"/>
+              <w:left w:val="single" w:color="auto" w:sz="4" w:space="0"/>
+              <w:bottom w:val="single" w:color="auto" w:sz="4" w:space="0"/>
+              <w:right w:val="single" w:color="auto" w:sz="4" w:space="0"/>
             </w:tcBorders>
             <w:hideMark/>
           </w:tcPr>
@@ -3047,12 +3675,12 @@
         <w:bidiVisual/>
         <w:tblW w:w="10348" w:type="dxa"/>
         <w:tblBorders>
-          <w:top w:val="single" w:sz="18" w:space="0" w:color="auto"/>
-          <w:left w:val="single" w:sz="18" w:space="0" w:color="auto"/>
-          <w:bottom w:val="single" w:sz="18" w:space="0" w:color="auto"/>
-          <w:right w:val="single" w:sz="18" w:space="0" w:color="auto"/>
-          <w:insideH w:val="single" w:sz="18" w:space="0" w:color="auto"/>
-          <w:insideV w:val="single" w:sz="18" w:space="0" w:color="auto"/>
+          <w:top w:val="single" w:color="auto" w:sz="18" w:space="0"/>
+          <w:left w:val="single" w:color="auto" w:sz="18" w:space="0"/>
+          <w:bottom w:val="single" w:color="auto" w:sz="18" w:space="0"/>
+          <w:right w:val="single" w:color="auto" w:sz="18" w:space="0"/>
+          <w:insideH w:val="single" w:color="auto" w:sz="18" w:space="0"/>
+          <w:insideV w:val="single" w:color="auto" w:sz="18" w:space="0"/>
         </w:tblBorders>
         <w:shd w:val="clear" w:color="auto" w:fill="FFFF00"/>
         <w:tblLook w:val="04A0" w:firstRow="1" w:lastRow="0" w:firstColumn="1" w:lastColumn="0" w:noHBand="0" w:noVBand="1"/>
@@ -3065,10 +3693,10 @@
           <w:tcPr>
             <w:tcW w:w="10348" w:type="dxa"/>
             <w:tcBorders>
-              <w:top w:val="single" w:sz="18" w:space="0" w:color="964C00"/>
-              <w:left w:val="single" w:sz="18" w:space="0" w:color="964B00"/>
-              <w:bottom w:val="single" w:sz="24" w:space="0" w:color="964C00"/>
-              <w:right w:val="single" w:sz="18" w:space="0" w:color="964B00"/>
+              <w:top w:val="single" w:color="964C00" w:sz="18" w:space="0"/>
+              <w:left w:val="single" w:color="964B00" w:sz="18" w:space="0"/>
+              <w:bottom w:val="single" w:color="964C00" w:sz="24" w:space="0"/>
+              <w:right w:val="single" w:color="964B00" w:sz="18" w:space="0"/>
             </w:tcBorders>
             <w:hideMark/>
           </w:tcPr>
@@ -3187,7 +3815,7 @@
         <w:spacing w:after="0" w:line="240" w:lineRule="auto"/>
         <w:ind w:left="99" w:hanging="180"/>
         <w:rPr>
-          <w:rFonts w:ascii="Times New Roman" w:eastAsia="Times New Roman" w:hAnsi="Times New Roman" w:cs="Times New Roman"/>
+          <w:rFonts w:ascii="Times New Roman" w:hAnsi="Times New Roman" w:eastAsia="Times New Roman" w:cs="Times New Roman"/>
           <w:b/>
           <w:bCs/>
           <w:color w:val="FF0000"/>
@@ -3206,7 +3834,7 @@
         <w:spacing w:after="0" w:line="240" w:lineRule="auto"/>
         <w:ind w:left="99" w:hanging="180"/>
         <w:rPr>
-          <w:rFonts w:ascii="Times New Roman" w:eastAsia="Times New Roman" w:hAnsi="Times New Roman" w:cs="Times New Roman"/>
+          <w:rFonts w:ascii="Times New Roman" w:hAnsi="Times New Roman" w:eastAsia="Times New Roman" w:cs="Times New Roman"/>
           <w:b/>
           <w:bCs/>
           <w:color w:val="FF0000"/>
@@ -3225,7 +3853,7 @@
         <w:spacing w:after="0" w:line="240" w:lineRule="auto"/>
         <w:ind w:left="99" w:hanging="180"/>
         <w:rPr>
-          <w:rFonts w:ascii="Times New Roman" w:eastAsia="Times New Roman" w:hAnsi="Times New Roman" w:cs="Times New Roman"/>
+          <w:rFonts w:ascii="Times New Roman" w:hAnsi="Times New Roman" w:eastAsia="Times New Roman" w:cs="Times New Roman"/>
           <w:b/>
           <w:bCs/>
           <w:color w:val="FF0000"/>
@@ -3244,7 +3872,7 @@
         <w:spacing w:after="0" w:line="240" w:lineRule="auto"/>
         <w:ind w:left="99" w:hanging="180"/>
         <w:rPr>
-          <w:rFonts w:ascii="Times New Roman" w:eastAsia="Times New Roman" w:hAnsi="Times New Roman" w:cs="Times New Roman"/>
+          <w:rFonts w:ascii="Times New Roman" w:hAnsi="Times New Roman" w:eastAsia="Times New Roman" w:cs="Times New Roman"/>
           <w:b/>
           <w:bCs/>
           <w:color w:val="FF0000"/>
@@ -3263,7 +3891,7 @@
         <w:spacing w:after="0" w:line="240" w:lineRule="auto"/>
         <w:ind w:left="99" w:hanging="180"/>
         <w:rPr>
-          <w:rFonts w:ascii="Times New Roman" w:eastAsia="Times New Roman" w:hAnsi="Times New Roman" w:cs="Times New Roman"/>
+          <w:rFonts w:ascii="Times New Roman" w:hAnsi="Times New Roman" w:eastAsia="Times New Roman" w:cs="Times New Roman"/>
           <w:b/>
           <w:bCs/>
           <w:color w:val="FF0000"/>
@@ -3282,7 +3910,7 @@
         <w:spacing w:after="0" w:line="240" w:lineRule="auto"/>
         <w:ind w:left="656" w:hanging="180"/>
         <w:rPr>
-          <w:rFonts w:ascii="Times New Roman" w:eastAsia="Times New Roman" w:hAnsi="Times New Roman" w:cs="Times New Roman"/>
+          <w:rFonts w:ascii="Times New Roman" w:hAnsi="Times New Roman" w:eastAsia="Times New Roman" w:cs="Times New Roman"/>
           <w:b/>
           <w:bCs/>
           <w:color w:val="FF0000"/>
@@ -3295,7 +3923,7 @@
       </w:pPr>
       <w:r>
         <w:rPr>
-          <w:rFonts w:ascii="Times New Roman" w:eastAsia="Times New Roman" w:hAnsi="Times New Roman" w:cs="Times New Roman"/>
+          <w:rFonts w:ascii="Times New Roman" w:hAnsi="Times New Roman" w:eastAsia="Times New Roman" w:cs="Times New Roman"/>
           <w:b/>
           <w:bCs/>
           <w:color w:val="FF0000"/>
@@ -3315,7 +3943,7 @@
         <w:ind w:left="656" w:hanging="196"/>
         <w:jc w:val="lowKashida"/>
         <w:rPr>
-          <w:rFonts w:ascii="Times New Roman" w:eastAsia="Times New Roman" w:hAnsi="Times New Roman" w:cs="Times New Roman"/>
+          <w:rFonts w:ascii="Times New Roman" w:hAnsi="Times New Roman" w:eastAsia="Times New Roman" w:cs="Times New Roman"/>
           <w:b/>
           <w:bCs/>
           <w:sz w:val="28"/>
@@ -3325,7 +3953,7 @@
       </w:pPr>
       <w:r>
         <w:rPr>
-          <w:rFonts w:ascii="Times New Roman" w:eastAsia="Times New Roman" w:hAnsi="Times New Roman" w:cs="Times New Roman"/>
+          <w:rFonts w:ascii="Times New Roman" w:hAnsi="Times New Roman" w:eastAsia="Times New Roman" w:cs="Times New Roman"/>
           <w:b/>
           <w:bCs/>
           <w:sz w:val="28"/>
@@ -3337,7 +3965,7 @@
       </w:r>
       <w:r>
         <w:rPr>
-          <w:rFonts w:ascii="Times New Roman" w:eastAsia="Times New Roman" w:hAnsi="Times New Roman" w:cs="Times New Roman"/>
+          <w:rFonts w:ascii="Times New Roman" w:hAnsi="Times New Roman" w:eastAsia="Times New Roman" w:cs="Times New Roman"/>
           <w:b/>
           <w:bCs/>
           <w:sz w:val="28"/>
@@ -3348,7 +3976,7 @@
       </w:r>
       <w:r>
         <w:rPr>
-          <w:rFonts w:ascii="Times New Roman" w:eastAsia="Times New Roman" w:hAnsi="Times New Roman" w:cs="Times New Roman"/>
+          <w:rFonts w:ascii="Times New Roman" w:hAnsi="Times New Roman" w:eastAsia="Times New Roman" w:cs="Times New Roman"/>
           <w:b/>
           <w:bCs/>
           <w:sz w:val="28"/>
@@ -3366,7 +3994,7 @@
         <w:ind w:left="279" w:hanging="196"/>
         <w:jc w:val="lowKashida"/>
         <w:rPr>
-          <w:rFonts w:ascii="Times New Roman" w:eastAsia="Times New Roman" w:hAnsi="Times New Roman" w:cs="Times New Roman"/>
+          <w:rFonts w:ascii="Times New Roman" w:hAnsi="Times New Roman" w:eastAsia="Times New Roman" w:cs="Times New Roman"/>
           <w:b/>
           <w:bCs/>
           <w:sz w:val="6"/>
@@ -3381,12 +4009,12 @@
         <w:tblW w:w="7793" w:type="dxa"/>
         <w:jc w:val="center"/>
         <w:tblBorders>
-          <w:top w:val="single" w:sz="4" w:space="0" w:color="auto"/>
-          <w:left w:val="single" w:sz="4" w:space="0" w:color="auto"/>
-          <w:bottom w:val="single" w:sz="4" w:space="0" w:color="auto"/>
-          <w:right w:val="single" w:sz="4" w:space="0" w:color="auto"/>
-          <w:insideH w:val="single" w:sz="4" w:space="0" w:color="auto"/>
-          <w:insideV w:val="single" w:sz="4" w:space="0" w:color="auto"/>
+          <w:top w:val="single" w:color="auto" w:sz="4" w:space="0"/>
+          <w:left w:val="single" w:color="auto" w:sz="4" w:space="0"/>
+          <w:bottom w:val="single" w:color="auto" w:sz="4" w:space="0"/>
+          <w:right w:val="single" w:color="auto" w:sz="4" w:space="0"/>
+          <w:insideH w:val="single" w:color="auto" w:sz="4" w:space="0"/>
+          <w:insideV w:val="single" w:color="auto" w:sz="4" w:space="0"/>
         </w:tblBorders>
         <w:tblLook w:val="01E0" w:firstRow="1" w:lastRow="1" w:firstColumn="1" w:lastColumn="1" w:noHBand="0" w:noVBand="0"/>
       </w:tblPr>
@@ -3404,10 +4032,10 @@
           <w:tcPr>
             <w:tcW w:w="892" w:type="dxa"/>
             <w:tcBorders>
-              <w:top w:val="single" w:sz="4" w:space="0" w:color="auto"/>
-              <w:left w:val="single" w:sz="4" w:space="0" w:color="auto"/>
-              <w:bottom w:val="single" w:sz="4" w:space="0" w:color="auto"/>
-              <w:right w:val="single" w:sz="4" w:space="0" w:color="auto"/>
+              <w:top w:val="single" w:color="auto" w:sz="4" w:space="0"/>
+              <w:left w:val="single" w:color="auto" w:sz="4" w:space="0"/>
+              <w:bottom w:val="single" w:color="auto" w:sz="4" w:space="0"/>
+              <w:right w:val="single" w:color="auto" w:sz="4" w:space="0"/>
             </w:tcBorders>
             <w:shd w:val="clear" w:color="auto" w:fill="FFFFFF"/>
             <w:hideMark/>
@@ -3418,7 +4046,7 @@
               <w:spacing w:after="0" w:line="240" w:lineRule="auto"/>
               <w:jc w:val="center"/>
               <w:rPr>
-                <w:rFonts w:ascii="Times New Roman" w:eastAsia="Times New Roman" w:hAnsi="Times New Roman" w:cs="Times New Roman"/>
+                <w:rFonts w:ascii="Times New Roman" w:hAnsi="Times New Roman" w:eastAsia="Times New Roman" w:cs="Times New Roman"/>
                 <w:b/>
                 <w:bCs/>
                 <w:color w:val="0070C0"/>
@@ -3430,7 +4058,7 @@
             </w:pPr>
             <w:r>
               <w:rPr>
-                <w:rFonts w:ascii="Times New Roman" w:eastAsia="Times New Roman" w:hAnsi="Times New Roman" w:cs="Times New Roman"/>
+                <w:rFonts w:ascii="Times New Roman" w:hAnsi="Times New Roman" w:eastAsia="Times New Roman" w:cs="Times New Roman"/>
                 <w:b/>
                 <w:bCs/>
                 <w:color w:val="FF0000"/>
@@ -3447,10 +4075,10 @@
           <w:tcPr>
             <w:tcW w:w="4381" w:type="dxa"/>
             <w:tcBorders>
-              <w:top w:val="single" w:sz="4" w:space="0" w:color="auto"/>
-              <w:left w:val="single" w:sz="4" w:space="0" w:color="auto"/>
-              <w:bottom w:val="single" w:sz="4" w:space="0" w:color="auto"/>
-              <w:right w:val="single" w:sz="4" w:space="0" w:color="auto"/>
+              <w:top w:val="single" w:color="auto" w:sz="4" w:space="0"/>
+              <w:left w:val="single" w:color="auto" w:sz="4" w:space="0"/>
+              <w:bottom w:val="single" w:color="auto" w:sz="4" w:space="0"/>
+              <w:right w:val="single" w:color="auto" w:sz="4" w:space="0"/>
             </w:tcBorders>
             <w:shd w:val="clear" w:color="auto" w:fill="FFFFFF"/>
             <w:hideMark/>
@@ -3461,7 +4089,7 @@
               <w:spacing w:after="0" w:line="240" w:lineRule="auto"/>
               <w:jc w:val="center"/>
               <w:rPr>
-                <w:rFonts w:ascii="Times New Roman" w:eastAsia="Times New Roman" w:hAnsi="Times New Roman" w:cs="Times New Roman"/>
+                <w:rFonts w:ascii="Times New Roman" w:hAnsi="Times New Roman" w:eastAsia="Times New Roman" w:cs="Times New Roman"/>
                 <w:b/>
                 <w:bCs/>
                 <w:color w:val="FF0000"/>
@@ -3473,7 +4101,7 @@
             </w:pPr>
             <w:r>
               <w:rPr>
-                <w:rFonts w:ascii="Times New Roman" w:eastAsia="Times New Roman" w:hAnsi="Times New Roman" w:cs="Times New Roman"/>
+                <w:rFonts w:ascii="Times New Roman" w:hAnsi="Times New Roman" w:eastAsia="Times New Roman" w:cs="Times New Roman"/>
                 <w:b/>
                 <w:bCs/>
                 <w:color w:val="FF0000"/>
@@ -3490,10 +4118,10 @@
           <w:tcPr>
             <w:tcW w:w="2520" w:type="dxa"/>
             <w:tcBorders>
-              <w:top w:val="single" w:sz="4" w:space="0" w:color="auto"/>
-              <w:left w:val="single" w:sz="4" w:space="0" w:color="auto"/>
-              <w:bottom w:val="single" w:sz="4" w:space="0" w:color="auto"/>
-              <w:right w:val="single" w:sz="4" w:space="0" w:color="auto"/>
+              <w:top w:val="single" w:color="auto" w:sz="4" w:space="0"/>
+              <w:left w:val="single" w:color="auto" w:sz="4" w:space="0"/>
+              <w:bottom w:val="single" w:color="auto" w:sz="4" w:space="0"/>
+              <w:right w:val="single" w:color="auto" w:sz="4" w:space="0"/>
             </w:tcBorders>
             <w:shd w:val="clear" w:color="auto" w:fill="FFFFFF"/>
             <w:hideMark/>
@@ -3504,7 +4132,7 @@
               <w:spacing w:after="0" w:line="240" w:lineRule="auto"/>
               <w:jc w:val="center"/>
               <w:rPr>
-                <w:rFonts w:ascii="Times New Roman" w:eastAsia="Times New Roman" w:hAnsi="Times New Roman" w:cs="Times New Roman"/>
+                <w:rFonts w:ascii="Times New Roman" w:hAnsi="Times New Roman" w:eastAsia="Times New Roman" w:cs="Times New Roman"/>
                 <w:b/>
                 <w:bCs/>
                 <w:color w:val="FF0000"/>
@@ -3516,7 +4144,7 @@
             </w:pPr>
             <w:r>
               <w:rPr>
-                <w:rFonts w:ascii="Times New Roman" w:eastAsia="Times New Roman" w:hAnsi="Times New Roman" w:cs="Times New Roman"/>
+                <w:rFonts w:ascii="Times New Roman" w:hAnsi="Times New Roman" w:eastAsia="Times New Roman" w:cs="Times New Roman"/>
                 <w:b/>
                 <w:bCs/>
                 <w:color w:val="FF0000"/>
@@ -3539,10 +4167,10 @@
           <w:tcPr>
             <w:tcW w:w="892" w:type="dxa"/>
             <w:tcBorders>
-              <w:top w:val="single" w:sz="4" w:space="0" w:color="auto"/>
-              <w:left w:val="single" w:sz="4" w:space="0" w:color="auto"/>
-              <w:bottom w:val="single" w:sz="4" w:space="0" w:color="auto"/>
-              <w:right w:val="single" w:sz="4" w:space="0" w:color="auto"/>
+              <w:top w:val="single" w:color="auto" w:sz="4" w:space="0"/>
+              <w:left w:val="single" w:color="auto" w:sz="4" w:space="0"/>
+              <w:bottom w:val="single" w:color="auto" w:sz="4" w:space="0"/>
+              <w:right w:val="single" w:color="auto" w:sz="4" w:space="0"/>
             </w:tcBorders>
           </w:tcPr>
           <w:p>
@@ -3555,7 +4183,7 @@
               <w:spacing w:line="240" w:lineRule="auto"/>
               <w:contextualSpacing/>
               <w:rPr>
-                <w:rFonts w:ascii="Times New Roman" w:eastAsia="Times New Roman" w:hAnsi="Times New Roman" w:cs="Times New Roman"/>
+                <w:rFonts w:ascii="Times New Roman" w:hAnsi="Times New Roman" w:eastAsia="Times New Roman" w:cs="Times New Roman"/>
                 <w:b/>
                 <w:bCs/>
                 <w:sz w:val="28"/>
@@ -3570,10 +4198,10 @@
           <w:tcPr>
             <w:tcW w:w="4381" w:type="dxa"/>
             <w:tcBorders>
-              <w:top w:val="single" w:sz="4" w:space="0" w:color="auto"/>
-              <w:left w:val="single" w:sz="4" w:space="0" w:color="auto"/>
-              <w:bottom w:val="single" w:sz="4" w:space="0" w:color="auto"/>
-              <w:right w:val="single" w:sz="4" w:space="0" w:color="auto"/>
+              <w:top w:val="single" w:color="auto" w:sz="4" w:space="0"/>
+              <w:left w:val="single" w:color="auto" w:sz="4" w:space="0"/>
+              <w:bottom w:val="single" w:color="auto" w:sz="4" w:space="0"/>
+              <w:right w:val="single" w:color="auto" w:sz="4" w:space="0"/>
             </w:tcBorders>
           </w:tcPr>
           <w:p>
@@ -3595,10 +4223,10 @@
           <w:tcPr>
             <w:tcW w:w="2520" w:type="dxa"/>
             <w:tcBorders>
-              <w:top w:val="single" w:sz="4" w:space="0" w:color="auto"/>
-              <w:left w:val="single" w:sz="4" w:space="0" w:color="auto"/>
-              <w:bottom w:val="single" w:sz="4" w:space="0" w:color="auto"/>
-              <w:right w:val="single" w:sz="4" w:space="0" w:color="auto"/>
+              <w:top w:val="single" w:color="auto" w:sz="4" w:space="0"/>
+              <w:left w:val="single" w:color="auto" w:sz="4" w:space="0"/>
+              <w:bottom w:val="single" w:color="auto" w:sz="4" w:space="0"/>
+              <w:right w:val="single" w:color="auto" w:sz="4" w:space="0"/>
             </w:tcBorders>
           </w:tcPr>
           <w:p>
@@ -3627,10 +4255,10 @@
           <w:tcPr>
             <w:tcW w:w="892" w:type="dxa"/>
             <w:tcBorders>
-              <w:top w:val="single" w:sz="4" w:space="0" w:color="auto"/>
-              <w:left w:val="single" w:sz="4" w:space="0" w:color="auto"/>
-              <w:bottom w:val="single" w:sz="4" w:space="0" w:color="auto"/>
-              <w:right w:val="single" w:sz="4" w:space="0" w:color="auto"/>
+              <w:top w:val="single" w:color="auto" w:sz="4" w:space="0"/>
+              <w:left w:val="single" w:color="auto" w:sz="4" w:space="0"/>
+              <w:bottom w:val="single" w:color="auto" w:sz="4" w:space="0"/>
+              <w:right w:val="single" w:color="auto" w:sz="4" w:space="0"/>
             </w:tcBorders>
           </w:tcPr>
           <w:p>
@@ -3643,7 +4271,7 @@
               <w:spacing w:line="240" w:lineRule="auto"/>
               <w:contextualSpacing/>
               <w:rPr>
-                <w:rFonts w:ascii="Times New Roman" w:eastAsia="Times New Roman" w:hAnsi="Times New Roman" w:cs="Times New Roman"/>
+                <w:rFonts w:ascii="Times New Roman" w:hAnsi="Times New Roman" w:eastAsia="Times New Roman" w:cs="Times New Roman"/>
                 <w:b/>
                 <w:bCs/>
                 <w:sz w:val="28"/>
@@ -3658,10 +4286,10 @@
           <w:tcPr>
             <w:tcW w:w="4381" w:type="dxa"/>
             <w:tcBorders>
-              <w:top w:val="single" w:sz="4" w:space="0" w:color="auto"/>
-              <w:left w:val="single" w:sz="4" w:space="0" w:color="auto"/>
-              <w:bottom w:val="single" w:sz="4" w:space="0" w:color="auto"/>
-              <w:right w:val="single" w:sz="4" w:space="0" w:color="auto"/>
+              <w:top w:val="single" w:color="auto" w:sz="4" w:space="0"/>
+              <w:left w:val="single" w:color="auto" w:sz="4" w:space="0"/>
+              <w:bottom w:val="single" w:color="auto" w:sz="4" w:space="0"/>
+              <w:right w:val="single" w:color="auto" w:sz="4" w:space="0"/>
             </w:tcBorders>
           </w:tcPr>
           <w:p>
@@ -3683,10 +4311,10 @@
           <w:tcPr>
             <w:tcW w:w="2520" w:type="dxa"/>
             <w:tcBorders>
-              <w:top w:val="single" w:sz="4" w:space="0" w:color="auto"/>
-              <w:left w:val="single" w:sz="4" w:space="0" w:color="auto"/>
-              <w:bottom w:val="single" w:sz="4" w:space="0" w:color="auto"/>
-              <w:right w:val="single" w:sz="4" w:space="0" w:color="auto"/>
+              <w:top w:val="single" w:color="auto" w:sz="4" w:space="0"/>
+              <w:left w:val="single" w:color="auto" w:sz="4" w:space="0"/>
+              <w:bottom w:val="single" w:color="auto" w:sz="4" w:space="0"/>
+              <w:right w:val="single" w:color="auto" w:sz="4" w:space="0"/>
             </w:tcBorders>
           </w:tcPr>
           <w:p>
@@ -3715,10 +4343,10 @@
           <w:tcPr>
             <w:tcW w:w="892" w:type="dxa"/>
             <w:tcBorders>
-              <w:top w:val="single" w:sz="4" w:space="0" w:color="auto"/>
-              <w:left w:val="single" w:sz="4" w:space="0" w:color="auto"/>
-              <w:bottom w:val="single" w:sz="4" w:space="0" w:color="auto"/>
-              <w:right w:val="single" w:sz="4" w:space="0" w:color="auto"/>
+              <w:top w:val="single" w:color="auto" w:sz="4" w:space="0"/>
+              <w:left w:val="single" w:color="auto" w:sz="4" w:space="0"/>
+              <w:bottom w:val="single" w:color="auto" w:sz="4" w:space="0"/>
+              <w:right w:val="single" w:color="auto" w:sz="4" w:space="0"/>
             </w:tcBorders>
           </w:tcPr>
           <w:p>
@@ -3731,7 +4359,7 @@
               <w:spacing w:line="240" w:lineRule="auto"/>
               <w:contextualSpacing/>
               <w:rPr>
-                <w:rFonts w:ascii="Times New Roman" w:eastAsia="Times New Roman" w:hAnsi="Times New Roman" w:cs="Times New Roman"/>
+                <w:rFonts w:ascii="Times New Roman" w:hAnsi="Times New Roman" w:eastAsia="Times New Roman" w:cs="Times New Roman"/>
                 <w:b/>
                 <w:bCs/>
                 <w:sz w:val="28"/>
@@ -3746,10 +4374,10 @@
           <w:tcPr>
             <w:tcW w:w="4381" w:type="dxa"/>
             <w:tcBorders>
-              <w:top w:val="single" w:sz="4" w:space="0" w:color="auto"/>
-              <w:left w:val="single" w:sz="4" w:space="0" w:color="auto"/>
-              <w:bottom w:val="single" w:sz="4" w:space="0" w:color="auto"/>
-              <w:right w:val="single" w:sz="4" w:space="0" w:color="auto"/>
+              <w:top w:val="single" w:color="auto" w:sz="4" w:space="0"/>
+              <w:left w:val="single" w:color="auto" w:sz="4" w:space="0"/>
+              <w:bottom w:val="single" w:color="auto" w:sz="4" w:space="0"/>
+              <w:right w:val="single" w:color="auto" w:sz="4" w:space="0"/>
             </w:tcBorders>
           </w:tcPr>
           <w:p>
@@ -3771,10 +4399,10 @@
           <w:tcPr>
             <w:tcW w:w="2520" w:type="dxa"/>
             <w:tcBorders>
-              <w:top w:val="single" w:sz="4" w:space="0" w:color="auto"/>
-              <w:left w:val="single" w:sz="4" w:space="0" w:color="auto"/>
-              <w:bottom w:val="single" w:sz="4" w:space="0" w:color="auto"/>
-              <w:right w:val="single" w:sz="4" w:space="0" w:color="auto"/>
+              <w:top w:val="single" w:color="auto" w:sz="4" w:space="0"/>
+              <w:left w:val="single" w:color="auto" w:sz="4" w:space="0"/>
+              <w:bottom w:val="single" w:color="auto" w:sz="4" w:space="0"/>
+              <w:right w:val="single" w:color="auto" w:sz="4" w:space="0"/>
             </w:tcBorders>
           </w:tcPr>
           <w:p>
@@ -3803,10 +4431,10 @@
           <w:tcPr>
             <w:tcW w:w="892" w:type="dxa"/>
             <w:tcBorders>
-              <w:top w:val="single" w:sz="4" w:space="0" w:color="auto"/>
-              <w:left w:val="single" w:sz="4" w:space="0" w:color="auto"/>
-              <w:bottom w:val="single" w:sz="4" w:space="0" w:color="auto"/>
-              <w:right w:val="single" w:sz="4" w:space="0" w:color="auto"/>
+              <w:top w:val="single" w:color="auto" w:sz="4" w:space="0"/>
+              <w:left w:val="single" w:color="auto" w:sz="4" w:space="0"/>
+              <w:bottom w:val="single" w:color="auto" w:sz="4" w:space="0"/>
+              <w:right w:val="single" w:color="auto" w:sz="4" w:space="0"/>
             </w:tcBorders>
           </w:tcPr>
           <w:p>
@@ -3819,7 +4447,7 @@
               <w:spacing w:line="240" w:lineRule="auto"/>
               <w:contextualSpacing/>
               <w:rPr>
-                <w:rFonts w:ascii="Times New Roman" w:eastAsia="Times New Roman" w:hAnsi="Times New Roman" w:cs="Times New Roman"/>
+                <w:rFonts w:ascii="Times New Roman" w:hAnsi="Times New Roman" w:eastAsia="Times New Roman" w:cs="Times New Roman"/>
                 <w:b/>
                 <w:bCs/>
                 <w:sz w:val="28"/>
@@ -3834,10 +4462,10 @@
           <w:tcPr>
             <w:tcW w:w="4381" w:type="dxa"/>
             <w:tcBorders>
-              <w:top w:val="single" w:sz="4" w:space="0" w:color="auto"/>
-              <w:left w:val="single" w:sz="4" w:space="0" w:color="auto"/>
-              <w:bottom w:val="single" w:sz="4" w:space="0" w:color="auto"/>
-              <w:right w:val="single" w:sz="4" w:space="0" w:color="auto"/>
+              <w:top w:val="single" w:color="auto" w:sz="4" w:space="0"/>
+              <w:left w:val="single" w:color="auto" w:sz="4" w:space="0"/>
+              <w:bottom w:val="single" w:color="auto" w:sz="4" w:space="0"/>
+              <w:right w:val="single" w:color="auto" w:sz="4" w:space="0"/>
             </w:tcBorders>
           </w:tcPr>
           <w:p>
@@ -3859,10 +4487,10 @@
           <w:tcPr>
             <w:tcW w:w="2520" w:type="dxa"/>
             <w:tcBorders>
-              <w:top w:val="single" w:sz="4" w:space="0" w:color="auto"/>
-              <w:left w:val="single" w:sz="4" w:space="0" w:color="auto"/>
-              <w:bottom w:val="single" w:sz="4" w:space="0" w:color="auto"/>
-              <w:right w:val="single" w:sz="4" w:space="0" w:color="auto"/>
+              <w:top w:val="single" w:color="auto" w:sz="4" w:space="0"/>
+              <w:left w:val="single" w:color="auto" w:sz="4" w:space="0"/>
+              <w:bottom w:val="single" w:color="auto" w:sz="4" w:space="0"/>
+              <w:right w:val="single" w:color="auto" w:sz="4" w:space="0"/>
             </w:tcBorders>
           </w:tcPr>
           <w:p>
@@ -3891,10 +4519,10 @@
           <w:tcPr>
             <w:tcW w:w="892" w:type="dxa"/>
             <w:tcBorders>
-              <w:top w:val="single" w:sz="4" w:space="0" w:color="auto"/>
-              <w:left w:val="single" w:sz="4" w:space="0" w:color="auto"/>
-              <w:bottom w:val="single" w:sz="4" w:space="0" w:color="auto"/>
-              <w:right w:val="single" w:sz="4" w:space="0" w:color="auto"/>
+              <w:top w:val="single" w:color="auto" w:sz="4" w:space="0"/>
+              <w:left w:val="single" w:color="auto" w:sz="4" w:space="0"/>
+              <w:bottom w:val="single" w:color="auto" w:sz="4" w:space="0"/>
+              <w:right w:val="single" w:color="auto" w:sz="4" w:space="0"/>
             </w:tcBorders>
           </w:tcPr>
           <w:p>
@@ -3907,7 +4535,7 @@
               <w:spacing w:line="240" w:lineRule="auto"/>
               <w:contextualSpacing/>
               <w:rPr>
-                <w:rFonts w:ascii="Times New Roman" w:eastAsia="Times New Roman" w:hAnsi="Times New Roman" w:cs="Times New Roman"/>
+                <w:rFonts w:ascii="Times New Roman" w:hAnsi="Times New Roman" w:eastAsia="Times New Roman" w:cs="Times New Roman"/>
                 <w:b/>
                 <w:bCs/>
                 <w:sz w:val="28"/>
@@ -3922,10 +4550,10 @@
           <w:tcPr>
             <w:tcW w:w="4381" w:type="dxa"/>
             <w:tcBorders>
-              <w:top w:val="single" w:sz="4" w:space="0" w:color="auto"/>
-              <w:left w:val="single" w:sz="4" w:space="0" w:color="auto"/>
-              <w:bottom w:val="single" w:sz="4" w:space="0" w:color="auto"/>
-              <w:right w:val="single" w:sz="4" w:space="0" w:color="auto"/>
+              <w:top w:val="single" w:color="auto" w:sz="4" w:space="0"/>
+              <w:left w:val="single" w:color="auto" w:sz="4" w:space="0"/>
+              <w:bottom w:val="single" w:color="auto" w:sz="4" w:space="0"/>
+              <w:right w:val="single" w:color="auto" w:sz="4" w:space="0"/>
             </w:tcBorders>
           </w:tcPr>
           <w:p>
@@ -3947,10 +4575,10 @@
           <w:tcPr>
             <w:tcW w:w="2520" w:type="dxa"/>
             <w:tcBorders>
-              <w:top w:val="single" w:sz="4" w:space="0" w:color="auto"/>
-              <w:left w:val="single" w:sz="4" w:space="0" w:color="auto"/>
-              <w:bottom w:val="single" w:sz="4" w:space="0" w:color="auto"/>
-              <w:right w:val="single" w:sz="4" w:space="0" w:color="auto"/>
+              <w:top w:val="single" w:color="auto" w:sz="4" w:space="0"/>
+              <w:left w:val="single" w:color="auto" w:sz="4" w:space="0"/>
+              <w:bottom w:val="single" w:color="auto" w:sz="4" w:space="0"/>
+              <w:right w:val="single" w:color="auto" w:sz="4" w:space="0"/>
             </w:tcBorders>
           </w:tcPr>
           <w:p>
@@ -3979,10 +4607,10 @@
           <w:tcPr>
             <w:tcW w:w="892" w:type="dxa"/>
             <w:tcBorders>
-              <w:top w:val="single" w:sz="4" w:space="0" w:color="auto"/>
-              <w:left w:val="single" w:sz="4" w:space="0" w:color="auto"/>
-              <w:bottom w:val="single" w:sz="4" w:space="0" w:color="auto"/>
-              <w:right w:val="single" w:sz="4" w:space="0" w:color="auto"/>
+              <w:top w:val="single" w:color="auto" w:sz="4" w:space="0"/>
+              <w:left w:val="single" w:color="auto" w:sz="4" w:space="0"/>
+              <w:bottom w:val="single" w:color="auto" w:sz="4" w:space="0"/>
+              <w:right w:val="single" w:color="auto" w:sz="4" w:space="0"/>
             </w:tcBorders>
           </w:tcPr>
           <w:p>
@@ -3995,7 +4623,7 @@
               <w:spacing w:line="240" w:lineRule="auto"/>
               <w:contextualSpacing/>
               <w:rPr>
-                <w:rFonts w:ascii="Times New Roman" w:eastAsia="Times New Roman" w:hAnsi="Times New Roman" w:cs="Times New Roman"/>
+                <w:rFonts w:ascii="Times New Roman" w:hAnsi="Times New Roman" w:eastAsia="Times New Roman" w:cs="Times New Roman"/>
                 <w:b/>
                 <w:bCs/>
                 <w:sz w:val="28"/>
@@ -4010,10 +4638,10 @@
           <w:tcPr>
             <w:tcW w:w="4381" w:type="dxa"/>
             <w:tcBorders>
-              <w:top w:val="single" w:sz="4" w:space="0" w:color="auto"/>
-              <w:left w:val="single" w:sz="4" w:space="0" w:color="auto"/>
-              <w:bottom w:val="single" w:sz="4" w:space="0" w:color="auto"/>
-              <w:right w:val="single" w:sz="4" w:space="0" w:color="auto"/>
+              <w:top w:val="single" w:color="auto" w:sz="4" w:space="0"/>
+              <w:left w:val="single" w:color="auto" w:sz="4" w:space="0"/>
+              <w:bottom w:val="single" w:color="auto" w:sz="4" w:space="0"/>
+              <w:right w:val="single" w:color="auto" w:sz="4" w:space="0"/>
             </w:tcBorders>
           </w:tcPr>
           <w:p>
@@ -4035,10 +4663,10 @@
           <w:tcPr>
             <w:tcW w:w="2520" w:type="dxa"/>
             <w:tcBorders>
-              <w:top w:val="single" w:sz="4" w:space="0" w:color="auto"/>
-              <w:left w:val="single" w:sz="4" w:space="0" w:color="auto"/>
-              <w:bottom w:val="single" w:sz="4" w:space="0" w:color="auto"/>
-              <w:right w:val="single" w:sz="4" w:space="0" w:color="auto"/>
+              <w:top w:val="single" w:color="auto" w:sz="4" w:space="0"/>
+              <w:left w:val="single" w:color="auto" w:sz="4" w:space="0"/>
+              <w:bottom w:val="single" w:color="auto" w:sz="4" w:space="0"/>
+              <w:right w:val="single" w:color="auto" w:sz="4" w:space="0"/>
             </w:tcBorders>
           </w:tcPr>
           <w:p>
@@ -4068,10 +4696,10 @@
             <w:tcW w:w="5273" w:type="dxa"/>
             <w:gridSpan w:val="2"/>
             <w:tcBorders>
-              <w:top w:val="single" w:sz="4" w:space="0" w:color="auto"/>
-              <w:left w:val="single" w:sz="4" w:space="0" w:color="auto"/>
-              <w:bottom w:val="single" w:sz="4" w:space="0" w:color="auto"/>
-              <w:right w:val="single" w:sz="4" w:space="0" w:color="auto"/>
+              <w:top w:val="single" w:color="auto" w:sz="4" w:space="0"/>
+              <w:left w:val="single" w:color="auto" w:sz="4" w:space="0"/>
+              <w:bottom w:val="single" w:color="auto" w:sz="4" w:space="0"/>
+              <w:right w:val="single" w:color="auto" w:sz="4" w:space="0"/>
             </w:tcBorders>
             <w:hideMark/>
           </w:tcPr>
@@ -4081,7 +4709,7 @@
               <w:spacing w:after="0" w:line="240" w:lineRule="auto"/>
               <w:jc w:val="right"/>
               <w:rPr>
-                <w:rFonts w:ascii="Times New Roman" w:eastAsia="Times New Roman" w:hAnsi="Times New Roman" w:cs="Times New Roman"/>
+                <w:rFonts w:ascii="Times New Roman" w:hAnsi="Times New Roman" w:eastAsia="Times New Roman" w:cs="Times New Roman"/>
                 <w:b/>
                 <w:bCs/>
                 <w:sz w:val="28"/>
@@ -4092,7 +4720,7 @@
             </w:pPr>
             <w:r>
               <w:rPr>
-                <w:rFonts w:ascii="Times New Roman" w:eastAsia="Times New Roman" w:hAnsi="Times New Roman" w:cs="Times New Roman"/>
+                <w:rFonts w:ascii="Times New Roman" w:hAnsi="Times New Roman" w:eastAsia="Times New Roman" w:cs="Times New Roman"/>
                 <w:b/>
                 <w:bCs/>
                 <w:color w:val="FF0000"/>
@@ -4105,7 +4733,7 @@
             </w:r>
             <w:r>
               <w:rPr>
-                <w:rFonts w:ascii="Times New Roman" w:eastAsia="Times New Roman" w:hAnsi="Times New Roman" w:cs="Times New Roman"/>
+                <w:rFonts w:ascii="Times New Roman" w:hAnsi="Times New Roman" w:eastAsia="Times New Roman" w:cs="Times New Roman"/>
                 <w:b/>
                 <w:bCs/>
                 <w:color w:val="FF0000"/>
@@ -4117,7 +4745,7 @@
             </w:r>
             <w:r>
               <w:rPr>
-                <w:rFonts w:ascii="Times New Roman" w:eastAsia="Times New Roman" w:hAnsi="Times New Roman" w:cs="Times New Roman"/>
+                <w:rFonts w:ascii="Times New Roman" w:hAnsi="Times New Roman" w:eastAsia="Times New Roman" w:cs="Times New Roman"/>
                 <w:b/>
                 <w:bCs/>
                 <w:color w:val="FF0000"/>
@@ -4134,10 +4762,10 @@
           <w:tcPr>
             <w:tcW w:w="2520" w:type="dxa"/>
             <w:tcBorders>
-              <w:top w:val="single" w:sz="4" w:space="0" w:color="auto"/>
-              <w:left w:val="single" w:sz="4" w:space="0" w:color="auto"/>
-              <w:bottom w:val="single" w:sz="4" w:space="0" w:color="auto"/>
-              <w:right w:val="single" w:sz="4" w:space="0" w:color="auto"/>
+              <w:top w:val="single" w:color="auto" w:sz="4" w:space="0"/>
+              <w:left w:val="single" w:color="auto" w:sz="4" w:space="0"/>
+              <w:bottom w:val="single" w:color="auto" w:sz="4" w:space="0"/>
+              <w:right w:val="single" w:color="auto" w:sz="4" w:space="0"/>
             </w:tcBorders>
             <w:hideMark/>
           </w:tcPr>
@@ -4151,7 +4779,7 @@
               <w:ind w:left="34"/>
               <w:jc w:val="center"/>
               <w:rPr>
-                <w:rFonts w:ascii="Times New Roman" w:eastAsia="Times New Roman" w:hAnsi="Times New Roman" w:cs="Times New Roman"/>
+                <w:rFonts w:ascii="Times New Roman" w:hAnsi="Times New Roman" w:eastAsia="Times New Roman" w:cs="Times New Roman"/>
                 <w:b/>
                 <w:bCs/>
                 <w:color w:val="FF0000"/>
@@ -4164,7 +4792,7 @@
             </w:pPr>
             <w:r>
               <w:rPr>
-                <w:rFonts w:ascii="Times New Roman" w:eastAsia="Times New Roman" w:hAnsi="Times New Roman" w:cs="Times New Roman"/>
+                <w:rFonts w:ascii="Times New Roman" w:hAnsi="Times New Roman" w:eastAsia="Times New Roman" w:cs="Times New Roman"/>
                 <w:b/>
                 <w:bCs/>
                 <w:color w:val="FF0000"/>
@@ -4178,7 +4806,7 @@
             </w:r>
             <w:r>
               <w:rPr>
-                <w:rFonts w:ascii="Times New Roman" w:eastAsia="Times New Roman" w:hAnsi="Times New Roman" w:cs="Times New Roman"/>
+                <w:rFonts w:ascii="Times New Roman" w:hAnsi="Times New Roman" w:eastAsia="Times New Roman" w:cs="Times New Roman"/>
                 <w:b/>
                 <w:bCs/>
                 <w:sz w:val="28"/>
@@ -4506,7 +5134,7 @@
       </w:r>
       <w:r>
         <w:rPr>
-          <w:rFonts w:asciiTheme="minorBidi" w:hAnsiTheme="minorBidi" w:hint="cs"/>
+          <w:rFonts w:hint="cs" w:asciiTheme="minorBidi" w:hAnsiTheme="minorBidi"/>
           <w:b/>
           <w:bCs/>
           <w:sz w:val="17"/>
@@ -4640,10 +5268,10 @@
           <w:tcPr>
             <w:tcW w:w="850" w:type="dxa"/>
             <w:tcBorders>
-              <w:top w:val="single" w:sz="4" w:space="0" w:color="auto"/>
-              <w:left w:val="single" w:sz="4" w:space="0" w:color="auto"/>
-              <w:bottom w:val="single" w:sz="4" w:space="0" w:color="auto"/>
-              <w:right w:val="single" w:sz="4" w:space="0" w:color="auto"/>
+              <w:top w:val="single" w:color="auto" w:sz="4" w:space="0"/>
+              <w:left w:val="single" w:color="auto" w:sz="4" w:space="0"/>
+              <w:bottom w:val="single" w:color="auto" w:sz="4" w:space="0"/>
+              <w:right w:val="single" w:color="auto" w:sz="4" w:space="0"/>
             </w:tcBorders>
             <w:vAlign w:val="center"/>
             <w:hideMark/>
@@ -4674,10 +5302,10 @@
           <w:tcPr>
             <w:tcW w:w="851" w:type="dxa"/>
             <w:tcBorders>
-              <w:top w:val="single" w:sz="4" w:space="0" w:color="auto"/>
-              <w:left w:val="single" w:sz="4" w:space="0" w:color="auto"/>
-              <w:bottom w:val="single" w:sz="4" w:space="0" w:color="auto"/>
-              <w:right w:val="single" w:sz="4" w:space="0" w:color="auto"/>
+              <w:top w:val="single" w:color="auto" w:sz="4" w:space="0"/>
+              <w:left w:val="single" w:color="auto" w:sz="4" w:space="0"/>
+              <w:bottom w:val="single" w:color="auto" w:sz="4" w:space="0"/>
+              <w:right w:val="single" w:color="auto" w:sz="4" w:space="0"/>
             </w:tcBorders>
             <w:vAlign w:val="center"/>
             <w:hideMark/>
@@ -4778,12 +5406,12 @@
         <w:tblW w:w="9487" w:type="dxa"/>
         <w:jc w:val="center"/>
         <w:tblBorders>
-          <w:top w:val="single" w:sz="4" w:space="0" w:color="auto"/>
-          <w:left w:val="single" w:sz="4" w:space="0" w:color="auto"/>
-          <w:bottom w:val="single" w:sz="4" w:space="0" w:color="auto"/>
-          <w:right w:val="single" w:sz="4" w:space="0" w:color="auto"/>
-          <w:insideH w:val="single" w:sz="4" w:space="0" w:color="auto"/>
-          <w:insideV w:val="single" w:sz="4" w:space="0" w:color="auto"/>
+          <w:top w:val="single" w:color="auto" w:sz="4" w:space="0"/>
+          <w:left w:val="single" w:color="auto" w:sz="4" w:space="0"/>
+          <w:bottom w:val="single" w:color="auto" w:sz="4" w:space="0"/>
+          <w:right w:val="single" w:color="auto" w:sz="4" w:space="0"/>
+          <w:insideH w:val="single" w:color="auto" w:sz="4" w:space="0"/>
+          <w:insideV w:val="single" w:color="auto" w:sz="4" w:space="0"/>
         </w:tblBorders>
         <w:tblLook w:val="04A0" w:firstRow="1" w:lastRow="0" w:firstColumn="1" w:lastColumn="0" w:noHBand="0" w:noVBand="1"/>
       </w:tblPr>
@@ -4801,10 +5429,10 @@
           <w:tcPr>
             <w:tcW w:w="2204" w:type="dxa"/>
             <w:tcBorders>
-              <w:top w:val="single" w:sz="4" w:space="0" w:color="auto"/>
-              <w:left w:val="single" w:sz="4" w:space="0" w:color="auto"/>
-              <w:bottom w:val="single" w:sz="4" w:space="0" w:color="auto"/>
-              <w:right w:val="single" w:sz="4" w:space="0" w:color="auto"/>
+              <w:top w:val="single" w:color="auto" w:sz="4" w:space="0"/>
+              <w:left w:val="single" w:color="auto" w:sz="4" w:space="0"/>
+              <w:bottom w:val="single" w:color="auto" w:sz="4" w:space="0"/>
+              <w:right w:val="single" w:color="auto" w:sz="4" w:space="0"/>
             </w:tcBorders>
             <w:hideMark/>
           </w:tcPr>
@@ -4839,10 +5467,10 @@
           <w:tcPr>
             <w:tcW w:w="2488" w:type="dxa"/>
             <w:tcBorders>
-              <w:top w:val="single" w:sz="4" w:space="0" w:color="auto"/>
-              <w:left w:val="single" w:sz="4" w:space="0" w:color="auto"/>
-              <w:bottom w:val="single" w:sz="4" w:space="0" w:color="auto"/>
-              <w:right w:val="single" w:sz="4" w:space="0" w:color="auto"/>
+              <w:top w:val="single" w:color="auto" w:sz="4" w:space="0"/>
+              <w:left w:val="single" w:color="auto" w:sz="4" w:space="0"/>
+              <w:bottom w:val="single" w:color="auto" w:sz="4" w:space="0"/>
+              <w:right w:val="single" w:color="auto" w:sz="4" w:space="0"/>
             </w:tcBorders>
             <w:hideMark/>
           </w:tcPr>
@@ -4878,10 +5506,10 @@
           <w:tcPr>
             <w:tcW w:w="4795" w:type="dxa"/>
             <w:tcBorders>
-              <w:top w:val="single" w:sz="4" w:space="0" w:color="auto"/>
-              <w:left w:val="single" w:sz="4" w:space="0" w:color="auto"/>
-              <w:bottom w:val="single" w:sz="4" w:space="0" w:color="auto"/>
-              <w:right w:val="single" w:sz="4" w:space="0" w:color="auto"/>
+              <w:top w:val="single" w:color="auto" w:sz="4" w:space="0"/>
+              <w:left w:val="single" w:color="auto" w:sz="4" w:space="0"/>
+              <w:bottom w:val="single" w:color="auto" w:sz="4" w:space="0"/>
+              <w:right w:val="single" w:color="auto" w:sz="4" w:space="0"/>
             </w:tcBorders>
             <w:hideMark/>
           </w:tcPr>
@@ -4923,10 +5551,10 @@
           <w:tcPr>
             <w:tcW w:w="2204" w:type="dxa"/>
             <w:tcBorders>
-              <w:top w:val="single" w:sz="4" w:space="0" w:color="auto"/>
-              <w:left w:val="single" w:sz="4" w:space="0" w:color="auto"/>
-              <w:bottom w:val="single" w:sz="4" w:space="0" w:color="auto"/>
-              <w:right w:val="single" w:sz="4" w:space="0" w:color="auto"/>
+              <w:top w:val="single" w:color="auto" w:sz="4" w:space="0"/>
+              <w:left w:val="single" w:color="auto" w:sz="4" w:space="0"/>
+              <w:bottom w:val="single" w:color="auto" w:sz="4" w:space="0"/>
+              <w:right w:val="single" w:color="auto" w:sz="4" w:space="0"/>
             </w:tcBorders>
           </w:tcPr>
           <w:p>
@@ -4949,10 +5577,10 @@
           <w:tcPr>
             <w:tcW w:w="2488" w:type="dxa"/>
             <w:tcBorders>
-              <w:top w:val="single" w:sz="4" w:space="0" w:color="auto"/>
-              <w:left w:val="single" w:sz="4" w:space="0" w:color="auto"/>
-              <w:bottom w:val="single" w:sz="4" w:space="0" w:color="auto"/>
-              <w:right w:val="single" w:sz="4" w:space="0" w:color="auto"/>
+              <w:top w:val="single" w:color="auto" w:sz="4" w:space="0"/>
+              <w:left w:val="single" w:color="auto" w:sz="4" w:space="0"/>
+              <w:bottom w:val="single" w:color="auto" w:sz="4" w:space="0"/>
+              <w:right w:val="single" w:color="auto" w:sz="4" w:space="0"/>
             </w:tcBorders>
           </w:tcPr>
           <w:p>
@@ -4974,10 +5602,10 @@
           <w:tcPr>
             <w:tcW w:w="4795" w:type="dxa"/>
             <w:tcBorders>
-              <w:top w:val="single" w:sz="4" w:space="0" w:color="auto"/>
-              <w:left w:val="single" w:sz="4" w:space="0" w:color="auto"/>
-              <w:bottom w:val="single" w:sz="4" w:space="0" w:color="auto"/>
-              <w:right w:val="single" w:sz="4" w:space="0" w:color="auto"/>
+              <w:top w:val="single" w:color="auto" w:sz="4" w:space="0"/>
+              <w:left w:val="single" w:color="auto" w:sz="4" w:space="0"/>
+              <w:bottom w:val="single" w:color="auto" w:sz="4" w:space="0"/>
+              <w:right w:val="single" w:color="auto" w:sz="4" w:space="0"/>
             </w:tcBorders>
           </w:tcPr>
           <w:p>
@@ -5128,7 +5756,7 @@
       <w:footerReference w:type="default" r:id="rId11"/>
       <w:headerReference w:type="first" r:id="rId12"/>
       <w:footerReference w:type="first" r:id="rId13"/>
-      <w:pgSz w:w="11906" w:h="16838" w:code="9"/>
+      <w:pgSz w:w="11906" w:h="16838" w:orient="portrait" w:code="9"/>
       <w:pgMar w:top="720" w:right="720" w:bottom="720" w:left="720" w:header="576" w:footer="144" w:gutter="0"/>
       <w:cols w:space="720"/>
       <w:docGrid w:linePitch="360"/>
@@ -5163,7 +5791,7 @@
 </file>
 
 <file path=word/footer1.xml><?xml version="1.0" encoding="utf-8"?>
-<w:ftr xmlns:wpc="http://schemas.microsoft.com/office/word/2010/wordprocessingCanvas" xmlns:cx="http://schemas.microsoft.com/office/drawing/2014/chartex" xmlns:cx1="http://schemas.microsoft.com/office/drawing/2015/9/8/chartex" xmlns:cx2="http://schemas.microsoft.com/office/drawing/2015/10/21/chartex" xmlns:cx3="http://schemas.microsoft.com/office/drawing/2016/5/9/chartex" xmlns:cx4="http://schemas.microsoft.com/office/drawing/2016/5/10/chartex" xmlns:cx5="http://schemas.microsoft.com/office/drawing/2016/5/11/chartex" xmlns:cx6="http://schemas.microsoft.com/office/drawing/2016/5/12/chartex" xmlns:cx7="http://schemas.microsoft.com/office/drawing/2016/5/13/chartex" xmlns:cx8="http://schemas.microsoft.com/office/drawing/2016/5/14/chartex" xmlns:mc="http://schemas.openxmlformats.org/markup-compatibility/2006" xmlns:aink="http://schemas.microsoft.com/office/drawing/2016/ink" xmlns:am3d="http://schemas.microsoft.com/office/drawing/2017/model3d" xmlns:o="urn:schemas-microsoft-com:office:office" xmlns:r="http://schemas.openxmlformats.org/officeDocument/2006/relationships" xmlns:m="http://schemas.openxmlformats.org/officeDocument/2006/math" xmlns:v="urn:schemas-microsoft-com:vml" xmlns:wp14="http://schemas.microsoft.com/office/word/2010/wordprocessingDrawing" xmlns:wp="http://schemas.openxmlformats.org/drawingml/2006/wordprocessingDrawing" xmlns:w10="urn:schemas-microsoft-com:office:word" xmlns:w="http://schemas.openxmlformats.org/wordprocessingml/2006/main" xmlns:w14="http://schemas.microsoft.com/office/word/2010/wordml" xmlns:w15="http://schemas.microsoft.com/office/word/2012/wordml" xmlns:w16cid="http://schemas.microsoft.com/office/word/2016/wordml/cid" xmlns:w16se="http://schemas.microsoft.com/office/word/2015/wordml/symex" xmlns:wpg="http://schemas.microsoft.com/office/word/2010/wordprocessingGroup" xmlns:wpi="http://schemas.microsoft.com/office/word/2010/wordprocessingInk" xmlns:wne="http://schemas.microsoft.com/office/word/2006/wordml" xmlns:wps="http://schemas.microsoft.com/office/word/2010/wordprocessingShape" mc:Ignorable="w14 w15 w16se w16cid wp14">
+<w:ftr xmlns:wpc="http://schemas.microsoft.com/office/word/2010/wordprocessingCanvas" xmlns:cx="http://schemas.microsoft.com/office/drawing/2014/chartex" xmlns:cx1="http://schemas.microsoft.com/office/drawing/2015/9/8/chartex" xmlns:cx2="http://schemas.microsoft.com/office/drawing/2015/10/21/chartex" xmlns:cx3="http://schemas.microsoft.com/office/drawing/2016/5/9/chartex" xmlns:cx4="http://schemas.microsoft.com/office/drawing/2016/5/10/chartex" xmlns:cx5="http://schemas.microsoft.com/office/drawing/2016/5/11/chartex" xmlns:cx6="http://schemas.microsoft.com/office/drawing/2016/5/12/chartex" xmlns:cx7="http://schemas.microsoft.com/office/drawing/2016/5/13/chartex" xmlns:cx8="http://schemas.microsoft.com/office/drawing/2016/5/14/chartex" xmlns:mc="http://schemas.openxmlformats.org/markup-compatibility/2006" xmlns:aink="http://schemas.microsoft.com/office/drawing/2016/ink" xmlns:am3d="http://schemas.microsoft.com/office/drawing/2017/model3d" xmlns:o="urn:schemas-microsoft-com:office:office" xmlns:r="http://schemas.openxmlformats.org/officeDocument/2006/relationships" xmlns:m="http://schemas.openxmlformats.org/officeDocument/2006/math" xmlns:v="urn:schemas-microsoft-com:vml" xmlns:wp14="http://schemas.microsoft.com/office/word/2010/wordprocessingDrawing" xmlns:wp="http://schemas.openxmlformats.org/drawingml/2006/wordprocessingDrawing" xmlns:w10="urn:schemas-microsoft-com:office:word" xmlns:w="http://schemas.openxmlformats.org/wordprocessingml/2006/main" xmlns:w14="http://schemas.microsoft.com/office/word/2010/wordml" xmlns:w15="http://schemas.microsoft.com/office/word/2012/wordml" xmlns:w16cid="http://schemas.microsoft.com/office/word/2016/wordml/cid" xmlns:w16se="http://schemas.microsoft.com/office/word/2015/wordml/symex" xmlns:wpg="http://schemas.microsoft.com/office/word/2010/wordprocessingGroup" xmlns:wpi="http://schemas.microsoft.com/office/word/2010/wordprocessingInk" xmlns:wne="http://schemas.microsoft.com/office/word/2006/wordml" xmlns:wps="http://schemas.microsoft.com/office/word/2010/wordprocessingShape" xmlns:a="http://schemas.openxmlformats.org/drawingml/2006/main" xmlns:pic="http://schemas.openxmlformats.org/drawingml/2006/picture" xmlns:a14="http://schemas.microsoft.com/office/drawing/2010/main" mc:Ignorable="w14 w15 w16se w16cid wp14">
   <w:p>
     <w:pPr>
       <w:pStyle w:val="Footer"/>
@@ -5227,7 +5855,7 @@
 </file>
 
 <file path=word/footer2.xml><?xml version="1.0" encoding="utf-8"?>
-<w:ftr xmlns:wpc="http://schemas.microsoft.com/office/word/2010/wordprocessingCanvas" xmlns:cx="http://schemas.microsoft.com/office/drawing/2014/chartex" xmlns:cx1="http://schemas.microsoft.com/office/drawing/2015/9/8/chartex" xmlns:cx2="http://schemas.microsoft.com/office/drawing/2015/10/21/chartex" xmlns:cx3="http://schemas.microsoft.com/office/drawing/2016/5/9/chartex" xmlns:cx4="http://schemas.microsoft.com/office/drawing/2016/5/10/chartex" xmlns:cx5="http://schemas.microsoft.com/office/drawing/2016/5/11/chartex" xmlns:cx6="http://schemas.microsoft.com/office/drawing/2016/5/12/chartex" xmlns:cx7="http://schemas.microsoft.com/office/drawing/2016/5/13/chartex" xmlns:cx8="http://schemas.microsoft.com/office/drawing/2016/5/14/chartex" xmlns:mc="http://schemas.openxmlformats.org/markup-compatibility/2006" xmlns:aink="http://schemas.microsoft.com/office/drawing/2016/ink" xmlns:am3d="http://schemas.microsoft.com/office/drawing/2017/model3d" xmlns:o="urn:schemas-microsoft-com:office:office" xmlns:r="http://schemas.openxmlformats.org/officeDocument/2006/relationships" xmlns:m="http://schemas.openxmlformats.org/officeDocument/2006/math" xmlns:v="urn:schemas-microsoft-com:vml" xmlns:wp14="http://schemas.microsoft.com/office/word/2010/wordprocessingDrawing" xmlns:wp="http://schemas.openxmlformats.org/drawingml/2006/wordprocessingDrawing" xmlns:w10="urn:schemas-microsoft-com:office:word" xmlns:w="http://schemas.openxmlformats.org/wordprocessingml/2006/main" xmlns:w14="http://schemas.microsoft.com/office/word/2010/wordml" xmlns:w15="http://schemas.microsoft.com/office/word/2012/wordml" xmlns:w16cid="http://schemas.microsoft.com/office/word/2016/wordml/cid" xmlns:w16se="http://schemas.microsoft.com/office/word/2015/wordml/symex" xmlns:wpg="http://schemas.microsoft.com/office/word/2010/wordprocessingGroup" xmlns:wpi="http://schemas.microsoft.com/office/word/2010/wordprocessingInk" xmlns:wne="http://schemas.microsoft.com/office/word/2006/wordml" xmlns:wps="http://schemas.microsoft.com/office/word/2010/wordprocessingShape" mc:Ignorable="w14 w15 w16se w16cid wp14">
+<w:ftr xmlns:wpc="http://schemas.microsoft.com/office/word/2010/wordprocessingCanvas" xmlns:cx="http://schemas.microsoft.com/office/drawing/2014/chartex" xmlns:cx1="http://schemas.microsoft.com/office/drawing/2015/9/8/chartex" xmlns:cx2="http://schemas.microsoft.com/office/drawing/2015/10/21/chartex" xmlns:cx3="http://schemas.microsoft.com/office/drawing/2016/5/9/chartex" xmlns:cx4="http://schemas.microsoft.com/office/drawing/2016/5/10/chartex" xmlns:cx5="http://schemas.microsoft.com/office/drawing/2016/5/11/chartex" xmlns:cx6="http://schemas.microsoft.com/office/drawing/2016/5/12/chartex" xmlns:cx7="http://schemas.microsoft.com/office/drawing/2016/5/13/chartex" xmlns:cx8="http://schemas.microsoft.com/office/drawing/2016/5/14/chartex" xmlns:mc="http://schemas.openxmlformats.org/markup-compatibility/2006" xmlns:aink="http://schemas.microsoft.com/office/drawing/2016/ink" xmlns:am3d="http://schemas.microsoft.com/office/drawing/2017/model3d" xmlns:o="urn:schemas-microsoft-com:office:office" xmlns:r="http://schemas.openxmlformats.org/officeDocument/2006/relationships" xmlns:m="http://schemas.openxmlformats.org/officeDocument/2006/math" xmlns:v="urn:schemas-microsoft-com:vml" xmlns:wp14="http://schemas.microsoft.com/office/word/2010/wordprocessingDrawing" xmlns:wp="http://schemas.openxmlformats.org/drawingml/2006/wordprocessingDrawing" xmlns:w10="urn:schemas-microsoft-com:office:word" xmlns:w="http://schemas.openxmlformats.org/wordprocessingml/2006/main" xmlns:w14="http://schemas.microsoft.com/office/word/2010/wordml" xmlns:w15="http://schemas.microsoft.com/office/word/2012/wordml" xmlns:w16cid="http://schemas.microsoft.com/office/word/2016/wordml/cid" xmlns:w16se="http://schemas.microsoft.com/office/word/2015/wordml/symex" xmlns:wpg="http://schemas.microsoft.com/office/word/2010/wordprocessingGroup" xmlns:wpi="http://schemas.microsoft.com/office/word/2010/wordprocessingInk" xmlns:wne="http://schemas.microsoft.com/office/word/2006/wordml" xmlns:wps="http://schemas.microsoft.com/office/word/2010/wordprocessingShape" xmlns:a="http://schemas.openxmlformats.org/drawingml/2006/main" xmlns:pic="http://schemas.openxmlformats.org/drawingml/2006/picture" xmlns:a14="http://schemas.microsoft.com/office/drawing/2010/main" mc:Ignorable="w14 w15 w16se w16cid wp14">
   <w:p>
     <w:pPr>
       <w:pStyle w:val="Footer"/>
@@ -5290,7 +5918,7 @@
 </file>
 
 <file path=word/footer3.xml><?xml version="1.0" encoding="utf-8"?>
-<w:ftr xmlns:wpc="http://schemas.microsoft.com/office/word/2010/wordprocessingCanvas" xmlns:cx="http://schemas.microsoft.com/office/drawing/2014/chartex" xmlns:cx1="http://schemas.microsoft.com/office/drawing/2015/9/8/chartex" xmlns:cx2="http://schemas.microsoft.com/office/drawing/2015/10/21/chartex" xmlns:cx3="http://schemas.microsoft.com/office/drawing/2016/5/9/chartex" xmlns:cx4="http://schemas.microsoft.com/office/drawing/2016/5/10/chartex" xmlns:cx5="http://schemas.microsoft.com/office/drawing/2016/5/11/chartex" xmlns:cx6="http://schemas.microsoft.com/office/drawing/2016/5/12/chartex" xmlns:cx7="http://schemas.microsoft.com/office/drawing/2016/5/13/chartex" xmlns:cx8="http://schemas.microsoft.com/office/drawing/2016/5/14/chartex" xmlns:mc="http://schemas.openxmlformats.org/markup-compatibility/2006" xmlns:aink="http://schemas.microsoft.com/office/drawing/2016/ink" xmlns:am3d="http://schemas.microsoft.com/office/drawing/2017/model3d" xmlns:o="urn:schemas-microsoft-com:office:office" xmlns:r="http://schemas.openxmlformats.org/officeDocument/2006/relationships" xmlns:m="http://schemas.openxmlformats.org/officeDocument/2006/math" xmlns:v="urn:schemas-microsoft-com:vml" xmlns:wp14="http://schemas.microsoft.com/office/word/2010/wordprocessingDrawing" xmlns:wp="http://schemas.openxmlformats.org/drawingml/2006/wordprocessingDrawing" xmlns:w10="urn:schemas-microsoft-com:office:word" xmlns:w="http://schemas.openxmlformats.org/wordprocessingml/2006/main" xmlns:w14="http://schemas.microsoft.com/office/word/2010/wordml" xmlns:w15="http://schemas.microsoft.com/office/word/2012/wordml" xmlns:w16cid="http://schemas.microsoft.com/office/word/2016/wordml/cid" xmlns:w16se="http://schemas.microsoft.com/office/word/2015/wordml/symex" xmlns:wpg="http://schemas.microsoft.com/office/word/2010/wordprocessingGroup" xmlns:wpi="http://schemas.microsoft.com/office/word/2010/wordprocessingInk" xmlns:wne="http://schemas.microsoft.com/office/word/2006/wordml" xmlns:wps="http://schemas.microsoft.com/office/word/2010/wordprocessingShape" mc:Ignorable="w14 w15 w16se w16cid wp14">
+<w:ftr xmlns:wpc="http://schemas.microsoft.com/office/word/2010/wordprocessingCanvas" xmlns:cx="http://schemas.microsoft.com/office/drawing/2014/chartex" xmlns:cx1="http://schemas.microsoft.com/office/drawing/2015/9/8/chartex" xmlns:cx2="http://schemas.microsoft.com/office/drawing/2015/10/21/chartex" xmlns:cx3="http://schemas.microsoft.com/office/drawing/2016/5/9/chartex" xmlns:cx4="http://schemas.microsoft.com/office/drawing/2016/5/10/chartex" xmlns:cx5="http://schemas.microsoft.com/office/drawing/2016/5/11/chartex" xmlns:cx6="http://schemas.microsoft.com/office/drawing/2016/5/12/chartex" xmlns:cx7="http://schemas.microsoft.com/office/drawing/2016/5/13/chartex" xmlns:cx8="http://schemas.microsoft.com/office/drawing/2016/5/14/chartex" xmlns:mc="http://schemas.openxmlformats.org/markup-compatibility/2006" xmlns:aink="http://schemas.microsoft.com/office/drawing/2016/ink" xmlns:am3d="http://schemas.microsoft.com/office/drawing/2017/model3d" xmlns:o="urn:schemas-microsoft-com:office:office" xmlns:r="http://schemas.openxmlformats.org/officeDocument/2006/relationships" xmlns:m="http://schemas.openxmlformats.org/officeDocument/2006/math" xmlns:v="urn:schemas-microsoft-com:vml" xmlns:wp14="http://schemas.microsoft.com/office/word/2010/wordprocessingDrawing" xmlns:wp="http://schemas.openxmlformats.org/drawingml/2006/wordprocessingDrawing" xmlns:w10="urn:schemas-microsoft-com:office:word" xmlns:w="http://schemas.openxmlformats.org/wordprocessingml/2006/main" xmlns:w14="http://schemas.microsoft.com/office/word/2010/wordml" xmlns:w15="http://schemas.microsoft.com/office/word/2012/wordml" xmlns:w16cid="http://schemas.microsoft.com/office/word/2016/wordml/cid" xmlns:w16se="http://schemas.microsoft.com/office/word/2015/wordml/symex" xmlns:wpg="http://schemas.microsoft.com/office/word/2010/wordprocessingGroup" xmlns:wpi="http://schemas.microsoft.com/office/word/2010/wordprocessingInk" xmlns:wne="http://schemas.microsoft.com/office/word/2006/wordml" xmlns:wps="http://schemas.microsoft.com/office/word/2010/wordprocessingShape" xmlns:a="http://schemas.openxmlformats.org/drawingml/2006/main" xmlns:pic="http://schemas.openxmlformats.org/drawingml/2006/picture" xmlns:a14="http://schemas.microsoft.com/office/drawing/2010/main" mc:Ignorable="w14 w15 w16se w16cid wp14">
   <w:p>
     <w:pPr>
       <w:pStyle w:val="Footer"/>
@@ -5393,7 +6021,7 @@
 </file>
 
 <file path=word/header1.xml><?xml version="1.0" encoding="utf-8"?>
-<w:hdr xmlns:wpc="http://schemas.microsoft.com/office/word/2010/wordprocessingCanvas" xmlns:cx="http://schemas.microsoft.com/office/drawing/2014/chartex" xmlns:cx1="http://schemas.microsoft.com/office/drawing/2015/9/8/chartex" xmlns:cx2="http://schemas.microsoft.com/office/drawing/2015/10/21/chartex" xmlns:cx3="http://schemas.microsoft.com/office/drawing/2016/5/9/chartex" xmlns:cx4="http://schemas.microsoft.com/office/drawing/2016/5/10/chartex" xmlns:cx5="http://schemas.microsoft.com/office/drawing/2016/5/11/chartex" xmlns:cx6="http://schemas.microsoft.com/office/drawing/2016/5/12/chartex" xmlns:cx7="http://schemas.microsoft.com/office/drawing/2016/5/13/chartex" xmlns:cx8="http://schemas.microsoft.com/office/drawing/2016/5/14/chartex" xmlns:mc="http://schemas.openxmlformats.org/markup-compatibility/2006" xmlns:aink="http://schemas.microsoft.com/office/drawing/2016/ink" xmlns:am3d="http://schemas.microsoft.com/office/drawing/2017/model3d" xmlns:o="urn:schemas-microsoft-com:office:office" xmlns:r="http://schemas.openxmlformats.org/officeDocument/2006/relationships" xmlns:m="http://schemas.openxmlformats.org/officeDocument/2006/math" xmlns:v="urn:schemas-microsoft-com:vml" xmlns:wp14="http://schemas.microsoft.com/office/word/2010/wordprocessingDrawing" xmlns:wp="http://schemas.openxmlformats.org/drawingml/2006/wordprocessingDrawing" xmlns:w10="urn:schemas-microsoft-com:office:word" xmlns:w="http://schemas.openxmlformats.org/wordprocessingml/2006/main" xmlns:w14="http://schemas.microsoft.com/office/word/2010/wordml" xmlns:w15="http://schemas.microsoft.com/office/word/2012/wordml" xmlns:w16cid="http://schemas.microsoft.com/office/word/2016/wordml/cid" xmlns:w16se="http://schemas.microsoft.com/office/word/2015/wordml/symex" xmlns:wpg="http://schemas.microsoft.com/office/word/2010/wordprocessingGroup" xmlns:wpi="http://schemas.microsoft.com/office/word/2010/wordprocessingInk" xmlns:wne="http://schemas.microsoft.com/office/word/2006/wordml" xmlns:wps="http://schemas.microsoft.com/office/word/2010/wordprocessingShape" mc:Ignorable="w14 w15 w16se w16cid wp14">
+<w:hdr xmlns:wpc="http://schemas.microsoft.com/office/word/2010/wordprocessingCanvas" xmlns:cx="http://schemas.microsoft.com/office/drawing/2014/chartex" xmlns:cx1="http://schemas.microsoft.com/office/drawing/2015/9/8/chartex" xmlns:cx2="http://schemas.microsoft.com/office/drawing/2015/10/21/chartex" xmlns:cx3="http://schemas.microsoft.com/office/drawing/2016/5/9/chartex" xmlns:cx4="http://schemas.microsoft.com/office/drawing/2016/5/10/chartex" xmlns:cx5="http://schemas.microsoft.com/office/drawing/2016/5/11/chartex" xmlns:cx6="http://schemas.microsoft.com/office/drawing/2016/5/12/chartex" xmlns:cx7="http://schemas.microsoft.com/office/drawing/2016/5/13/chartex" xmlns:cx8="http://schemas.microsoft.com/office/drawing/2016/5/14/chartex" xmlns:mc="http://schemas.openxmlformats.org/markup-compatibility/2006" xmlns:aink="http://schemas.microsoft.com/office/drawing/2016/ink" xmlns:am3d="http://schemas.microsoft.com/office/drawing/2017/model3d" xmlns:o="urn:schemas-microsoft-com:office:office" xmlns:r="http://schemas.openxmlformats.org/officeDocument/2006/relationships" xmlns:m="http://schemas.openxmlformats.org/officeDocument/2006/math" xmlns:v="urn:schemas-microsoft-com:vml" xmlns:wp14="http://schemas.microsoft.com/office/word/2010/wordprocessingDrawing" xmlns:wp="http://schemas.openxmlformats.org/drawingml/2006/wordprocessingDrawing" xmlns:w10="urn:schemas-microsoft-com:office:word" xmlns:w="http://schemas.openxmlformats.org/wordprocessingml/2006/main" xmlns:w14="http://schemas.microsoft.com/office/word/2010/wordml" xmlns:w15="http://schemas.microsoft.com/office/word/2012/wordml" xmlns:w16cid="http://schemas.microsoft.com/office/word/2016/wordml/cid" xmlns:w16se="http://schemas.microsoft.com/office/word/2015/wordml/symex" xmlns:wpg="http://schemas.microsoft.com/office/word/2010/wordprocessingGroup" xmlns:wpi="http://schemas.microsoft.com/office/word/2010/wordprocessingInk" xmlns:wne="http://schemas.microsoft.com/office/word/2006/wordml" xmlns:wps="http://schemas.microsoft.com/office/word/2010/wordprocessingShape" xmlns:a="http://schemas.openxmlformats.org/drawingml/2006/main" xmlns:pic="http://schemas.openxmlformats.org/drawingml/2006/picture" xmlns:a14="http://schemas.microsoft.com/office/drawing/2010/main" mc:Ignorable="w14 w15 w16se w16cid wp14">
   <w:p>
     <w:pPr>
       <w:pStyle w:val="Header"/>
@@ -5472,7 +6100,7 @@
 </file>
 
 <file path=word/header2.xml><?xml version="1.0" encoding="utf-8"?>
-<w:hdr xmlns:wpc="http://schemas.microsoft.com/office/word/2010/wordprocessingCanvas" xmlns:cx="http://schemas.microsoft.com/office/drawing/2014/chartex" xmlns:cx1="http://schemas.microsoft.com/office/drawing/2015/9/8/chartex" xmlns:cx2="http://schemas.microsoft.com/office/drawing/2015/10/21/chartex" xmlns:cx3="http://schemas.microsoft.com/office/drawing/2016/5/9/chartex" xmlns:cx4="http://schemas.microsoft.com/office/drawing/2016/5/10/chartex" xmlns:cx5="http://schemas.microsoft.com/office/drawing/2016/5/11/chartex" xmlns:cx6="http://schemas.microsoft.com/office/drawing/2016/5/12/chartex" xmlns:cx7="http://schemas.microsoft.com/office/drawing/2016/5/13/chartex" xmlns:cx8="http://schemas.microsoft.com/office/drawing/2016/5/14/chartex" xmlns:mc="http://schemas.openxmlformats.org/markup-compatibility/2006" xmlns:aink="http://schemas.microsoft.com/office/drawing/2016/ink" xmlns:am3d="http://schemas.microsoft.com/office/drawing/2017/model3d" xmlns:o="urn:schemas-microsoft-com:office:office" xmlns:r="http://schemas.openxmlformats.org/officeDocument/2006/relationships" xmlns:m="http://schemas.openxmlformats.org/officeDocument/2006/math" xmlns:v="urn:schemas-microsoft-com:vml" xmlns:wp14="http://schemas.microsoft.com/office/word/2010/wordprocessingDrawing" xmlns:wp="http://schemas.openxmlformats.org/drawingml/2006/wordprocessingDrawing" xmlns:w10="urn:schemas-microsoft-com:office:word" xmlns:w="http://schemas.openxmlformats.org/wordprocessingml/2006/main" xmlns:w14="http://schemas.microsoft.com/office/word/2010/wordml" xmlns:w15="http://schemas.microsoft.com/office/word/2012/wordml" xmlns:w16cid="http://schemas.microsoft.com/office/word/2016/wordml/cid" xmlns:w16se="http://schemas.microsoft.com/office/word/2015/wordml/symex" xmlns:wpg="http://schemas.microsoft.com/office/word/2010/wordprocessingGroup" xmlns:wpi="http://schemas.microsoft.com/office/word/2010/wordprocessingInk" xmlns:wne="http://schemas.microsoft.com/office/word/2006/wordml" xmlns:wps="http://schemas.microsoft.com/office/word/2010/wordprocessingShape" mc:Ignorable="w14 w15 w16se w16cid wp14">
+<w:hdr xmlns:wpc="http://schemas.microsoft.com/office/word/2010/wordprocessingCanvas" xmlns:cx="http://schemas.microsoft.com/office/drawing/2014/chartex" xmlns:cx1="http://schemas.microsoft.com/office/drawing/2015/9/8/chartex" xmlns:cx2="http://schemas.microsoft.com/office/drawing/2015/10/21/chartex" xmlns:cx3="http://schemas.microsoft.com/office/drawing/2016/5/9/chartex" xmlns:cx4="http://schemas.microsoft.com/office/drawing/2016/5/10/chartex" xmlns:cx5="http://schemas.microsoft.com/office/drawing/2016/5/11/chartex" xmlns:cx6="http://schemas.microsoft.com/office/drawing/2016/5/12/chartex" xmlns:cx7="http://schemas.microsoft.com/office/drawing/2016/5/13/chartex" xmlns:cx8="http://schemas.microsoft.com/office/drawing/2016/5/14/chartex" xmlns:mc="http://schemas.openxmlformats.org/markup-compatibility/2006" xmlns:aink="http://schemas.microsoft.com/office/drawing/2016/ink" xmlns:am3d="http://schemas.microsoft.com/office/drawing/2017/model3d" xmlns:o="urn:schemas-microsoft-com:office:office" xmlns:r="http://schemas.openxmlformats.org/officeDocument/2006/relationships" xmlns:m="http://schemas.openxmlformats.org/officeDocument/2006/math" xmlns:v="urn:schemas-microsoft-com:vml" xmlns:wp14="http://schemas.microsoft.com/office/word/2010/wordprocessingDrawing" xmlns:wp="http://schemas.openxmlformats.org/drawingml/2006/wordprocessingDrawing" xmlns:w10="urn:schemas-microsoft-com:office:word" xmlns:w="http://schemas.openxmlformats.org/wordprocessingml/2006/main" xmlns:w14="http://schemas.microsoft.com/office/word/2010/wordml" xmlns:w15="http://schemas.microsoft.com/office/word/2012/wordml" xmlns:w16cid="http://schemas.microsoft.com/office/word/2016/wordml/cid" xmlns:w16se="http://schemas.microsoft.com/office/word/2015/wordml/symex" xmlns:wpg="http://schemas.microsoft.com/office/word/2010/wordprocessingGroup" xmlns:wpi="http://schemas.microsoft.com/office/word/2010/wordprocessingInk" xmlns:wne="http://schemas.microsoft.com/office/word/2006/wordml" xmlns:wps="http://schemas.microsoft.com/office/word/2010/wordprocessingShape" xmlns:a="http://schemas.openxmlformats.org/drawingml/2006/main" xmlns:pic="http://schemas.openxmlformats.org/drawingml/2006/picture" xmlns:a14="http://schemas.microsoft.com/office/drawing/2010/main" mc:Ignorable="w14 w15 w16se w16cid wp14">
   <w:p>
     <w:pPr>
       <w:pStyle w:val="Header"/>
@@ -5560,7 +6188,7 @@
 </file>
 
 <file path=word/header3.xml><?xml version="1.0" encoding="utf-8"?>
-<w:hdr xmlns:wpc="http://schemas.microsoft.com/office/word/2010/wordprocessingCanvas" xmlns:cx="http://schemas.microsoft.com/office/drawing/2014/chartex" xmlns:cx1="http://schemas.microsoft.com/office/drawing/2015/9/8/chartex" xmlns:cx2="http://schemas.microsoft.com/office/drawing/2015/10/21/chartex" xmlns:cx3="http://schemas.microsoft.com/office/drawing/2016/5/9/chartex" xmlns:cx4="http://schemas.microsoft.com/office/drawing/2016/5/10/chartex" xmlns:cx5="http://schemas.microsoft.com/office/drawing/2016/5/11/chartex" xmlns:cx6="http://schemas.microsoft.com/office/drawing/2016/5/12/chartex" xmlns:cx7="http://schemas.microsoft.com/office/drawing/2016/5/13/chartex" xmlns:cx8="http://schemas.microsoft.com/office/drawing/2016/5/14/chartex" xmlns:mc="http://schemas.openxmlformats.org/markup-compatibility/2006" xmlns:aink="http://schemas.microsoft.com/office/drawing/2016/ink" xmlns:am3d="http://schemas.microsoft.com/office/drawing/2017/model3d" xmlns:o="urn:schemas-microsoft-com:office:office" xmlns:r="http://schemas.openxmlformats.org/officeDocument/2006/relationships" xmlns:m="http://schemas.openxmlformats.org/officeDocument/2006/math" xmlns:v="urn:schemas-microsoft-com:vml" xmlns:wp14="http://schemas.microsoft.com/office/word/2010/wordprocessingDrawing" xmlns:wp="http://schemas.openxmlformats.org/drawingml/2006/wordprocessingDrawing" xmlns:w10="urn:schemas-microsoft-com:office:word" xmlns:w="http://schemas.openxmlformats.org/wordprocessingml/2006/main" xmlns:w14="http://schemas.microsoft.com/office/word/2010/wordml" xmlns:w15="http://schemas.microsoft.com/office/word/2012/wordml" xmlns:w16cid="http://schemas.microsoft.com/office/word/2016/wordml/cid" xmlns:w16se="http://schemas.microsoft.com/office/word/2015/wordml/symex" xmlns:wpg="http://schemas.microsoft.com/office/word/2010/wordprocessingGroup" xmlns:wpi="http://schemas.microsoft.com/office/word/2010/wordprocessingInk" xmlns:wne="http://schemas.microsoft.com/office/word/2006/wordml" xmlns:wps="http://schemas.microsoft.com/office/word/2010/wordprocessingShape" mc:Ignorable="w14 w15 w16se w16cid wp14">
+<w:hdr xmlns:wpc="http://schemas.microsoft.com/office/word/2010/wordprocessingCanvas" xmlns:cx="http://schemas.microsoft.com/office/drawing/2014/chartex" xmlns:cx1="http://schemas.microsoft.com/office/drawing/2015/9/8/chartex" xmlns:cx2="http://schemas.microsoft.com/office/drawing/2015/10/21/chartex" xmlns:cx3="http://schemas.microsoft.com/office/drawing/2016/5/9/chartex" xmlns:cx4="http://schemas.microsoft.com/office/drawing/2016/5/10/chartex" xmlns:cx5="http://schemas.microsoft.com/office/drawing/2016/5/11/chartex" xmlns:cx6="http://schemas.microsoft.com/office/drawing/2016/5/12/chartex" xmlns:cx7="http://schemas.microsoft.com/office/drawing/2016/5/13/chartex" xmlns:cx8="http://schemas.microsoft.com/office/drawing/2016/5/14/chartex" xmlns:mc="http://schemas.openxmlformats.org/markup-compatibility/2006" xmlns:aink="http://schemas.microsoft.com/office/drawing/2016/ink" xmlns:am3d="http://schemas.microsoft.com/office/drawing/2017/model3d" xmlns:o="urn:schemas-microsoft-com:office:office" xmlns:r="http://schemas.openxmlformats.org/officeDocument/2006/relationships" xmlns:m="http://schemas.openxmlformats.org/officeDocument/2006/math" xmlns:v="urn:schemas-microsoft-com:vml" xmlns:wp14="http://schemas.microsoft.com/office/word/2010/wordprocessingDrawing" xmlns:wp="http://schemas.openxmlformats.org/drawingml/2006/wordprocessingDrawing" xmlns:w10="urn:schemas-microsoft-com:office:word" xmlns:w="http://schemas.openxmlformats.org/wordprocessingml/2006/main" xmlns:w14="http://schemas.microsoft.com/office/word/2010/wordml" xmlns:w15="http://schemas.microsoft.com/office/word/2012/wordml" xmlns:w16cid="http://schemas.microsoft.com/office/word/2016/wordml/cid" xmlns:w16se="http://schemas.microsoft.com/office/word/2015/wordml/symex" xmlns:wpg="http://schemas.microsoft.com/office/word/2010/wordprocessingGroup" xmlns:wpi="http://schemas.microsoft.com/office/word/2010/wordprocessingInk" xmlns:wne="http://schemas.microsoft.com/office/word/2006/wordml" xmlns:wps="http://schemas.microsoft.com/office/word/2010/wordprocessingShape" xmlns:a="http://schemas.openxmlformats.org/drawingml/2006/main" xmlns:pic="http://schemas.openxmlformats.org/drawingml/2006/picture" xmlns:a14="http://schemas.microsoft.com/office/drawing/2010/main" mc:Ignorable="w14 w15 w16se w16cid wp14">
   <w:p>
     <w:pPr>
       <w:pStyle w:val="Header"/>
@@ -6480,7 +7108,7 @@
   <w:docDefaults>
     <w:rPrDefault>
       <w:rPr>
-        <w:rFonts w:asciiTheme="minorHAnsi" w:eastAsiaTheme="minorHAnsi" w:hAnsiTheme="minorHAnsi" w:cstheme="minorBidi"/>
+        <w:rFonts w:asciiTheme="minorHAnsi" w:hAnsiTheme="minorHAnsi" w:eastAsiaTheme="minorHAnsi" w:cstheme="minorBidi"/>
         <w:sz w:val="22"/>
         <w:szCs w:val="22"/>
         <w:lang w:val="en-US" w:eastAsia="en-US" w:bidi="ar-SA"/>
@@ -6495,14 +7123,14 @@
   <w:latentStyles w:defLockedState="0" w:defUIPriority="99" w:defSemiHidden="0" w:defUnhideWhenUsed="0" w:defQFormat="0" w:count="375">
     <w:lsdException w:name="Normal" w:uiPriority="0" w:qFormat="1"/>
     <w:lsdException w:name="heading 1" w:uiPriority="9" w:qFormat="1"/>
-    <w:lsdException w:name="heading 2" w:semiHidden="1" w:uiPriority="9" w:unhideWhenUsed="1" w:qFormat="1"/>
-    <w:lsdException w:name="heading 3" w:semiHidden="1" w:uiPriority="9" w:unhideWhenUsed="1" w:qFormat="1"/>
-    <w:lsdException w:name="heading 4" w:semiHidden="1" w:uiPriority="9" w:unhideWhenUsed="1" w:qFormat="1"/>
-    <w:lsdException w:name="heading 5" w:semiHidden="1" w:uiPriority="9" w:unhideWhenUsed="1" w:qFormat="1"/>
-    <w:lsdException w:name="heading 6" w:semiHidden="1" w:uiPriority="9" w:unhideWhenUsed="1" w:qFormat="1"/>
-    <w:lsdException w:name="heading 7" w:semiHidden="1" w:uiPriority="9" w:unhideWhenUsed="1" w:qFormat="1"/>
-    <w:lsdException w:name="heading 8" w:semiHidden="1" w:uiPriority="9" w:unhideWhenUsed="1" w:qFormat="1"/>
-    <w:lsdException w:name="heading 9" w:semiHidden="1" w:uiPriority="9" w:unhideWhenUsed="1" w:qFormat="1"/>
+    <w:lsdException w:name="heading 2" w:uiPriority="9" w:semiHidden="1" w:unhideWhenUsed="1" w:qFormat="1"/>
+    <w:lsdException w:name="heading 3" w:uiPriority="9" w:semiHidden="1" w:unhideWhenUsed="1" w:qFormat="1"/>
+    <w:lsdException w:name="heading 4" w:uiPriority="9" w:semiHidden="1" w:unhideWhenUsed="1" w:qFormat="1"/>
+    <w:lsdException w:name="heading 5" w:uiPriority="9" w:semiHidden="1" w:unhideWhenUsed="1" w:qFormat="1"/>
+    <w:lsdException w:name="heading 6" w:uiPriority="9" w:semiHidden="1" w:unhideWhenUsed="1" w:qFormat="1"/>
+    <w:lsdException w:name="heading 7" w:uiPriority="9" w:semiHidden="1" w:unhideWhenUsed="1" w:qFormat="1"/>
+    <w:lsdException w:name="heading 8" w:uiPriority="9" w:semiHidden="1" w:unhideWhenUsed="1" w:qFormat="1"/>
+    <w:lsdException w:name="heading 9" w:uiPriority="9" w:semiHidden="1" w:unhideWhenUsed="1" w:qFormat="1"/>
     <w:lsdException w:name="index 1" w:semiHidden="1" w:unhideWhenUsed="1"/>
     <w:lsdException w:name="index 2" w:semiHidden="1" w:unhideWhenUsed="1"/>
     <w:lsdException w:name="index 3" w:semiHidden="1" w:unhideWhenUsed="1"/>
@@ -6512,22 +7140,22 @@
     <w:lsdException w:name="index 7" w:semiHidden="1" w:unhideWhenUsed="1"/>
     <w:lsdException w:name="index 8" w:semiHidden="1" w:unhideWhenUsed="1"/>
     <w:lsdException w:name="index 9" w:semiHidden="1" w:unhideWhenUsed="1"/>
-    <w:lsdException w:name="toc 1" w:semiHidden="1" w:uiPriority="39" w:unhideWhenUsed="1"/>
-    <w:lsdException w:name="toc 2" w:semiHidden="1" w:uiPriority="39" w:unhideWhenUsed="1"/>
-    <w:lsdException w:name="toc 3" w:semiHidden="1" w:uiPriority="39" w:unhideWhenUsed="1"/>
-    <w:lsdException w:name="toc 4" w:semiHidden="1" w:uiPriority="39" w:unhideWhenUsed="1"/>
-    <w:lsdException w:name="toc 5" w:semiHidden="1" w:uiPriority="39" w:unhideWhenUsed="1"/>
-    <w:lsdException w:name="toc 6" w:semiHidden="1" w:uiPriority="39" w:unhideWhenUsed="1"/>
-    <w:lsdException w:name="toc 7" w:semiHidden="1" w:uiPriority="39" w:unhideWhenUsed="1"/>
-    <w:lsdException w:name="toc 8" w:semiHidden="1" w:uiPriority="39" w:unhideWhenUsed="1"/>
-    <w:lsdException w:name="toc 9" w:semiHidden="1" w:uiPriority="39" w:unhideWhenUsed="1"/>
+    <w:lsdException w:name="toc 1" w:uiPriority="39" w:semiHidden="1" w:unhideWhenUsed="1"/>
+    <w:lsdException w:name="toc 2" w:uiPriority="39" w:semiHidden="1" w:unhideWhenUsed="1"/>
+    <w:lsdException w:name="toc 3" w:uiPriority="39" w:semiHidden="1" w:unhideWhenUsed="1"/>
+    <w:lsdException w:name="toc 4" w:uiPriority="39" w:semiHidden="1" w:unhideWhenUsed="1"/>
+    <w:lsdException w:name="toc 5" w:uiPriority="39" w:semiHidden="1" w:unhideWhenUsed="1"/>
+    <w:lsdException w:name="toc 6" w:uiPriority="39" w:semiHidden="1" w:unhideWhenUsed="1"/>
+    <w:lsdException w:name="toc 7" w:uiPriority="39" w:semiHidden="1" w:unhideWhenUsed="1"/>
+    <w:lsdException w:name="toc 8" w:uiPriority="39" w:semiHidden="1" w:unhideWhenUsed="1"/>
+    <w:lsdException w:name="toc 9" w:uiPriority="39" w:semiHidden="1" w:unhideWhenUsed="1"/>
     <w:lsdException w:name="Normal Indent" w:semiHidden="1" w:unhideWhenUsed="1"/>
     <w:lsdException w:name="footnote text" w:semiHidden="1" w:unhideWhenUsed="1"/>
     <w:lsdException w:name="annotation text" w:semiHidden="1" w:unhideWhenUsed="1"/>
-    <w:lsdException w:name="header" w:semiHidden="1" w:uiPriority="0" w:unhideWhenUsed="1"/>
+    <w:lsdException w:name="header" w:uiPriority="0" w:semiHidden="1" w:unhideWhenUsed="1"/>
     <w:lsdException w:name="footer" w:semiHidden="1" w:unhideWhenUsed="1"/>
     <w:lsdException w:name="index heading" w:semiHidden="1" w:unhideWhenUsed="1"/>
-    <w:lsdException w:name="caption" w:semiHidden="1" w:uiPriority="35" w:unhideWhenUsed="1" w:qFormat="1"/>
+    <w:lsdException w:name="caption" w:uiPriority="35" w:semiHidden="1" w:unhideWhenUsed="1" w:qFormat="1"/>
     <w:lsdException w:name="table of figures" w:semiHidden="1" w:unhideWhenUsed="1"/>
     <w:lsdException w:name="envelope address" w:semiHidden="1" w:unhideWhenUsed="1"/>
     <w:lsdException w:name="envelope return" w:semiHidden="1" w:unhideWhenUsed="1"/>
@@ -6558,7 +7186,7 @@
     <w:lsdException w:name="Title" w:uiPriority="10" w:qFormat="1"/>
     <w:lsdException w:name="Closing" w:semiHidden="1" w:unhideWhenUsed="1"/>
     <w:lsdException w:name="Signature" w:semiHidden="1" w:unhideWhenUsed="1"/>
-    <w:lsdException w:name="Default Paragraph Font" w:semiHidden="1" w:uiPriority="1" w:unhideWhenUsed="1"/>
+    <w:lsdException w:name="Default Paragraph Font" w:uiPriority="1" w:semiHidden="1" w:unhideWhenUsed="1"/>
     <w:lsdException w:name="Body Text" w:semiHidden="1" w:unhideWhenUsed="1"/>
     <w:lsdException w:name="Body Text Indent" w:semiHidden="1" w:unhideWhenUsed="1"/>
     <w:lsdException w:name="List Continue" w:semiHidden="1" w:unhideWhenUsed="1"/>
@@ -6758,8 +7386,8 @@
     <w:lsdException w:name="Subtle Reference" w:uiPriority="31" w:qFormat="1"/>
     <w:lsdException w:name="Intense Reference" w:uiPriority="32" w:qFormat="1"/>
     <w:lsdException w:name="Book Title" w:uiPriority="33" w:qFormat="1"/>
-    <w:lsdException w:name="Bibliography" w:semiHidden="1" w:uiPriority="37" w:unhideWhenUsed="1"/>
-    <w:lsdException w:name="TOC Heading" w:semiHidden="1" w:uiPriority="39" w:unhideWhenUsed="1" w:qFormat="1"/>
+    <w:lsdException w:name="Bibliography" w:uiPriority="37" w:semiHidden="1" w:unhideWhenUsed="1"/>
+    <w:lsdException w:name="TOC Heading" w:uiPriority="39" w:semiHidden="1" w:unhideWhenUsed="1" w:qFormat="1"/>
     <w:lsdException w:name="Plain Table 1" w:uiPriority="41"/>
     <w:lsdException w:name="Plain Table 2" w:uiPriority="42"/>
     <w:lsdException w:name="Plain Table 3" w:uiPriority="43"/>
@@ -6869,7 +7497,7 @@
     <w:lsdException w:name="Hashtag" w:semiHidden="1" w:unhideWhenUsed="1"/>
     <w:lsdException w:name="Unresolved Mention" w:semiHidden="1" w:unhideWhenUsed="1"/>
   </w:latentStyles>
-  <w:style w:type="paragraph" w:default="1" w:styleId="Normal">
+  <w:style w:type="paragraph" w:styleId="Normal" w:default="1">
     <w:name w:val="Normal"/>
     <w:qFormat/>
     <w:rsid w:val="00EC4EFE"/>
@@ -6892,7 +7520,7 @@
       <w:outlineLvl w:val="0"/>
     </w:pPr>
     <w:rPr>
-      <w:rFonts w:asciiTheme="majorHAnsi" w:eastAsiaTheme="majorEastAsia" w:hAnsiTheme="majorHAnsi" w:cstheme="majorBidi"/>
+      <w:rFonts w:asciiTheme="majorHAnsi" w:hAnsiTheme="majorHAnsi" w:eastAsiaTheme="majorEastAsia" w:cstheme="majorBidi"/>
       <w:b/>
       <w:bCs/>
       <w:color w:val="365F91" w:themeColor="accent1" w:themeShade="BF"/>
@@ -6921,7 +7549,7 @@
       <w:outlineLvl w:val="1"/>
     </w:pPr>
     <w:rPr>
-      <w:rFonts w:asciiTheme="majorHAnsi" w:eastAsiaTheme="majorEastAsia" w:hAnsiTheme="majorHAnsi" w:cstheme="majorBidi"/>
+      <w:rFonts w:asciiTheme="majorHAnsi" w:hAnsiTheme="majorHAnsi" w:eastAsiaTheme="majorEastAsia" w:cstheme="majorBidi"/>
       <w:b/>
       <w:bCs/>
       <w:color w:val="4F81BD" w:themeColor="accent1"/>
@@ -6950,7 +7578,7 @@
       <w:outlineLvl w:val="2"/>
     </w:pPr>
     <w:rPr>
-      <w:rFonts w:asciiTheme="majorHAnsi" w:eastAsiaTheme="majorEastAsia" w:hAnsiTheme="majorHAnsi" w:cstheme="majorBidi"/>
+      <w:rFonts w:asciiTheme="majorHAnsi" w:hAnsiTheme="majorHAnsi" w:eastAsiaTheme="majorEastAsia" w:cstheme="majorBidi"/>
       <w:b/>
       <w:bCs/>
       <w:color w:val="4F81BD" w:themeColor="accent1"/>
@@ -6977,7 +7605,7 @@
       <w:outlineLvl w:val="3"/>
     </w:pPr>
     <w:rPr>
-      <w:rFonts w:asciiTheme="majorHAnsi" w:eastAsiaTheme="majorEastAsia" w:hAnsiTheme="majorHAnsi" w:cstheme="majorBidi"/>
+      <w:rFonts w:asciiTheme="majorHAnsi" w:hAnsiTheme="majorHAnsi" w:eastAsiaTheme="majorEastAsia" w:cstheme="majorBidi"/>
       <w:b/>
       <w:bCs/>
       <w:i/>
@@ -7006,7 +7634,7 @@
       <w:outlineLvl w:val="4"/>
     </w:pPr>
     <w:rPr>
-      <w:rFonts w:asciiTheme="majorHAnsi" w:eastAsiaTheme="majorEastAsia" w:hAnsiTheme="majorHAnsi" w:cstheme="majorBidi"/>
+      <w:rFonts w:asciiTheme="majorHAnsi" w:hAnsiTheme="majorHAnsi" w:eastAsiaTheme="majorEastAsia" w:cstheme="majorBidi"/>
       <w:color w:val="243F60" w:themeColor="accent1" w:themeShade="7F"/>
     </w:rPr>
   </w:style>
@@ -7031,7 +7659,7 @@
       <w:outlineLvl w:val="5"/>
     </w:pPr>
     <w:rPr>
-      <w:rFonts w:asciiTheme="majorHAnsi" w:eastAsiaTheme="majorEastAsia" w:hAnsiTheme="majorHAnsi" w:cstheme="majorBidi"/>
+      <w:rFonts w:asciiTheme="majorHAnsi" w:hAnsiTheme="majorHAnsi" w:eastAsiaTheme="majorEastAsia" w:cstheme="majorBidi"/>
       <w:i/>
       <w:iCs/>
       <w:color w:val="243F60" w:themeColor="accent1" w:themeShade="7F"/>
@@ -7058,7 +7686,7 @@
       <w:outlineLvl w:val="6"/>
     </w:pPr>
     <w:rPr>
-      <w:rFonts w:asciiTheme="majorHAnsi" w:eastAsiaTheme="majorEastAsia" w:hAnsiTheme="majorHAnsi" w:cstheme="majorBidi"/>
+      <w:rFonts w:asciiTheme="majorHAnsi" w:hAnsiTheme="majorHAnsi" w:eastAsiaTheme="majorEastAsia" w:cstheme="majorBidi"/>
       <w:i/>
       <w:iCs/>
       <w:color w:val="404040" w:themeColor="text1" w:themeTint="BF"/>
@@ -7085,7 +7713,7 @@
       <w:outlineLvl w:val="7"/>
     </w:pPr>
     <w:rPr>
-      <w:rFonts w:asciiTheme="majorHAnsi" w:eastAsiaTheme="majorEastAsia" w:hAnsiTheme="majorHAnsi" w:cstheme="majorBidi"/>
+      <w:rFonts w:asciiTheme="majorHAnsi" w:hAnsiTheme="majorHAnsi" w:eastAsiaTheme="majorEastAsia" w:cstheme="majorBidi"/>
       <w:color w:val="404040" w:themeColor="text1" w:themeTint="BF"/>
       <w:sz w:val="20"/>
       <w:szCs w:val="20"/>
@@ -7112,7 +7740,7 @@
       <w:outlineLvl w:val="8"/>
     </w:pPr>
     <w:rPr>
-      <w:rFonts w:asciiTheme="majorHAnsi" w:eastAsiaTheme="majorEastAsia" w:hAnsiTheme="majorHAnsi" w:cstheme="majorBidi"/>
+      <w:rFonts w:asciiTheme="majorHAnsi" w:hAnsiTheme="majorHAnsi" w:eastAsiaTheme="majorEastAsia" w:cstheme="majorBidi"/>
       <w:i/>
       <w:iCs/>
       <w:color w:val="404040" w:themeColor="text1" w:themeTint="BF"/>
@@ -7120,13 +7748,13 @@
       <w:szCs w:val="20"/>
     </w:rPr>
   </w:style>
-  <w:style w:type="character" w:default="1" w:styleId="DefaultParagraphFont">
+  <w:style w:type="character" w:styleId="DefaultParagraphFont" w:default="1">
     <w:name w:val="Default Paragraph Font"/>
     <w:uiPriority w:val="1"/>
     <w:semiHidden/>
     <w:unhideWhenUsed/>
   </w:style>
-  <w:style w:type="table" w:default="1" w:styleId="TableNormal">
+  <w:style w:type="table" w:styleId="TableNormal" w:default="1">
     <w:name w:val="Normal Table"/>
     <w:uiPriority w:val="99"/>
     <w:semiHidden/>
@@ -7141,20 +7769,20 @@
       </w:tblCellMar>
     </w:tblPr>
   </w:style>
-  <w:style w:type="numbering" w:default="1" w:styleId="NoList">
+  <w:style w:type="numbering" w:styleId="NoList" w:default="1">
     <w:name w:val="No List"/>
     <w:uiPriority w:val="99"/>
     <w:semiHidden/>
     <w:unhideWhenUsed/>
   </w:style>
-  <w:style w:type="character" w:customStyle="1" w:styleId="Heading1Char">
+  <w:style w:type="character" w:styleId="Heading1Char" w:customStyle="1">
     <w:name w:val="Heading 1 Char"/>
     <w:basedOn w:val="DefaultParagraphFont"/>
     <w:link w:val="Heading1"/>
     <w:uiPriority w:val="9"/>
     <w:rsid w:val="00EC4EFE"/>
     <w:rPr>
-      <w:rFonts w:asciiTheme="majorHAnsi" w:eastAsiaTheme="majorEastAsia" w:hAnsiTheme="majorHAnsi" w:cstheme="majorBidi"/>
+      <w:rFonts w:asciiTheme="majorHAnsi" w:hAnsiTheme="majorHAnsi" w:eastAsiaTheme="majorEastAsia" w:cstheme="majorBidi"/>
       <w:b/>
       <w:bCs/>
       <w:color w:val="365F91" w:themeColor="accent1" w:themeShade="BF"/>
@@ -7162,7 +7790,7 @@
       <w:szCs w:val="28"/>
     </w:rPr>
   </w:style>
-  <w:style w:type="character" w:customStyle="1" w:styleId="Heading2Char">
+  <w:style w:type="character" w:styleId="Heading2Char" w:customStyle="1">
     <w:name w:val="Heading 2 Char"/>
     <w:basedOn w:val="DefaultParagraphFont"/>
     <w:link w:val="Heading2"/>
@@ -7170,7 +7798,7 @@
     <w:semiHidden/>
     <w:rsid w:val="00EC4EFE"/>
     <w:rPr>
-      <w:rFonts w:asciiTheme="majorHAnsi" w:eastAsiaTheme="majorEastAsia" w:hAnsiTheme="majorHAnsi" w:cstheme="majorBidi"/>
+      <w:rFonts w:asciiTheme="majorHAnsi" w:hAnsiTheme="majorHAnsi" w:eastAsiaTheme="majorEastAsia" w:cstheme="majorBidi"/>
       <w:b/>
       <w:bCs/>
       <w:color w:val="4F81BD" w:themeColor="accent1"/>
@@ -7178,7 +7806,7 @@
       <w:szCs w:val="26"/>
     </w:rPr>
   </w:style>
-  <w:style w:type="character" w:customStyle="1" w:styleId="Heading3Char">
+  <w:style w:type="character" w:styleId="Heading3Char" w:customStyle="1">
     <w:name w:val="Heading 3 Char"/>
     <w:basedOn w:val="DefaultParagraphFont"/>
     <w:link w:val="Heading3"/>
@@ -7186,13 +7814,13 @@
     <w:semiHidden/>
     <w:rsid w:val="00EC4EFE"/>
     <w:rPr>
-      <w:rFonts w:asciiTheme="majorHAnsi" w:eastAsiaTheme="majorEastAsia" w:hAnsiTheme="majorHAnsi" w:cstheme="majorBidi"/>
+      <w:rFonts w:asciiTheme="majorHAnsi" w:hAnsiTheme="majorHAnsi" w:eastAsiaTheme="majorEastAsia" w:cstheme="majorBidi"/>
       <w:b/>
       <w:bCs/>
       <w:color w:val="4F81BD" w:themeColor="accent1"/>
     </w:rPr>
   </w:style>
-  <w:style w:type="character" w:customStyle="1" w:styleId="Heading4Char">
+  <w:style w:type="character" w:styleId="Heading4Char" w:customStyle="1">
     <w:name w:val="Heading 4 Char"/>
     <w:basedOn w:val="DefaultParagraphFont"/>
     <w:link w:val="Heading4"/>
@@ -7200,7 +7828,7 @@
     <w:semiHidden/>
     <w:rsid w:val="00EC4EFE"/>
     <w:rPr>
-      <w:rFonts w:asciiTheme="majorHAnsi" w:eastAsiaTheme="majorEastAsia" w:hAnsiTheme="majorHAnsi" w:cstheme="majorBidi"/>
+      <w:rFonts w:asciiTheme="majorHAnsi" w:hAnsiTheme="majorHAnsi" w:eastAsiaTheme="majorEastAsia" w:cstheme="majorBidi"/>
       <w:b/>
       <w:bCs/>
       <w:i/>
@@ -7208,7 +7836,7 @@
       <w:color w:val="4F81BD" w:themeColor="accent1"/>
     </w:rPr>
   </w:style>
-  <w:style w:type="character" w:customStyle="1" w:styleId="Heading5Char">
+  <w:style w:type="character" w:styleId="Heading5Char" w:customStyle="1">
     <w:name w:val="Heading 5 Char"/>
     <w:basedOn w:val="DefaultParagraphFont"/>
     <w:link w:val="Heading5"/>
@@ -7216,11 +7844,11 @@
     <w:semiHidden/>
     <w:rsid w:val="00EC4EFE"/>
     <w:rPr>
-      <w:rFonts w:asciiTheme="majorHAnsi" w:eastAsiaTheme="majorEastAsia" w:hAnsiTheme="majorHAnsi" w:cstheme="majorBidi"/>
+      <w:rFonts w:asciiTheme="majorHAnsi" w:hAnsiTheme="majorHAnsi" w:eastAsiaTheme="majorEastAsia" w:cstheme="majorBidi"/>
       <w:color w:val="243F60" w:themeColor="accent1" w:themeShade="7F"/>
     </w:rPr>
   </w:style>
-  <w:style w:type="character" w:customStyle="1" w:styleId="Heading6Char">
+  <w:style w:type="character" w:styleId="Heading6Char" w:customStyle="1">
     <w:name w:val="Heading 6 Char"/>
     <w:basedOn w:val="DefaultParagraphFont"/>
     <w:link w:val="Heading6"/>
@@ -7228,13 +7856,13 @@
     <w:semiHidden/>
     <w:rsid w:val="00EC4EFE"/>
     <w:rPr>
-      <w:rFonts w:asciiTheme="majorHAnsi" w:eastAsiaTheme="majorEastAsia" w:hAnsiTheme="majorHAnsi" w:cstheme="majorBidi"/>
+      <w:rFonts w:asciiTheme="majorHAnsi" w:hAnsiTheme="majorHAnsi" w:eastAsiaTheme="majorEastAsia" w:cstheme="majorBidi"/>
       <w:i/>
       <w:iCs/>
       <w:color w:val="243F60" w:themeColor="accent1" w:themeShade="7F"/>
     </w:rPr>
   </w:style>
-  <w:style w:type="character" w:customStyle="1" w:styleId="Heading7Char">
+  <w:style w:type="character" w:styleId="Heading7Char" w:customStyle="1">
     <w:name w:val="Heading 7 Char"/>
     <w:basedOn w:val="DefaultParagraphFont"/>
     <w:link w:val="Heading7"/>
@@ -7242,13 +7870,13 @@
     <w:semiHidden/>
     <w:rsid w:val="00EC4EFE"/>
     <w:rPr>
-      <w:rFonts w:asciiTheme="majorHAnsi" w:eastAsiaTheme="majorEastAsia" w:hAnsiTheme="majorHAnsi" w:cstheme="majorBidi"/>
+      <w:rFonts w:asciiTheme="majorHAnsi" w:hAnsiTheme="majorHAnsi" w:eastAsiaTheme="majorEastAsia" w:cstheme="majorBidi"/>
       <w:i/>
       <w:iCs/>
       <w:color w:val="404040" w:themeColor="text1" w:themeTint="BF"/>
     </w:rPr>
   </w:style>
-  <w:style w:type="character" w:customStyle="1" w:styleId="Heading8Char">
+  <w:style w:type="character" w:styleId="Heading8Char" w:customStyle="1">
     <w:name w:val="Heading 8 Char"/>
     <w:basedOn w:val="DefaultParagraphFont"/>
     <w:link w:val="Heading8"/>
@@ -7256,13 +7884,13 @@
     <w:semiHidden/>
     <w:rsid w:val="00EC4EFE"/>
     <w:rPr>
-      <w:rFonts w:asciiTheme="majorHAnsi" w:eastAsiaTheme="majorEastAsia" w:hAnsiTheme="majorHAnsi" w:cstheme="majorBidi"/>
+      <w:rFonts w:asciiTheme="majorHAnsi" w:hAnsiTheme="majorHAnsi" w:eastAsiaTheme="majorEastAsia" w:cstheme="majorBidi"/>
       <w:color w:val="404040" w:themeColor="text1" w:themeTint="BF"/>
       <w:sz w:val="20"/>
       <w:szCs w:val="20"/>
     </w:rPr>
   </w:style>
-  <w:style w:type="character" w:customStyle="1" w:styleId="Heading9Char">
+  <w:style w:type="character" w:styleId="Heading9Char" w:customStyle="1">
     <w:name w:val="Heading 9 Char"/>
     <w:basedOn w:val="DefaultParagraphFont"/>
     <w:link w:val="Heading9"/>
@@ -7270,7 +7898,7 @@
     <w:semiHidden/>
     <w:rsid w:val="00EC4EFE"/>
     <w:rPr>
-      <w:rFonts w:asciiTheme="majorHAnsi" w:eastAsiaTheme="majorEastAsia" w:hAnsiTheme="majorHAnsi" w:cstheme="majorBidi"/>
+      <w:rFonts w:asciiTheme="majorHAnsi" w:hAnsiTheme="majorHAnsi" w:eastAsiaTheme="majorEastAsia" w:cstheme="majorBidi"/>
       <w:i/>
       <w:iCs/>
       <w:color w:val="404040" w:themeColor="text1" w:themeTint="BF"/>
@@ -7287,12 +7915,12 @@
     </w:pPr>
     <w:tblPr>
       <w:tblBorders>
-        <w:top w:val="single" w:sz="4" w:space="0" w:color="auto"/>
-        <w:left w:val="single" w:sz="4" w:space="0" w:color="auto"/>
-        <w:bottom w:val="single" w:sz="4" w:space="0" w:color="auto"/>
-        <w:right w:val="single" w:sz="4" w:space="0" w:color="auto"/>
-        <w:insideH w:val="single" w:sz="4" w:space="0" w:color="auto"/>
-        <w:insideV w:val="single" w:sz="4" w:space="0" w:color="auto"/>
+        <w:top w:val="single" w:color="auto" w:sz="4" w:space="0"/>
+        <w:left w:val="single" w:color="auto" w:sz="4" w:space="0"/>
+        <w:bottom w:val="single" w:color="auto" w:sz="4" w:space="0"/>
+        <w:right w:val="single" w:color="auto" w:sz="4" w:space="0"/>
+        <w:insideH w:val="single" w:color="auto" w:sz="4" w:space="0"/>
+        <w:insideV w:val="single" w:color="auto" w:sz="4" w:space="0"/>
       </w:tblBorders>
     </w:tblPr>
   </w:style>
@@ -7321,7 +7949,7 @@
       <w:spacing w:after="0" w:line="240" w:lineRule="auto"/>
     </w:pPr>
   </w:style>
-  <w:style w:type="character" w:customStyle="1" w:styleId="HeaderChar">
+  <w:style w:type="character" w:styleId="HeaderChar" w:customStyle="1">
     <w:name w:val="Header Char"/>
     <w:basedOn w:val="DefaultParagraphFont"/>
     <w:link w:val="Header"/>
@@ -7342,7 +7970,7 @@
       <w:spacing w:after="0" w:line="240" w:lineRule="auto"/>
     </w:pPr>
   </w:style>
-  <w:style w:type="character" w:customStyle="1" w:styleId="FooterChar">
+  <w:style w:type="character" w:styleId="FooterChar" w:customStyle="1">
     <w:name w:val="Footer Char"/>
     <w:basedOn w:val="DefaultParagraphFont"/>
     <w:link w:val="Footer"/>
@@ -7366,7 +7994,7 @@
       <w:szCs w:val="16"/>
     </w:rPr>
   </w:style>
-  <w:style w:type="character" w:customStyle="1" w:styleId="BalloonTextChar">
+  <w:style w:type="character" w:styleId="BalloonTextChar" w:customStyle="1">
     <w:name w:val="Balloon Text Char"/>
     <w:basedOn w:val="DefaultParagraphFont"/>
     <w:link w:val="BalloonText"/>

</xml_diff>